<commit_message>
Committing first draft of resumes and linked in edits
</commit_message>
<xml_diff>
--- a/%PATH_EE267%/Documents/Resumes_final/linkedin_edits.docx
+++ b/%PATH_EE267%/Documents/Resumes_final/linkedin_edits.docx
@@ -120,17 +120,11 @@
       </w:r>
       <w:proofErr w:type="gramStart"/>
       <w:r>
-        <w:t xml:space="preserve">, </w:t>
-      </w:r>
-      <w:r>
-        <w:t>high frequency</w:t>
+        <w:t>, high frequency</w:t>
       </w:r>
       <w:proofErr w:type="gramEnd"/>
       <w:r>
-        <w:t xml:space="preserve"> trading</w:t>
-      </w:r>
-      <w:r>
-        <w:t xml:space="preserve">. </w:t>
+        <w:t xml:space="preserve"> trading. </w:t>
       </w:r>
     </w:p>
     <w:p>
@@ -550,14 +544,7 @@
           <w:rStyle w:val="Strong"/>
           <w:rFonts w:eastAsiaTheme="majorEastAsia"/>
         </w:rPr>
-        <w:t>hardware-targeted AI/ML systems</w:t>
-      </w:r>
-      <w:r>
-        <w:rPr>
-          <w:rStyle w:val="Strong"/>
-          <w:rFonts w:eastAsiaTheme="majorEastAsia"/>
-        </w:rPr>
-        <w:t xml:space="preserve">, </w:t>
+        <w:t xml:space="preserve">hardware-targeted AI/ML systems, </w:t>
       </w:r>
       <w:r>
         <w:rPr>
@@ -1989,6 +1976,7 @@
   <w:style w:type="character" w:default="1" w:styleId="DefaultParagraphFont">
     <w:name w:val="Default Paragraph Font"/>
     <w:uiPriority w:val="1"/>
+    <w:semiHidden/>
     <w:unhideWhenUsed/>
   </w:style>
   <w:style w:type="table" w:default="1" w:styleId="TableNormal">

</xml_diff>

<commit_message>
Committing picture for lenet
</commit_message>
<xml_diff>
--- a/%PATH_EE267%/Documents/Resumes_final/linkedin_edits.docx
+++ b/%PATH_EE267%/Documents/Resumes_final/linkedin_edits.docx
@@ -24,348 +24,331 @@
       </w:pPr>
       <w:r>
         <w:rPr>
-          <w:noProof/>
-        </w:rPr>
-        <w:drawing>
-          <wp:anchor distT="0" distB="0" distL="114300" distR="114300" simplePos="0" relativeHeight="251661312" behindDoc="0" locked="0" layoutInCell="1" allowOverlap="1" wp14:anchorId="64DFD01D" wp14:editId="608FCAC8">
-            <wp:simplePos x="0" y="0"/>
-            <wp:positionH relativeFrom="column">
-              <wp:posOffset>654685</wp:posOffset>
-            </wp:positionH>
-            <wp:positionV relativeFrom="paragraph">
-              <wp:posOffset>313690</wp:posOffset>
-            </wp:positionV>
-            <wp:extent cx="1476375" cy="1226185"/>
-            <wp:effectExtent l="0" t="0" r="9525" b="0"/>
-            <wp:wrapSquare wrapText="bothSides"/>
-            <wp:docPr id="2027762979" name="Picture 4"/>
-            <wp:cNvGraphicFramePr>
-              <a:graphicFrameLocks xmlns:a="http://schemas.openxmlformats.org/drawingml/2006/main" noChangeAspect="1"/>
-            </wp:cNvGraphicFramePr>
-            <a:graphic xmlns:a="http://schemas.openxmlformats.org/drawingml/2006/main">
-              <a:graphicData uri="http://schemas.openxmlformats.org/drawingml/2006/picture">
-                <pic:pic xmlns:pic="http://schemas.openxmlformats.org/drawingml/2006/picture">
-                  <pic:nvPicPr>
-                    <pic:cNvPr id="2027762979" name="Picture 2027762979"/>
-                    <pic:cNvPicPr/>
-                  </pic:nvPicPr>
-                  <pic:blipFill rotWithShape="1">
-                    <a:blip r:embed="rId5" cstate="print">
-                      <a:extLst>
-                        <a:ext uri="{28A0092B-C50C-407E-A947-70E740481C1C}">
-                          <a14:useLocalDpi xmlns:a14="http://schemas.microsoft.com/office/drawing/2010/main" val="0"/>
-                        </a:ext>
-                      </a:extLst>
-                    </a:blip>
-                    <a:srcRect t="3230"/>
-                    <a:stretch>
-                      <a:fillRect/>
-                    </a:stretch>
-                  </pic:blipFill>
-                  <pic:spPr bwMode="auto">
-                    <a:xfrm>
-                      <a:off x="0" y="0"/>
-                      <a:ext cx="1476375" cy="1226185"/>
-                    </a:xfrm>
-                    <a:prstGeom prst="rect">
-                      <a:avLst/>
-                    </a:prstGeom>
-                    <a:ln>
-                      <a:noFill/>
-                    </a:ln>
-                    <a:extLst>
-                      <a:ext uri="{53640926-AAD7-44D8-BBD7-CCE9431645EC}">
-                        <a14:shadowObscured xmlns:a14="http://schemas.microsoft.com/office/drawing/2010/main"/>
-                      </a:ext>
-                    </a:extLst>
-                  </pic:spPr>
-                </pic:pic>
-              </a:graphicData>
-            </a:graphic>
-            <wp14:sizeRelH relativeFrom="margin">
-              <wp14:pctWidth>0</wp14:pctWidth>
-            </wp14:sizeRelH>
-            <wp14:sizeRelV relativeFrom="margin">
-              <wp14:pctHeight>0</wp14:pctHeight>
-            </wp14:sizeRelV>
-          </wp:anchor>
-        </w:drawing>
-      </w:r>
-      <w:r>
-        <w:rPr>
           <w:b/>
           <w:bCs/>
-        </w:rPr>
-        <w:t>Me? Drone / MNIST / Highway Lane Detection</w:t>
-      </w:r>
-    </w:p>
-    <w:p>
-      <w:r>
-        <w:rPr>
           <w:noProof/>
         </w:rPr>
-        <w:drawing>
-          <wp:anchor distT="0" distB="0" distL="114300" distR="114300" simplePos="0" relativeHeight="251662336" behindDoc="0" locked="0" layoutInCell="1" allowOverlap="1" wp14:anchorId="2C047BE5" wp14:editId="3BF0FEA8">
-            <wp:simplePos x="0" y="0"/>
-            <wp:positionH relativeFrom="column">
-              <wp:posOffset>-374015</wp:posOffset>
-            </wp:positionH>
-            <wp:positionV relativeFrom="paragraph">
-              <wp:posOffset>196215</wp:posOffset>
-            </wp:positionV>
-            <wp:extent cx="1189990" cy="866775"/>
-            <wp:effectExtent l="9207" t="0" r="318" b="317"/>
-            <wp:wrapSquare wrapText="bothSides"/>
-            <wp:docPr id="1022094629" name="Picture 5"/>
-            <wp:cNvGraphicFramePr>
-              <a:graphicFrameLocks xmlns:a="http://schemas.openxmlformats.org/drawingml/2006/main" noChangeAspect="1"/>
-            </wp:cNvGraphicFramePr>
-            <a:graphic xmlns:a="http://schemas.openxmlformats.org/drawingml/2006/main">
-              <a:graphicData uri="http://schemas.openxmlformats.org/drawingml/2006/picture">
-                <pic:pic xmlns:pic="http://schemas.openxmlformats.org/drawingml/2006/picture">
-                  <pic:nvPicPr>
-                    <pic:cNvPr id="1022094629" name="Picture 1022094629"/>
-                    <pic:cNvPicPr/>
-                  </pic:nvPicPr>
-                  <pic:blipFill rotWithShape="1">
-                    <a:blip r:embed="rId6" cstate="print">
-                      <a:extLst>
-                        <a:ext uri="{28A0092B-C50C-407E-A947-70E740481C1C}">
-                          <a14:useLocalDpi xmlns:a14="http://schemas.microsoft.com/office/drawing/2010/main" val="0"/>
-                        </a:ext>
-                      </a:extLst>
-                    </a:blip>
-                    <a:srcRect l="9133" t="8595" r="7112" b="9619"/>
-                    <a:stretch>
-                      <a:fillRect/>
-                    </a:stretch>
-                  </pic:blipFill>
-                  <pic:spPr bwMode="auto">
-                    <a:xfrm rot="16200000">
-                      <a:off x="0" y="0"/>
-                      <a:ext cx="1189990" cy="866775"/>
-                    </a:xfrm>
-                    <a:prstGeom prst="rect">
-                      <a:avLst/>
-                    </a:prstGeom>
-                    <a:ln>
-                      <a:noFill/>
-                    </a:ln>
-                    <a:extLst>
-                      <a:ext uri="{53640926-AAD7-44D8-BBD7-CCE9431645EC}">
-                        <a14:shadowObscured xmlns:a14="http://schemas.microsoft.com/office/drawing/2010/main"/>
-                      </a:ext>
-                    </a:extLst>
-                  </pic:spPr>
-                </pic:pic>
-              </a:graphicData>
-            </a:graphic>
-            <wp14:sizeRelH relativeFrom="margin">
-              <wp14:pctWidth>0</wp14:pctWidth>
-            </wp14:sizeRelH>
-            <wp14:sizeRelV relativeFrom="margin">
-              <wp14:pctHeight>0</wp14:pctHeight>
-            </wp14:sizeRelV>
-          </wp:anchor>
-        </w:drawing>
-      </w:r>
-      <w:r>
-        <w:rPr>
-          <w:noProof/>
-        </w:rPr>
-        <w:drawing>
-          <wp:anchor distT="0" distB="0" distL="114300" distR="114300" simplePos="0" relativeHeight="251658240" behindDoc="0" locked="0" layoutInCell="1" allowOverlap="1" wp14:anchorId="369F2967" wp14:editId="144183F2">
-            <wp:simplePos x="0" y="0"/>
-            <wp:positionH relativeFrom="margin">
-              <wp:align>center</wp:align>
-            </wp:positionH>
-            <wp:positionV relativeFrom="paragraph">
-              <wp:posOffset>7620</wp:posOffset>
-            </wp:positionV>
-            <wp:extent cx="1600200" cy="1212850"/>
-            <wp:effectExtent l="0" t="0" r="0" b="6350"/>
-            <wp:wrapSquare wrapText="bothSides"/>
-            <wp:docPr id="185011018" name="Picture 1"/>
-            <wp:cNvGraphicFramePr>
-              <a:graphicFrameLocks xmlns:a="http://schemas.openxmlformats.org/drawingml/2006/main" noChangeAspect="1"/>
-            </wp:cNvGraphicFramePr>
-            <a:graphic xmlns:a="http://schemas.openxmlformats.org/drawingml/2006/main">
-              <a:graphicData uri="http://schemas.openxmlformats.org/drawingml/2006/picture">
-                <pic:pic xmlns:pic="http://schemas.openxmlformats.org/drawingml/2006/picture">
-                  <pic:nvPicPr>
-                    <pic:cNvPr id="185011018" name="Picture 185011018"/>
-                    <pic:cNvPicPr/>
-                  </pic:nvPicPr>
-                  <pic:blipFill>
-                    <a:blip r:embed="rId7" cstate="print">
-                      <a:extLst>
-                        <a:ext uri="{28A0092B-C50C-407E-A947-70E740481C1C}">
-                          <a14:useLocalDpi xmlns:a14="http://schemas.microsoft.com/office/drawing/2010/main" val="0"/>
-                        </a:ext>
-                      </a:extLst>
-                    </a:blip>
-                    <a:stretch>
-                      <a:fillRect/>
-                    </a:stretch>
-                  </pic:blipFill>
-                  <pic:spPr>
-                    <a:xfrm>
-                      <a:off x="0" y="0"/>
-                      <a:ext cx="1600200" cy="1212850"/>
-                    </a:xfrm>
-                    <a:prstGeom prst="rect">
-                      <a:avLst/>
-                    </a:prstGeom>
-                  </pic:spPr>
-                </pic:pic>
-              </a:graphicData>
-            </a:graphic>
-            <wp14:sizeRelH relativeFrom="margin">
-              <wp14:pctWidth>0</wp14:pctWidth>
-            </wp14:sizeRelH>
-            <wp14:sizeRelV relativeFrom="margin">
-              <wp14:pctHeight>0</wp14:pctHeight>
-            </wp14:sizeRelV>
-          </wp:anchor>
-        </w:drawing>
-      </w:r>
-      <w:r>
-        <w:rPr>
-          <w:noProof/>
-        </w:rPr>
         <mc:AlternateContent>
-          <mc:Choice Requires="wps">
+          <mc:Choice Requires="wpg">
             <w:drawing>
-              <wp:anchor distT="0" distB="0" distL="114300" distR="114300" simplePos="0" relativeHeight="251659264" behindDoc="0" locked="0" layoutInCell="1" allowOverlap="1" wp14:anchorId="382D8953" wp14:editId="6BA4868A">
+              <wp:anchor distT="0" distB="0" distL="114300" distR="114300" simplePos="0" relativeHeight="251665408" behindDoc="0" locked="0" layoutInCell="1" allowOverlap="1" wp14:anchorId="51F29465" wp14:editId="64C9649E">
                 <wp:simplePos x="0" y="0"/>
                 <wp:positionH relativeFrom="column">
-                  <wp:posOffset>3800475</wp:posOffset>
+                  <wp:posOffset>-212407</wp:posOffset>
                 </wp:positionH>
                 <wp:positionV relativeFrom="paragraph">
-                  <wp:posOffset>10795</wp:posOffset>
+                  <wp:posOffset>299085</wp:posOffset>
                 </wp:positionV>
-                <wp:extent cx="1276350" cy="1212850"/>
-                <wp:effectExtent l="0" t="0" r="19050" b="25400"/>
-                <wp:wrapNone/>
-                <wp:docPr id="56180465" name="Rectangle 2"/>
+                <wp:extent cx="6841807" cy="1543050"/>
+                <wp:effectExtent l="0" t="0" r="0" b="0"/>
+                <wp:wrapSquare wrapText="bothSides"/>
+                <wp:docPr id="1879146933" name="Group 2"/>
                 <wp:cNvGraphicFramePr/>
                 <a:graphic xmlns:a="http://schemas.openxmlformats.org/drawingml/2006/main">
-                  <a:graphicData uri="http://schemas.microsoft.com/office/word/2010/wordprocessingShape">
-                    <wps:wsp>
-                      <wps:cNvSpPr/>
-                      <wps:spPr>
+                  <a:graphicData uri="http://schemas.microsoft.com/office/word/2010/wordprocessingGroup">
+                    <wpg:wgp>
+                      <wpg:cNvGrpSpPr/>
+                      <wpg:grpSpPr>
                         <a:xfrm>
                           <a:off x="0" y="0"/>
-                          <a:ext cx="1276350" cy="1212850"/>
+                          <a:ext cx="6841807" cy="1543050"/>
+                          <a:chOff x="0" y="0"/>
+                          <a:chExt cx="6841807" cy="1543050"/>
                         </a:xfrm>
-                        <a:prstGeom prst="rect">
-                          <a:avLst/>
-                        </a:prstGeom>
-                      </wps:spPr>
-                      <wps:style>
-                        <a:lnRef idx="2">
-                          <a:schemeClr val="accent1">
-                            <a:shade val="15000"/>
-                          </a:schemeClr>
-                        </a:lnRef>
-                        <a:fillRef idx="1">
-                          <a:schemeClr val="accent1"/>
-                        </a:fillRef>
-                        <a:effectRef idx="0">
-                          <a:schemeClr val="accent1"/>
-                        </a:effectRef>
-                        <a:fontRef idx="minor">
-                          <a:schemeClr val="lt1"/>
-                        </a:fontRef>
-                      </wps:style>
-                      <wps:bodyPr rot="0" spcFirstLastPara="0" vertOverflow="overflow" horzOverflow="overflow" vert="horz" wrap="square" lIns="91440" tIns="45720" rIns="91440" bIns="45720" numCol="1" spcCol="0" rtlCol="0" fromWordArt="0" anchor="ctr" anchorCtr="0" forceAA="0" compatLnSpc="1">
-                        <a:prstTxWarp prst="textNoShape">
-                          <a:avLst/>
-                        </a:prstTxWarp>
-                        <a:noAutofit/>
-                      </wps:bodyPr>
-                    </wps:wsp>
+                      </wpg:grpSpPr>
+                      <pic:pic xmlns:pic="http://schemas.openxmlformats.org/drawingml/2006/picture">
+                        <pic:nvPicPr>
+                          <pic:cNvPr id="1238619425" name="Picture 1"/>
+                          <pic:cNvPicPr>
+                            <a:picLocks noChangeAspect="1"/>
+                          </pic:cNvPicPr>
+                        </pic:nvPicPr>
+                        <pic:blipFill>
+                          <a:blip r:embed="rId5" cstate="print">
+                            <a:extLst>
+                              <a:ext uri="{28A0092B-C50C-407E-A947-70E740481C1C}">
+                                <a14:useLocalDpi xmlns:a14="http://schemas.microsoft.com/office/drawing/2010/main" val="0"/>
+                              </a:ext>
+                            </a:extLst>
+                          </a:blip>
+                          <a:stretch>
+                            <a:fillRect/>
+                          </a:stretch>
+                        </pic:blipFill>
+                        <pic:spPr>
+                          <a:xfrm>
+                            <a:off x="2384107" y="28575"/>
+                            <a:ext cx="1645920" cy="1333500"/>
+                          </a:xfrm>
+                          <a:prstGeom prst="rect">
+                            <a:avLst/>
+                          </a:prstGeom>
+                        </pic:spPr>
+                      </pic:pic>
+                      <pic:pic xmlns:pic="http://schemas.openxmlformats.org/drawingml/2006/picture">
+                        <pic:nvPicPr>
+                          <pic:cNvPr id="1407071149" name="Picture 3"/>
+                          <pic:cNvPicPr>
+                            <a:picLocks noChangeAspect="1"/>
+                          </pic:cNvPicPr>
+                        </pic:nvPicPr>
+                        <pic:blipFill>
+                          <a:blip r:embed="rId6">
+                            <a:extLst>
+                              <a:ext uri="{28A0092B-C50C-407E-A947-70E740481C1C}">
+                                <a14:useLocalDpi xmlns:a14="http://schemas.microsoft.com/office/drawing/2010/main" val="0"/>
+                              </a:ext>
+                            </a:extLst>
+                          </a:blip>
+                          <a:stretch>
+                            <a:fillRect/>
+                          </a:stretch>
+                        </pic:blipFill>
+                        <pic:spPr>
+                          <a:xfrm>
+                            <a:off x="5279707" y="57150"/>
+                            <a:ext cx="1562100" cy="1333500"/>
+                          </a:xfrm>
+                          <a:prstGeom prst="rect">
+                            <a:avLst/>
+                          </a:prstGeom>
+                        </pic:spPr>
+                      </pic:pic>
+                      <pic:pic xmlns:pic="http://schemas.openxmlformats.org/drawingml/2006/picture">
+                        <pic:nvPicPr>
+                          <pic:cNvPr id="453465134" name="Picture 4"/>
+                          <pic:cNvPicPr>
+                            <a:picLocks noChangeAspect="1"/>
+                          </pic:cNvPicPr>
+                        </pic:nvPicPr>
+                        <pic:blipFill rotWithShape="1">
+                          <a:blip r:embed="rId7" cstate="print">
+                            <a:extLst>
+                              <a:ext uri="{28A0092B-C50C-407E-A947-70E740481C1C}">
+                                <a14:useLocalDpi xmlns:a14="http://schemas.microsoft.com/office/drawing/2010/main" val="0"/>
+                              </a:ext>
+                            </a:extLst>
+                          </a:blip>
+                          <a:srcRect t="3230"/>
+                          <a:stretch>
+                            <a:fillRect/>
+                          </a:stretch>
+                        </pic:blipFill>
+                        <pic:spPr bwMode="auto">
+                          <a:xfrm>
+                            <a:off x="869632" y="19050"/>
+                            <a:ext cx="1476375" cy="1304925"/>
+                          </a:xfrm>
+                          <a:prstGeom prst="rect">
+                            <a:avLst/>
+                          </a:prstGeom>
+                          <a:ln>
+                            <a:noFill/>
+                          </a:ln>
+                          <a:extLst>
+                            <a:ext uri="{53640926-AAD7-44D8-BBD7-CCE9431645EC}">
+                              <a14:shadowObscured xmlns:a14="http://schemas.microsoft.com/office/drawing/2010/main"/>
+                            </a:ext>
+                          </a:extLst>
+                        </pic:spPr>
+                      </pic:pic>
+                      <pic:pic xmlns:pic="http://schemas.openxmlformats.org/drawingml/2006/picture">
+                        <pic:nvPicPr>
+                          <pic:cNvPr id="428990743" name="Picture 5"/>
+                          <pic:cNvPicPr>
+                            <a:picLocks noChangeAspect="1"/>
+                          </pic:cNvPicPr>
+                        </pic:nvPicPr>
+                        <pic:blipFill rotWithShape="1">
+                          <a:blip r:embed="rId8" cstate="print">
+                            <a:extLst>
+                              <a:ext uri="{28A0092B-C50C-407E-A947-70E740481C1C}">
+                                <a14:useLocalDpi xmlns:a14="http://schemas.microsoft.com/office/drawing/2010/main" val="0"/>
+                              </a:ext>
+                            </a:extLst>
+                          </a:blip>
+                          <a:srcRect l="9133" t="8595" r="7112" b="9619"/>
+                          <a:stretch>
+                            <a:fillRect/>
+                          </a:stretch>
+                        </pic:blipFill>
+                        <pic:spPr bwMode="auto">
+                          <a:xfrm rot="16200000">
+                            <a:off x="-213995" y="259397"/>
+                            <a:ext cx="1294765" cy="866775"/>
+                          </a:xfrm>
+                          <a:prstGeom prst="rect">
+                            <a:avLst/>
+                          </a:prstGeom>
+                          <a:ln>
+                            <a:noFill/>
+                          </a:ln>
+                          <a:extLst>
+                            <a:ext uri="{53640926-AAD7-44D8-BBD7-CCE9431645EC}">
+                              <a14:shadowObscured xmlns:a14="http://schemas.microsoft.com/office/drawing/2010/main"/>
+                            </a:ext>
+                          </a:extLst>
+                        </pic:spPr>
+                      </pic:pic>
+                      <pic:pic xmlns:pic="http://schemas.openxmlformats.org/drawingml/2006/picture">
+                        <pic:nvPicPr>
+                          <pic:cNvPr id="1288967233" name="Picture 1"/>
+                          <pic:cNvPicPr>
+                            <a:picLocks noChangeAspect="1"/>
+                          </pic:cNvPicPr>
+                        </pic:nvPicPr>
+                        <pic:blipFill rotWithShape="1">
+                          <a:blip r:embed="rId9">
+                            <a:extLst>
+                              <a:ext uri="{28A0092B-C50C-407E-A947-70E740481C1C}">
+                                <a14:useLocalDpi xmlns:a14="http://schemas.microsoft.com/office/drawing/2010/main" val="0"/>
+                              </a:ext>
+                            </a:extLst>
+                          </a:blip>
+                          <a:srcRect l="5655" r="9048" b="6453"/>
+                          <a:stretch>
+                            <a:fillRect/>
+                          </a:stretch>
+                        </pic:blipFill>
+                        <pic:spPr bwMode="auto">
+                          <a:xfrm>
+                            <a:off x="4031932" y="0"/>
+                            <a:ext cx="1219200" cy="1359535"/>
+                          </a:xfrm>
+                          <a:prstGeom prst="rect">
+                            <a:avLst/>
+                          </a:prstGeom>
+                          <a:ln>
+                            <a:noFill/>
+                          </a:ln>
+                          <a:extLst>
+                            <a:ext uri="{53640926-AAD7-44D8-BBD7-CCE9431645EC}">
+                              <a14:shadowObscured xmlns:a14="http://schemas.microsoft.com/office/drawing/2010/main"/>
+                            </a:ext>
+                          </a:extLst>
+                        </pic:spPr>
+                      </pic:pic>
+                      <pic:pic xmlns:pic="http://schemas.openxmlformats.org/drawingml/2006/picture">
+                        <pic:nvPicPr>
+                          <pic:cNvPr id="171733703" name="Picture 1"/>
+                          <pic:cNvPicPr>
+                            <a:picLocks noChangeAspect="1"/>
+                          </pic:cNvPicPr>
+                        </pic:nvPicPr>
+                        <pic:blipFill>
+                          <a:blip r:embed="rId10">
+                            <a:extLst>
+                              <a:ext uri="{28A0092B-C50C-407E-A947-70E740481C1C}">
+                                <a14:useLocalDpi xmlns:a14="http://schemas.microsoft.com/office/drawing/2010/main" val="0"/>
+                              </a:ext>
+                            </a:extLst>
+                          </a:blip>
+                          <a:stretch>
+                            <a:fillRect/>
+                          </a:stretch>
+                        </pic:blipFill>
+                        <pic:spPr>
+                          <a:xfrm>
+                            <a:off x="4031932" y="1247775"/>
+                            <a:ext cx="1200150" cy="246380"/>
+                          </a:xfrm>
+                          <a:prstGeom prst="rect">
+                            <a:avLst/>
+                          </a:prstGeom>
+                        </pic:spPr>
+                      </pic:pic>
+                      <pic:pic xmlns:pic="http://schemas.openxmlformats.org/drawingml/2006/picture">
+                        <pic:nvPicPr>
+                          <pic:cNvPr id="1911638261" name="Picture 1"/>
+                          <pic:cNvPicPr>
+                            <a:picLocks noChangeAspect="1"/>
+                          </pic:cNvPicPr>
+                        </pic:nvPicPr>
+                        <pic:blipFill>
+                          <a:blip r:embed="rId11">
+                            <a:extLst>
+                              <a:ext uri="{28A0092B-C50C-407E-A947-70E740481C1C}">
+                                <a14:useLocalDpi xmlns:a14="http://schemas.microsoft.com/office/drawing/2010/main" val="0"/>
+                              </a:ext>
+                            </a:extLst>
+                          </a:blip>
+                          <a:stretch>
+                            <a:fillRect/>
+                          </a:stretch>
+                        </pic:blipFill>
+                        <pic:spPr>
+                          <a:xfrm>
+                            <a:off x="5174932" y="1333500"/>
+                            <a:ext cx="538480" cy="209550"/>
+                          </a:xfrm>
+                          <a:prstGeom prst="rect">
+                            <a:avLst/>
+                          </a:prstGeom>
+                        </pic:spPr>
+                      </pic:pic>
+                    </wpg:wgp>
                   </a:graphicData>
                 </a:graphic>
-                <wp14:sizeRelH relativeFrom="margin">
-                  <wp14:pctWidth>0</wp14:pctWidth>
-                </wp14:sizeRelH>
-                <wp14:sizeRelV relativeFrom="margin">
-                  <wp14:pctHeight>0</wp14:pctHeight>
-                </wp14:sizeRelV>
               </wp:anchor>
             </w:drawing>
           </mc:Choice>
           <mc:Fallback>
             <w:pict>
-              <v:rect w14:anchorId="01FB7A60" id="Rectangle 2" o:spid="_x0000_s1026" style="position:absolute;margin-left:299.25pt;margin-top:.85pt;width:100.5pt;height:95.5pt;z-index:251659264;visibility:visible;mso-wrap-style:square;mso-width-percent:0;mso-height-percent:0;mso-wrap-distance-left:9pt;mso-wrap-distance-top:0;mso-wrap-distance-right:9pt;mso-wrap-distance-bottom:0;mso-position-horizontal:absolute;mso-position-horizontal-relative:text;mso-position-vertical:absolute;mso-position-vertical-relative:text;mso-width-percent:0;mso-height-percent:0;mso-width-relative:margin;mso-height-relative:margin;v-text-anchor:middle" o:gfxdata="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" fillcolor="#156082 [3204]" strokecolor="#030e13 [484]" strokeweight="1.5pt"/>
+              <v:group w14:anchorId="3388B351" id="Group 2" o:spid="_x0000_s1026" style="position:absolute;margin-left:-16.7pt;margin-top:23.55pt;width:538.7pt;height:121.5pt;z-index:251665408" coordsize="68418,15430" o:gfxdata="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">
+                <v:shapetype id="_x0000_t75" coordsize="21600,21600" o:spt="75" o:preferrelative="t" path="m@4@5l@4@11@9@11@9@5xe" filled="f" stroked="f">
+                  <v:stroke joinstyle="miter"/>
+                  <v:formulas>
+                    <v:f eqn="if lineDrawn pixelLineWidth 0"/>
+                    <v:f eqn="sum @0 1 0"/>
+                    <v:f eqn="sum 0 0 @1"/>
+                    <v:f eqn="prod @2 1 2"/>
+                    <v:f eqn="prod @3 21600 pixelWidth"/>
+                    <v:f eqn="prod @3 21600 pixelHeight"/>
+                    <v:f eqn="sum @0 0 1"/>
+                    <v:f eqn="prod @6 1 2"/>
+                    <v:f eqn="prod @7 21600 pixelWidth"/>
+                    <v:f eqn="sum @8 21600 0"/>
+                    <v:f eqn="prod @7 21600 pixelHeight"/>
+                    <v:f eqn="sum @10 21600 0"/>
+                  </v:formulas>
+                  <v:path o:extrusionok="f" gradientshapeok="t" o:connecttype="rect"/>
+                  <o:lock v:ext="edit" aspectratio="t"/>
+                </v:shapetype>
+                <v:shape id="Picture 1" o:spid="_x0000_s1027" type="#_x0000_t75" style="position:absolute;left:23841;top:285;width:16459;height:13335;visibility:visible;mso-wrap-style:square" o:gfxdata="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">
+                  <v:imagedata r:id="rId12" o:title=""/>
+                </v:shape>
+                <v:shape id="Picture 3" o:spid="_x0000_s1028" type="#_x0000_t75" style="position:absolute;left:52797;top:571;width:15621;height:13335;visibility:visible;mso-wrap-style:square" o:gfxdata="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">
+                  <v:imagedata r:id="rId13" o:title=""/>
+                </v:shape>
+                <v:shape id="Picture 4" o:spid="_x0000_s1029" type="#_x0000_t75" style="position:absolute;left:8696;top:190;width:14764;height:13049;visibility:visible;mso-wrap-style:square" o:gfxdata="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">
+                  <v:imagedata r:id="rId14" o:title="" croptop="2117f"/>
+                </v:shape>
+                <v:shape id="Picture 5" o:spid="_x0000_s1030" type="#_x0000_t75" style="position:absolute;left:-2140;top:2594;width:12947;height:8667;rotation:-90;visibility:visible;mso-wrap-style:square" o:gfxdata="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">
+                  <v:imagedata r:id="rId15" o:title="" croptop="5633f" cropbottom="6304f" cropleft="5985f" cropright="4661f"/>
+                </v:shape>
+                <v:shape id="Picture 1" o:spid="_x0000_s1031" type="#_x0000_t75" style="position:absolute;left:40319;width:12192;height:13595;visibility:visible;mso-wrap-style:square" o:gfxdata="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">
+                  <v:imagedata r:id="rId16" o:title="" cropbottom="4229f" cropleft="3706f" cropright="5930f"/>
+                </v:shape>
+                <v:shape id="Picture 1" o:spid="_x0000_s1032" type="#_x0000_t75" style="position:absolute;left:40319;top:12477;width:12001;height:2464;visibility:visible;mso-wrap-style:square" o:gfxdata="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">
+                  <v:imagedata r:id="rId17" o:title=""/>
+                </v:shape>
+                <v:shape id="Picture 1" o:spid="_x0000_s1033" type="#_x0000_t75" style="position:absolute;left:51749;top:13335;width:5385;height:2095;visibility:visible;mso-wrap-style:square" o:gfxdata="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">
+                  <v:imagedata r:id="rId18" o:title=""/>
+                </v:shape>
+                <w10:wrap type="square"/>
+              </v:group>
             </w:pict>
           </mc:Fallback>
         </mc:AlternateContent>
       </w:r>
       <w:r>
         <w:rPr>
-          <w:noProof/>
-        </w:rPr>
-        <w:drawing>
-          <wp:anchor distT="0" distB="0" distL="114300" distR="114300" simplePos="0" relativeHeight="251660288" behindDoc="0" locked="0" layoutInCell="1" allowOverlap="1" wp14:anchorId="451C6086" wp14:editId="4C3ACDA3">
-            <wp:simplePos x="0" y="0"/>
-            <wp:positionH relativeFrom="column">
-              <wp:posOffset>5095875</wp:posOffset>
-            </wp:positionH>
-            <wp:positionV relativeFrom="paragraph">
-              <wp:posOffset>10795</wp:posOffset>
-            </wp:positionV>
-            <wp:extent cx="1471295" cy="1228725"/>
-            <wp:effectExtent l="0" t="0" r="0" b="9525"/>
-            <wp:wrapSquare wrapText="bothSides"/>
-            <wp:docPr id="1044859664" name="Picture 3"/>
-            <wp:cNvGraphicFramePr>
-              <a:graphicFrameLocks xmlns:a="http://schemas.openxmlformats.org/drawingml/2006/main" noChangeAspect="1"/>
-            </wp:cNvGraphicFramePr>
-            <a:graphic xmlns:a="http://schemas.openxmlformats.org/drawingml/2006/main">
-              <a:graphicData uri="http://schemas.openxmlformats.org/drawingml/2006/picture">
-                <pic:pic xmlns:pic="http://schemas.openxmlformats.org/drawingml/2006/picture">
-                  <pic:nvPicPr>
-                    <pic:cNvPr id="1044859664" name="Picture 1044859664"/>
-                    <pic:cNvPicPr/>
-                  </pic:nvPicPr>
-                  <pic:blipFill>
-                    <a:blip r:embed="rId8">
-                      <a:extLst>
-                        <a:ext uri="{28A0092B-C50C-407E-A947-70E740481C1C}">
-                          <a14:useLocalDpi xmlns:a14="http://schemas.microsoft.com/office/drawing/2010/main" val="0"/>
-                        </a:ext>
-                      </a:extLst>
-                    </a:blip>
-                    <a:stretch>
-                      <a:fillRect/>
-                    </a:stretch>
-                  </pic:blipFill>
-                  <pic:spPr>
-                    <a:xfrm>
-                      <a:off x="0" y="0"/>
-                      <a:ext cx="1471295" cy="1228725"/>
-                    </a:xfrm>
-                    <a:prstGeom prst="rect">
-                      <a:avLst/>
-                    </a:prstGeom>
-                  </pic:spPr>
-                </pic:pic>
-              </a:graphicData>
-            </a:graphic>
-            <wp14:sizeRelH relativeFrom="margin">
-              <wp14:pctWidth>0</wp14:pctWidth>
-            </wp14:sizeRelH>
-            <wp14:sizeRelV relativeFrom="margin">
-              <wp14:pctHeight>0</wp14:pctHeight>
-            </wp14:sizeRelV>
-          </wp:anchor>
-        </w:drawing>
-      </w:r>
-    </w:p>
-    <w:p/>
-    <w:p/>
+          <w:b/>
+          <w:bCs/>
+        </w:rPr>
+        <w:t>Me? Drone / MNIST / Highway Lane Detection</w:t>
+      </w:r>
+    </w:p>
     <w:p/>
     <w:p/>
     <w:p>
@@ -695,6 +678,7 @@
           <w:i/>
           <w:iCs/>
         </w:rPr>
+        <w:lastRenderedPageBreak/>
         <w:t>Embedded Systems and Hardware Design</w:t>
       </w:r>
     </w:p>
@@ -1115,6 +1099,7 @@
         <w:pStyle w:val="NormalWeb"/>
       </w:pPr>
       <w:r>
+        <w:lastRenderedPageBreak/>
         <w:t>Developed mission-critical, bare-metal RTL for safety-sensitive satellite and long-range defense systems,</w:t>
       </w:r>
       <w:r>
@@ -1144,7 +1129,6 @@
         <w:pStyle w:val="NormalWeb"/>
       </w:pPr>
       <w:r>
-        <w:lastRenderedPageBreak/>
         <w:t xml:space="preserve">Architected FPGA-based algorithm implementations that interface with System-on-Chip (SoC) platforms </w:t>
       </w:r>
       <w:r>
@@ -1741,6 +1725,7 @@
         <w:pStyle w:val="NormalWeb"/>
       </w:pPr>
       <w:r>
+        <w:lastRenderedPageBreak/>
         <w:t xml:space="preserve">I recently completed a </w:t>
       </w:r>
       <w:r>
@@ -1769,7 +1754,6 @@
         <w:pStyle w:val="NormalWeb"/>
       </w:pPr>
       <w:r>
-        <w:lastRenderedPageBreak/>
         <w:t>In my current role at Lockheed Martin, I work across the FPGA development lifecycle—RTL design, algorithm integration, simulation, and verification—supporting high-speed interfaces, FPGA–SoC communication, and fault-tolerant architectures for safety-critical applications.</w:t>
       </w:r>
     </w:p>
@@ -3711,6 +3695,7 @@
   <w:style w:type="character" w:default="1" w:styleId="DefaultParagraphFont">
     <w:name w:val="Default Paragraph Font"/>
     <w:uiPriority w:val="1"/>
+    <w:semiHidden/>
     <w:unhideWhenUsed/>
   </w:style>
   <w:style w:type="table" w:default="1" w:styleId="TableNormal">

</xml_diff>

<commit_message>
Committing finished linkedIn edits
</commit_message>
<xml_diff>
--- a/%PATH_EE267%/Documents/Resumes_final/linkedin_edits.docx
+++ b/%PATH_EE267%/Documents/Resumes_final/linkedin_edits.docx
@@ -6,13 +6,23 @@
       <w:pPr>
         <w:jc w:val="center"/>
       </w:pPr>
-      <w:r>
-        <w:t>Linkedin Edits</w:t>
-      </w:r>
-    </w:p>
-    <w:p>
-      <w:r>
-        <w:t>CoverPhoto Edits:</w:t>
+      <w:proofErr w:type="spellStart"/>
+      <w:r>
+        <w:t>Linkedin</w:t>
+      </w:r>
+      <w:proofErr w:type="spellEnd"/>
+      <w:r>
+        <w:t xml:space="preserve"> Edits</w:t>
+      </w:r>
+    </w:p>
+    <w:p>
+      <w:proofErr w:type="spellStart"/>
+      <w:r>
+        <w:t>CoverPhoto</w:t>
+      </w:r>
+      <w:proofErr w:type="spellEnd"/>
+      <w:r>
+        <w:t xml:space="preserve"> Edits:</w:t>
       </w:r>
     </w:p>
     <w:p>
@@ -350,7 +360,6 @@
       </w:r>
     </w:p>
     <w:p/>
-    <w:p/>
     <w:p>
       <w:r>
         <w:t>Elevator Pitch</w:t>
@@ -358,7 +367,35 @@
     </w:p>
     <w:p>
       <w:r>
-        <w:t xml:space="preserve">My name is Baron W. Eiley who is an Electrical Engineer who designs digital systems targeted for Autonomous Car Hardware, </w:t>
+        <w:t xml:space="preserve">My name is Baron W. </w:t>
+      </w:r>
+      <w:proofErr w:type="gramStart"/>
+      <w:r>
+        <w:t>Eiley</w:t>
+      </w:r>
+      <w:proofErr w:type="gramEnd"/>
+      <w:r>
+        <w:t xml:space="preserve"> </w:t>
+      </w:r>
+      <w:r>
+        <w:t xml:space="preserve">and I am </w:t>
+      </w:r>
+      <w:proofErr w:type="gramStart"/>
+      <w:r>
+        <w:t>a</w:t>
+      </w:r>
+      <w:proofErr w:type="gramEnd"/>
+      <w:r>
+        <w:t xml:space="preserve"> </w:t>
+      </w:r>
+      <w:r>
+        <w:t>Electrical Engineer who designs digital systems targeted for Autonomous Car Hardware</w:t>
+      </w:r>
+      <w:r>
+        <w:t xml:space="preserve"> and </w:t>
+      </w:r>
+      <w:r>
+        <w:t xml:space="preserve"> </w:t>
       </w:r>
       <w:r>
         <w:t>a</w:t>
@@ -484,8 +521,13 @@
         <w:spacing w:after="0" w:line="240" w:lineRule="auto"/>
         <w:ind w:left="720"/>
       </w:pPr>
-      <w:r>
-        <w:t>The main goal is to leverage my skills within FPGA and embedded software development to create efficient systems which Autonomous Cars.</w:t>
+      <w:proofErr w:type="gramStart"/>
+      <w:r>
+        <w:t>The</w:t>
+      </w:r>
+      <w:proofErr w:type="gramEnd"/>
+      <w:r>
+        <w:t xml:space="preserve"> main goal is to leverage my skills within FPGA and embedded software development to create efficient systems which Autonomous Cars.</w:t>
       </w:r>
     </w:p>
     <w:p>
@@ -527,8 +569,42 @@
           <w:i/>
           <w:iCs/>
         </w:rPr>
-        <w:t>Non novice but junior level experience with 4+ years experience and holds a Masters Degree in Electrical Engineering</w:t>
-      </w:r>
+        <w:t xml:space="preserve">Non novice but junior level experience with 4+ </w:t>
+      </w:r>
+      <w:proofErr w:type="spellStart"/>
+      <w:r>
+        <w:rPr>
+          <w:i/>
+          <w:iCs/>
+        </w:rPr>
+        <w:t>years experience</w:t>
+      </w:r>
+      <w:proofErr w:type="spellEnd"/>
+      <w:r>
+        <w:rPr>
+          <w:i/>
+          <w:iCs/>
+        </w:rPr>
+        <w:t xml:space="preserve"> and holds a </w:t>
+      </w:r>
+      <w:proofErr w:type="spellStart"/>
+      <w:proofErr w:type="gramStart"/>
+      <w:r>
+        <w:rPr>
+          <w:i/>
+          <w:iCs/>
+        </w:rPr>
+        <w:t>Masters</w:t>
+      </w:r>
+      <w:proofErr w:type="spellEnd"/>
+      <w:r>
+        <w:rPr>
+          <w:i/>
+          <w:iCs/>
+        </w:rPr>
+        <w:t xml:space="preserve"> Degree in Electrical Engineering</w:t>
+      </w:r>
+      <w:proofErr w:type="gramEnd"/>
     </w:p>
     <w:p>
       <w:pPr>
@@ -678,7 +754,6 @@
           <w:i/>
           <w:iCs/>
         </w:rPr>
-        <w:lastRenderedPageBreak/>
         <w:t>Embedded Systems and Hardware Design</w:t>
       </w:r>
     </w:p>
@@ -706,340 +781,158 @@
     <w:p>
       <w:pPr>
         <w:spacing w:after="0" w:line="240" w:lineRule="auto"/>
-        <w:ind w:left="360"/>
         <w:rPr>
           <w:i/>
           <w:iCs/>
         </w:rPr>
       </w:pPr>
-    </w:p>
-    <w:p>
-      <w:pPr>
-        <w:spacing w:after="0" w:line="240" w:lineRule="auto"/>
-        <w:rPr>
-          <w:i/>
-          <w:iCs/>
-        </w:rPr>
-      </w:pPr>
-    </w:p>
-    <w:p>
-      <w:pPr>
-        <w:spacing w:after="0" w:line="240" w:lineRule="auto"/>
-        <w:ind w:left="1440"/>
+      <w:r>
         <w:rPr>
           <w:b/>
           <w:bCs/>
         </w:rPr>
-      </w:pPr>
-    </w:p>
-    <w:p>
-      <w:pPr>
-        <w:spacing w:after="0" w:line="240" w:lineRule="auto"/>
+        <w:lastRenderedPageBreak/>
+        <w:t xml:space="preserve">Draft 1: </w:t>
+      </w:r>
+      <w:r>
         <w:rPr>
           <w:b/>
           <w:bCs/>
         </w:rPr>
-      </w:pPr>
+        <w:t>High Level Overview</w:t>
+      </w:r>
       <w:r>
         <w:rPr>
           <w:b/>
           <w:bCs/>
         </w:rPr>
-        <w:t xml:space="preserve">Draft 1: </w:t>
+        <w:t xml:space="preserve"> </w:t>
       </w:r>
       <w:r>
         <w:rPr>
           <w:b/>
           <w:bCs/>
         </w:rPr>
-        <w:t>High Level Overview</w:t>
-      </w:r>
-      <w:r>
-        <w:rPr>
-          <w:b/>
-          <w:bCs/>
-        </w:rPr>
+        <w:t>(with MSc integrated)</w:t>
+      </w:r>
+    </w:p>
+    <w:p>
+      <w:pPr>
+        <w:pStyle w:val="NormalWeb"/>
+      </w:pPr>
+      <w:r>
+        <w:t xml:space="preserve">I’m an FPGA and </w:t>
+      </w:r>
+      <w:r>
+        <w:t xml:space="preserve">ASIC </w:t>
+      </w:r>
+      <w:r>
+        <w:t xml:space="preserve"> Design Engineer with hands-on experience developing high-performance, mission-critical digital systems, currently working in the aerospace and defense industry.</w:t>
+      </w:r>
+    </w:p>
+    <w:p>
+      <w:pPr>
+        <w:pStyle w:val="NormalWeb"/>
+      </w:pPr>
+      <w:r>
+        <w:t>My work focuses on designing and validating FPGA-based RTL architectures for applications including software-defined radios, digital signal processing pipelines, and safety-critical systems. I develop both generated and hand-written RTL, implementing robust hardware solutions that operate reliably in demanding environments</w:t>
+      </w:r>
+      <w:r>
+        <w:t xml:space="preserve">. </w:t>
+      </w:r>
+      <w:r>
+        <w:t>In addition, I design top-level FPGA architectures that integrate image processing and signal processing algorithms for on-board satellite and embedded systems. These designs leverage the parallel processing capabilities of FPGA fabric while working in tandem with System-on-Chip (SoC) processors through high-performance bus architectures such as AXI and APB.</w:t>
+      </w:r>
+    </w:p>
+    <w:p>
+      <w:pPr>
+        <w:pStyle w:val="NormalWeb"/>
+      </w:pPr>
+      <w:r>
+        <w:t xml:space="preserve">Alongside my professional work, </w:t>
+      </w:r>
+      <w:r>
+        <w:t>I recently completed a Master of Science in Electrical Engineering at San José State University, where I focused on edge compute architectures, FPGA-targeted AI/ML systems, and hardware–software co-design using FPGA and embedded SoC platforms.</w:t>
+      </w:r>
+      <w:r>
         <w:t xml:space="preserve"> </w:t>
       </w:r>
       <w:r>
-        <w:rPr>
-          <w:b/>
-          <w:bCs/>
-        </w:rPr>
-        <w:t>(with MSc integrated)</w:t>
-      </w:r>
-    </w:p>
-    <w:p>
-      <w:pPr>
-        <w:pStyle w:val="NormalWeb"/>
-      </w:pPr>
-      <w:r>
-        <w:t xml:space="preserve">I’m an FPGA and RTL Design Engineer with hands-on experience building high-performance, mission-critical digital </w:t>
-      </w:r>
-      <w:r>
-        <w:t xml:space="preserve">design </w:t>
-      </w:r>
-      <w:r>
-        <w:t>systems</w:t>
-      </w:r>
-      <w:r>
-        <w:t xml:space="preserve">, </w:t>
-      </w:r>
-      <w:r>
-        <w:t xml:space="preserve">currently working in aerospace and defense, </w:t>
-      </w:r>
-      <w:commentRangeStart w:id="0"/>
-      <w:r>
-        <w:rPr>
-          <w:b/>
-          <w:bCs/>
-          <w:color w:val="EE0000"/>
-        </w:rPr>
-        <w:t>and intentionally pivoting toward low-latency and performance-driven hardware applications.</w:t>
-      </w:r>
-      <w:commentRangeEnd w:id="0"/>
-      <w:r>
-        <w:rPr>
-          <w:rStyle w:val="CommentReference"/>
-          <w:sz w:val="24"/>
-          <w:szCs w:val="24"/>
-        </w:rPr>
-        <w:commentReference w:id="0"/>
-      </w:r>
-    </w:p>
-    <w:p>
-      <w:pPr>
-        <w:pStyle w:val="NormalWeb"/>
-      </w:pPr>
-      <w:r>
-        <w:t xml:space="preserve">Alongside my professional work, I recently completed a </w:t>
-      </w:r>
-      <w:r>
-        <w:rPr>
-          <w:rStyle w:val="Strong"/>
-          <w:rFonts w:eastAsiaTheme="majorEastAsia"/>
-        </w:rPr>
-        <w:t>Master of Science in Electrical Engineering at San Jose State University</w:t>
-      </w:r>
-      <w:r>
-        <w:t xml:space="preserve">, with an emphasis on </w:t>
-      </w:r>
-      <w:r>
-        <w:rPr>
-          <w:rStyle w:val="Strong"/>
-          <w:rFonts w:eastAsiaTheme="majorEastAsia"/>
-        </w:rPr>
-        <w:t>edge compute architectures,</w:t>
-      </w:r>
-      <w:r>
-        <w:rPr>
-          <w:rStyle w:val="Strong"/>
-          <w:rFonts w:eastAsiaTheme="majorEastAsia"/>
-        </w:rPr>
+        <w:t>M</w:t>
+      </w:r>
+      <w:r>
+        <w:t xml:space="preserve">y graduate work involved implementing computer vision and </w:t>
+      </w:r>
+      <w:r>
+        <w:t xml:space="preserve">neural networks </w:t>
+      </w:r>
+      <w:r>
+        <w:t>for image classification, segmentation, and object detection, deploying these models across CPU and FPGA architectures for efficient hardware-accelerated inference</w:t>
+      </w:r>
+      <w:r>
+        <w:t>.</w:t>
+      </w:r>
+      <w:r>
         <w:t xml:space="preserve"> </w:t>
       </w:r>
       <w:r>
-        <w:rPr>
-          <w:rStyle w:val="Strong"/>
-          <w:rFonts w:eastAsiaTheme="majorEastAsia"/>
-        </w:rPr>
-        <w:t>FPGA</w:t>
-      </w:r>
-      <w:r>
-        <w:rPr>
-          <w:rStyle w:val="Strong"/>
-          <w:rFonts w:eastAsiaTheme="majorEastAsia"/>
-        </w:rPr>
+        <w:t xml:space="preserve">The extent of my courses were carefully chosen to </w:t>
+      </w:r>
+      <w:r>
+        <w:t>learn how to design FPGA hardware accelerators emphasizing</w:t>
+      </w:r>
+      <w:r>
         <w:t xml:space="preserve"> </w:t>
       </w:r>
       <w:r>
-        <w:rPr>
-          <w:rStyle w:val="Strong"/>
-          <w:rFonts w:eastAsiaTheme="majorEastAsia"/>
-        </w:rPr>
-        <w:t xml:space="preserve">hardware-targeted AI/ML systems, </w:t>
-      </w:r>
-      <w:r>
-        <w:rPr>
-          <w:rStyle w:val="Strong"/>
-          <w:rFonts w:eastAsiaTheme="majorEastAsia"/>
-        </w:rPr>
-        <w:t>digital design using FPGA</w:t>
-      </w:r>
-      <w:r>
-        <w:rPr>
-          <w:rStyle w:val="Strong"/>
-          <w:rFonts w:eastAsiaTheme="majorEastAsia"/>
-        </w:rPr>
-        <w:t xml:space="preserve">s hosting </w:t>
-      </w:r>
-      <w:r>
-        <w:rPr>
-          <w:rStyle w:val="Strong"/>
-          <w:rFonts w:eastAsiaTheme="majorEastAsia"/>
-        </w:rPr>
-        <w:t>embedded microprocessors</w:t>
+        <w:t xml:space="preserve">performance, </w:t>
+      </w:r>
+      <w:r>
+        <w:t xml:space="preserve">low </w:t>
+      </w:r>
+      <w:r>
+        <w:t>resource utilization</w:t>
+      </w:r>
+      <w:r>
+        <w:t xml:space="preserve">, edge compute for Artificial Intelligence and Deep </w:t>
+      </w:r>
+      <w:r>
+        <w:t>Learning</w:t>
+      </w:r>
+      <w:r>
+        <w:t xml:space="preserve"> applications</w:t>
+      </w:r>
+      <w:r>
+        <w:t>. This</w:t>
+      </w:r>
+      <w:r>
+        <w:t xml:space="preserve"> work strengthened my </w:t>
+      </w:r>
+      <w:r>
+        <w:t xml:space="preserve">ability </w:t>
+      </w:r>
+      <w:r>
+        <w:t>to make</w:t>
+      </w:r>
+      <w:r>
+        <w:t xml:space="preserve"> critical design choices for future designs involving </w:t>
+      </w:r>
+      <w:r>
+        <w:t xml:space="preserve">RTL, embedded software, and </w:t>
+      </w:r>
+      <w:r>
+        <w:t xml:space="preserve">signal processing. </w:t>
+      </w:r>
+    </w:p>
+    <w:p>
+      <w:pPr>
+        <w:pStyle w:val="NormalWeb"/>
+      </w:pPr>
+      <w:r>
+        <w:t>I’m particularly interested in roles involving AI acceleration, algorithm-to-hardware implementation, and mathematically intensive signal processing, where hardware efficiency, timing closure, and system-level performance are central to the design process. I’m open to international opportunities in FPGA and low-latency hardware engineering</w:t>
       </w:r>
       <w:r>
         <w:t>.</w:t>
-      </w:r>
-      <w:r>
-        <w:t xml:space="preserve"> </w:t>
-      </w:r>
-      <w:r>
-        <w:t xml:space="preserve">My graduate work centered on implementing algorithms and inference models for image classification, segmentation, object detection, and digital </w:t>
-      </w:r>
-      <w:r>
-        <w:t>image</w:t>
-      </w:r>
-      <w:r>
-        <w:t xml:space="preserve"> processing across </w:t>
-      </w:r>
-      <w:r>
-        <w:t>software – hardware codesign</w:t>
-      </w:r>
-      <w:r>
-        <w:t xml:space="preserve"> </w:t>
-      </w:r>
-      <w:r>
-        <w:t>CPU and FPGA architectures</w:t>
-      </w:r>
-      <w:r>
-        <w:t xml:space="preserve">. The extent of my courses were carefully chosen to </w:t>
-      </w:r>
-      <w:r>
-        <w:t>learn how to design</w:t>
-      </w:r>
-      <w:r>
-        <w:t xml:space="preserve"> </w:t>
-      </w:r>
-      <w:r>
-        <w:t xml:space="preserve">FPGA </w:t>
-      </w:r>
-      <w:r>
-        <w:t>hardware</w:t>
-      </w:r>
-      <w:r>
-        <w:t xml:space="preserve"> accelerators emphasizing</w:t>
-      </w:r>
-      <w:r>
-        <w:t xml:space="preserve"> </w:t>
-      </w:r>
-      <w:r>
-        <w:t xml:space="preserve">performance, </w:t>
-      </w:r>
-      <w:r>
-        <w:t xml:space="preserve">low </w:t>
-      </w:r>
-      <w:r>
-        <w:t>resource utilization</w:t>
-      </w:r>
-      <w:r>
-        <w:t xml:space="preserve">, edge compute for Artificial Intelligence and Deep </w:t>
-      </w:r>
-      <w:r>
-        <w:t>Learning.</w:t>
-      </w:r>
-      <w:r>
-        <w:t xml:space="preserve"> This</w:t>
-      </w:r>
-      <w:r>
-        <w:t xml:space="preserve"> work strengthened my </w:t>
-      </w:r>
-      <w:r>
-        <w:t xml:space="preserve">ability </w:t>
-      </w:r>
-      <w:r>
-        <w:t>to make</w:t>
-      </w:r>
-      <w:r>
-        <w:t xml:space="preserve"> critical design choices for future designs involving </w:t>
-      </w:r>
-      <w:r>
-        <w:t xml:space="preserve">RTL, embedded software, and </w:t>
-      </w:r>
-      <w:r>
-        <w:t xml:space="preserve">signal processing. </w:t>
-      </w:r>
-    </w:p>
-    <w:p>
-      <w:pPr>
-        <w:pStyle w:val="NormalWeb"/>
-      </w:pPr>
-      <w:r>
-        <w:t>In my current industry experience</w:t>
-      </w:r>
-      <w:r>
-        <w:t xml:space="preserve">, I design and </w:t>
-      </w:r>
-      <w:r>
-        <w:t xml:space="preserve">validate </w:t>
-      </w:r>
-      <w:r>
-        <w:t xml:space="preserve">FPGA RTL for </w:t>
-      </w:r>
-      <w:r>
-        <w:t xml:space="preserve">software defined radios, digital signal processing, and bare metal HDL for safety systems. </w:t>
-      </w:r>
-      <w:r>
-        <w:t xml:space="preserve">My work also includes encapsulating image processing algorithms in top level architecture for on-board satellite processing. This work leverages designing algorithms within the FPGA fabric that work in tandem with System on Chip (SOCs) via advanced bus architectures such as AXI and APB. </w:t>
-      </w:r>
-    </w:p>
-    <w:p>
-      <w:pPr>
-        <w:pStyle w:val="NormalWeb"/>
-      </w:pPr>
-      <w:commentRangeStart w:id="1"/>
-      <w:r>
-        <w:rPr>
-          <w:color w:val="EE0000"/>
-        </w:rPr>
-        <w:t xml:space="preserve">This combination of academic depth and production FPGA experience has shaped my interest in </w:t>
-      </w:r>
-      <w:r>
-        <w:rPr>
-          <w:rStyle w:val="Strong"/>
-          <w:rFonts w:eastAsiaTheme="majorEastAsia"/>
-          <w:color w:val="EE0000"/>
-        </w:rPr>
-        <w:t>latency-sensitive and throughput-driven systems</w:t>
-      </w:r>
-      <w:commentRangeEnd w:id="1"/>
-      <w:r>
-        <w:rPr>
-          <w:rStyle w:val="CommentReference"/>
-          <w:color w:val="EE0000"/>
-          <w:sz w:val="24"/>
-          <w:szCs w:val="24"/>
-        </w:rPr>
-        <w:commentReference w:id="1"/>
-      </w:r>
-      <w:r>
-        <w:rPr>
-          <w:color w:val="EE0000"/>
-        </w:rPr>
-        <w:t>. For applications like autonomous vehicles and high frequency trading.</w:t>
-      </w:r>
-    </w:p>
-    <w:p>
-      <w:pPr>
-        <w:pStyle w:val="NormalWeb"/>
-      </w:pPr>
-      <w:r>
-        <w:t xml:space="preserve">I’m particularly interested in roles where </w:t>
-      </w:r>
-      <w:r>
-        <w:rPr>
-          <w:rStyle w:val="Strong"/>
-          <w:rFonts w:eastAsiaTheme="majorEastAsia"/>
-        </w:rPr>
-        <w:t>hardware efficiency, timing closure, and system-level performance are core design concerns</w:t>
-      </w:r>
-      <w:r>
-        <w:t xml:space="preserve">, including high-frequency trading and custom compute platforms. I am actively seeking FPGA or low-latency hardware engineering opportunities </w:t>
-      </w:r>
-      <w:r>
-        <w:t xml:space="preserve">abroad. </w:t>
       </w:r>
     </w:p>
     <w:p>
@@ -1063,70 +956,216 @@
     <w:p>
       <w:pPr>
         <w:pStyle w:val="NormalWeb"/>
-      </w:pPr>
-      <w:r>
-        <w:t>Designed Simulink-based models to generate synthesizable RTL for signal processing modules including interpolators, decimators, and Cascaded Integrator-Comb (CIC) filters.</w:t>
-      </w:r>
-    </w:p>
-    <w:p>
-      <w:pPr>
-        <w:pStyle w:val="NormalWeb"/>
-      </w:pPr>
-      <w:r>
-        <w:t xml:space="preserve">Integrated auto-generated RTL into top-level FPGA </w:t>
-      </w:r>
-      <w:r>
-        <w:t>architecture</w:t>
-      </w:r>
-      <w:r>
-        <w:t xml:space="preserve"> for Software Defined Radio (SDR) platforms and performed hardware validation and </w:t>
-      </w:r>
-      <w:r>
-        <w:t>for RTL hardware</w:t>
-      </w:r>
-      <w:r>
-        <w:t xml:space="preserve"> checkout</w:t>
-      </w:r>
-      <w:r>
-        <w:t xml:space="preserve"> within CI/CD pipelines</w:t>
-      </w:r>
-      <w:r>
-        <w:t xml:space="preserve">. </w:t>
-      </w:r>
-    </w:p>
-    <w:p>
-      <w:pPr>
-        <w:pStyle w:val="NormalWeb"/>
+        <w:spacing w:before="0" w:beforeAutospacing="0" w:after="0" w:afterAutospacing="0"/>
+        <w:rPr>
+          <w:b/>
+          <w:bCs/>
+        </w:rPr>
+      </w:pPr>
+      <w:r>
+        <w:rPr>
+          <w:b/>
+          <w:bCs/>
+        </w:rPr>
+        <w:t>AWARD: https://issuu.com/rjkennedy/docs/usbe_vol49_no1</w:t>
+      </w:r>
+    </w:p>
+    <w:p>
+      <w:pPr>
+        <w:pStyle w:val="NormalWeb"/>
+        <w:spacing w:before="0" w:beforeAutospacing="0" w:after="0" w:afterAutospacing="0"/>
+      </w:pPr>
+    </w:p>
+    <w:p>
+      <w:pPr>
+        <w:pStyle w:val="NormalWeb"/>
+        <w:spacing w:before="0" w:beforeAutospacing="0" w:after="0" w:afterAutospacing="0"/>
+      </w:pPr>
+      <w:r>
+        <w:t>ASIC &amp; FPGA Design Engineer</w:t>
+      </w:r>
+      <w:r>
+        <w:t xml:space="preserve"> II</w:t>
+      </w:r>
+    </w:p>
+    <w:p>
+      <w:pPr>
+        <w:pStyle w:val="NormalWeb"/>
+        <w:spacing w:before="0" w:beforeAutospacing="0" w:after="0" w:afterAutospacing="0"/>
+      </w:pPr>
+    </w:p>
+    <w:p>
+      <w:pPr>
+        <w:pStyle w:val="NormalWeb"/>
+        <w:numPr>
+          <w:ilvl w:val="0"/>
+          <w:numId w:val="13"/>
+        </w:numPr>
+        <w:spacing w:before="0" w:beforeAutospacing="0" w:after="0" w:afterAutospacing="0"/>
+      </w:pPr>
+      <w:r>
+        <w:t xml:space="preserve">Designed Simulink-based models to generate synthesizable RTL for signal processing modules including interpolators, decimators, and </w:t>
+      </w:r>
+      <w:r>
+        <w:t>c</w:t>
+      </w:r>
+      <w:r>
+        <w:t xml:space="preserve">ascaded </w:t>
+      </w:r>
+      <w:r>
+        <w:t>i</w:t>
+      </w:r>
+      <w:r>
+        <w:t>ntegrator-</w:t>
+      </w:r>
+      <w:r>
+        <w:t>c</w:t>
+      </w:r>
+      <w:r>
+        <w:t>omb (CIC) filters.</w:t>
+      </w:r>
+    </w:p>
+    <w:p>
+      <w:pPr>
+        <w:pStyle w:val="NormalWeb"/>
+        <w:spacing w:before="0" w:beforeAutospacing="0" w:after="0" w:afterAutospacing="0"/>
+        <w:ind w:left="720"/>
+      </w:pPr>
+    </w:p>
+    <w:p>
+      <w:pPr>
+        <w:pStyle w:val="NormalWeb"/>
+        <w:numPr>
+          <w:ilvl w:val="0"/>
+          <w:numId w:val="13"/>
+        </w:numPr>
+        <w:spacing w:before="0" w:beforeAutospacing="0" w:after="0" w:afterAutospacing="0"/>
+      </w:pPr>
+      <w:r>
+        <w:t>Integrated auto-generated RTL into top-level FPGA architectures for Software Defined Radio (SDR) platforms and validated top-level hardware modules through automated CI/CD verification pipelines.</w:t>
+      </w:r>
+    </w:p>
+    <w:p>
+      <w:pPr>
+        <w:pStyle w:val="NormalWeb"/>
+        <w:spacing w:before="0" w:beforeAutospacing="0" w:after="0" w:afterAutospacing="0"/>
+        <w:ind w:left="720"/>
+      </w:pPr>
+    </w:p>
+    <w:p>
+      <w:pPr>
+        <w:pStyle w:val="NormalWeb"/>
+        <w:numPr>
+          <w:ilvl w:val="0"/>
+          <w:numId w:val="13"/>
+        </w:numPr>
+        <w:spacing w:before="0" w:beforeAutospacing="0" w:after="0" w:afterAutospacing="0"/>
       </w:pPr>
       <w:r>
         <w:lastRenderedPageBreak/>
-        <w:t>Developed mission-critical, bare-metal RTL for safety-sensitive satellite and long-range defense systems,</w:t>
-      </w:r>
-      <w:r>
-        <w:t xml:space="preserve"> for arm and disarm of critical FPGA functions.</w:t>
+        <w:t xml:space="preserve">Developed mission-critical, bare-metal RTL for safety-sensitive long-range </w:t>
+      </w:r>
+      <w:r>
+        <w:t>high-altitude</w:t>
+      </w:r>
+      <w:r>
+        <w:t xml:space="preserve"> vehicles</w:t>
+      </w:r>
+      <w:r>
+        <w:t>,</w:t>
+      </w:r>
+      <w:r>
+        <w:t xml:space="preserve"> for arm and disarm of critical </w:t>
+      </w:r>
+      <w:r>
+        <w:t>hardware</w:t>
       </w:r>
       <w:r>
         <w:t xml:space="preserve"> </w:t>
       </w:r>
       <w:r>
+        <w:t>functions.</w:t>
+      </w:r>
+      <w:r>
+        <w:t xml:space="preserve"> </w:t>
+      </w:r>
+      <w:r>
         <w:t xml:space="preserve">Designs included </w:t>
       </w:r>
       <w:r>
-        <w:t>custom encoding schemes, finite state machines, and</w:t>
-      </w:r>
-      <w:r>
-        <w:t xml:space="preserve"> logic to offload</w:t>
+        <w:t xml:space="preserve">custom encoding schemes, </w:t>
+      </w:r>
+      <w:r>
+        <w:t xml:space="preserve">robust </w:t>
+      </w:r>
+      <w:r>
+        <w:t>finite state machines, and</w:t>
+      </w:r>
+      <w:r>
+        <w:t xml:space="preserve"> logic to </w:t>
+      </w:r>
+      <w:r>
+        <w:t>read in</w:t>
       </w:r>
       <w:r>
         <w:t xml:space="preserve"> real-time sensor </w:t>
       </w:r>
       <w:r>
-        <w:t xml:space="preserve">data for processing. </w:t>
-      </w:r>
-    </w:p>
-    <w:p>
-      <w:pPr>
-        <w:pStyle w:val="NormalWeb"/>
+        <w:t>dat</w:t>
+      </w:r>
+      <w:r>
+        <w:t>a.</w:t>
+      </w:r>
+    </w:p>
+    <w:p>
+      <w:pPr>
+        <w:pStyle w:val="NormalWeb"/>
+        <w:numPr>
+          <w:ilvl w:val="0"/>
+          <w:numId w:val="13"/>
+        </w:numPr>
+        <w:spacing w:before="0" w:beforeAutospacing="0" w:after="0" w:afterAutospacing="0"/>
+      </w:pPr>
+      <w:r>
+        <w:t xml:space="preserve">Validated signed </w:t>
+      </w:r>
+      <w:r>
+        <w:t>fixed-point</w:t>
+      </w:r>
+      <w:r>
+        <w:t xml:space="preserve"> RTL for arithmetic operations </w:t>
+      </w:r>
+      <w:r>
+        <w:t xml:space="preserve">that </w:t>
+      </w:r>
+      <w:r>
+        <w:t xml:space="preserve">represent </w:t>
+      </w:r>
+      <w:r>
+        <w:t xml:space="preserve">accelerometer data to confirm FPGA </w:t>
+      </w:r>
+      <w:r>
+        <w:t xml:space="preserve">mathematic integration </w:t>
+      </w:r>
+      <w:r>
+        <w:t xml:space="preserve">to produce velocity and distance calculations for high altitude interceptor vehicles. </w:t>
+      </w:r>
+    </w:p>
+    <w:p>
+      <w:pPr>
+        <w:pStyle w:val="NormalWeb"/>
+        <w:spacing w:before="0" w:beforeAutospacing="0" w:after="0" w:afterAutospacing="0"/>
+        <w:ind w:left="720"/>
+      </w:pPr>
+    </w:p>
+    <w:p>
+      <w:pPr>
+        <w:pStyle w:val="NormalWeb"/>
+        <w:numPr>
+          <w:ilvl w:val="0"/>
+          <w:numId w:val="13"/>
+        </w:numPr>
+        <w:spacing w:before="0" w:beforeAutospacing="0" w:after="0" w:afterAutospacing="0"/>
       </w:pPr>
       <w:r>
         <w:t xml:space="preserve">Architected FPGA-based algorithm implementations that interface with System-on-Chip (SoC) platforms </w:t>
@@ -1141,26 +1180,52 @@
     <w:p>
       <w:pPr>
         <w:pStyle w:val="NormalWeb"/>
-      </w:pPr>
-      <w:r>
-        <w:t xml:space="preserve">Authored detailed algorithm design documentation describing </w:t>
-      </w:r>
-      <w:r>
-        <w:t xml:space="preserve">Software Defined Radio digital Signal Processing </w:t>
-      </w:r>
-      <w:r>
-        <w:t>FPGA-based hardware implementations, data paths, timing considerations, and system-level integration</w:t>
-      </w:r>
-      <w:r>
-        <w:t xml:space="preserve"> for</w:t>
-      </w:r>
-      <w:r>
-        <w:t>.</w:t>
-      </w:r>
-    </w:p>
-    <w:p>
-      <w:pPr>
-        <w:pStyle w:val="NormalWeb"/>
+        <w:spacing w:before="0" w:beforeAutospacing="0" w:after="0" w:afterAutospacing="0"/>
+        <w:ind w:left="720"/>
+      </w:pPr>
+    </w:p>
+    <w:p>
+      <w:pPr>
+        <w:pStyle w:val="NormalWeb"/>
+        <w:numPr>
+          <w:ilvl w:val="0"/>
+          <w:numId w:val="13"/>
+        </w:numPr>
+        <w:spacing w:before="0" w:beforeAutospacing="0" w:after="0" w:afterAutospacing="0"/>
+      </w:pPr>
+      <w:r>
+        <w:t>Authored detailed design documentation for FPGA-based digital signal processing algorithms in Software Defined Radio (SDR) systems, including data path architecture, timing constraints, and system-level integration.</w:t>
+      </w:r>
+    </w:p>
+    <w:p>
+      <w:pPr>
+        <w:pStyle w:val="NormalWeb"/>
+        <w:spacing w:before="0" w:beforeAutospacing="0" w:after="0" w:afterAutospacing="0"/>
+      </w:pPr>
+      <w:r>
+        <w:t>Electro</w:t>
+      </w:r>
+      <w:r>
+        <w:t>-</w:t>
+      </w:r>
+      <w:r>
+        <w:t>Optical Engineer</w:t>
+      </w:r>
+      <w:r>
+        <w:t xml:space="preserve"> </w:t>
+      </w:r>
+      <w:r>
+        <w:t>II</w:t>
+      </w:r>
+    </w:p>
+    <w:p>
+      <w:pPr>
+        <w:pStyle w:val="NormalWeb"/>
+        <w:numPr>
+          <w:ilvl w:val="0"/>
+          <w:numId w:val="12"/>
+        </w:numPr>
+        <w:spacing w:before="0" w:beforeAutospacing="0" w:after="0" w:afterAutospacing="0"/>
       </w:pPr>
       <w:r>
         <w:t>I</w:t>
@@ -1172,15 +1237,9 @@
     <w:p>
       <w:pPr>
         <w:pStyle w:val="NormalWeb"/>
-      </w:pPr>
-    </w:p>
-    <w:p>
-      <w:pPr>
-        <w:pStyle w:val="NormalWeb"/>
-      </w:pPr>
-      <w:r>
-        <w:t>Electro Optical Engineer</w:t>
-      </w:r>
+        <w:spacing w:before="0" w:beforeAutospacing="0" w:after="0" w:afterAutospacing="0"/>
+        <w:ind w:left="720"/>
+      </w:pPr>
     </w:p>
     <w:p>
       <w:pPr>
@@ -1204,8 +1263,15 @@
         <w:t xml:space="preserve">architectures for onboard processing and bus to payload communication </w:t>
       </w:r>
       <w:r>
-        <w:t xml:space="preserve">for satellite systems. </w:t>
-      </w:r>
+        <w:t>for satellite systems.</w:t>
+      </w:r>
+    </w:p>
+    <w:p>
+      <w:pPr>
+        <w:pStyle w:val="NormalWeb"/>
+        <w:spacing w:before="0" w:beforeAutospacing="0" w:after="0" w:afterAutospacing="0"/>
+        <w:ind w:left="720"/>
+      </w:pPr>
     </w:p>
     <w:p>
       <w:pPr>
@@ -1223,6 +1289,13 @@
     <w:p>
       <w:pPr>
         <w:pStyle w:val="NormalWeb"/>
+        <w:spacing w:before="0" w:beforeAutospacing="0" w:after="0" w:afterAutospacing="0"/>
+        <w:ind w:left="720"/>
+      </w:pPr>
+    </w:p>
+    <w:p>
+      <w:pPr>
+        <w:pStyle w:val="NormalWeb"/>
         <w:numPr>
           <w:ilvl w:val="0"/>
           <w:numId w:val="5"/>
@@ -1230,7 +1303,13 @@
         <w:spacing w:before="0" w:beforeAutospacing="0" w:after="0" w:afterAutospacing="0"/>
       </w:pPr>
       <w:r>
-        <w:t xml:space="preserve">Presented electronics architecture to customer during System Readiness Reviews (SRR) and System Readiness and Design Review (SRDR). </w:t>
+        <w:t>Presented electronics architecture to customer during System Readiness Reviews (SRR) and System Readiness and Design Review</w:t>
+      </w:r>
+      <w:r>
+        <w:t>s</w:t>
+      </w:r>
+      <w:r>
+        <w:t xml:space="preserve"> (SRDR). </w:t>
       </w:r>
     </w:p>
     <w:p>
@@ -1243,44 +1322,16 @@
     <w:p>
       <w:pPr>
         <w:pStyle w:val="NormalWeb"/>
-      </w:pPr>
-      <w:r>
-        <w:t>Electro Optical Engineer Associate</w:t>
-      </w:r>
-    </w:p>
-    <w:p>
-      <w:pPr>
-        <w:pStyle w:val="NormalWeb"/>
-        <w:spacing w:before="0" w:beforeAutospacing="0" w:after="0" w:afterAutospacing="0"/>
-        <w:ind w:firstLine="360"/>
-        <w:rPr>
-          <w:rFonts w:ascii="Verdana" w:hAnsi="Verdana"/>
-          <w:color w:val="000000"/>
-          <w:sz w:val="18"/>
-          <w:szCs w:val="18"/>
-        </w:rPr>
-      </w:pPr>
-      <w:r>
-        <w:rPr>
-          <w:rFonts w:ascii="Verdana" w:hAnsi="Verdana"/>
-          <w:b/>
-          <w:bCs/>
-          <w:color w:val="000000"/>
-          <w:sz w:val="18"/>
-          <w:szCs w:val="18"/>
-        </w:rPr>
-        <w:t xml:space="preserve">C# </w:t>
-      </w:r>
-      <w:r>
-        <w:rPr>
-          <w:rFonts w:ascii="Verdana" w:hAnsi="Verdana"/>
-          <w:b/>
-          <w:bCs/>
-          <w:color w:val="000000"/>
-          <w:sz w:val="18"/>
-          <w:szCs w:val="18"/>
-        </w:rPr>
-        <w:t>UX/UI Firmware Development</w:t>
+        <w:spacing w:before="0" w:beforeAutospacing="0" w:after="0" w:afterAutospacing="0"/>
+      </w:pPr>
+      <w:r>
+        <w:t>Electro</w:t>
+      </w:r>
+      <w:r>
+        <w:t>-</w:t>
+      </w:r>
+      <w:r>
+        <w:t>Optical Engineer Associate</w:t>
       </w:r>
     </w:p>
     <w:p>
@@ -1292,38 +1343,50 @@
         </w:numPr>
         <w:spacing w:before="0" w:beforeAutospacing="0" w:after="0" w:afterAutospacing="0"/>
         <w:rPr>
-          <w:rFonts w:ascii="Verdana" w:hAnsi="Verdana"/>
-          <w:color w:val="000000"/>
-          <w:sz w:val="18"/>
-          <w:szCs w:val="18"/>
-        </w:rPr>
-      </w:pPr>
-      <w:r>
-        <w:rPr>
-          <w:rFonts w:ascii="Verdana" w:hAnsi="Verdana"/>
-          <w:color w:val="000000"/>
-          <w:sz w:val="18"/>
-          <w:szCs w:val="18"/>
-        </w:rPr>
-        <w:t>Developed custom scripting language using C# to command and control read out integrated circuits</w:t>
-      </w:r>
-      <w:r>
-        <w:rPr>
-          <w:rFonts w:ascii="Verdana" w:hAnsi="Verdana"/>
-          <w:color w:val="000000"/>
-          <w:sz w:val="18"/>
-          <w:szCs w:val="18"/>
+          <w:color w:val="000000"/>
+        </w:rPr>
+      </w:pPr>
+      <w:r>
+        <w:rPr>
+          <w:color w:val="000000"/>
+        </w:rPr>
+        <w:t xml:space="preserve">Developed C# </w:t>
+      </w:r>
+      <w:r>
+        <w:rPr>
+          <w:color w:val="000000"/>
+        </w:rPr>
+        <w:t xml:space="preserve">code to parse through CSV scripts to </w:t>
+      </w:r>
+      <w:r>
+        <w:rPr>
+          <w:color w:val="000000"/>
+        </w:rPr>
+        <w:t>command and control read out integrated circuits</w:t>
+      </w:r>
+      <w:r>
+        <w:rPr>
+          <w:color w:val="000000"/>
         </w:rPr>
         <w:t xml:space="preserve"> (ROICs)</w:t>
       </w:r>
       <w:r>
         <w:rPr>
-          <w:rFonts w:ascii="Verdana" w:hAnsi="Verdana"/>
-          <w:color w:val="000000"/>
-          <w:sz w:val="18"/>
-          <w:szCs w:val="18"/>
-        </w:rPr>
-        <w:t xml:space="preserve"> within highly sensitive Geiger Mode Avalanche Photo-Diode sensors. </w:t>
+          <w:color w:val="000000"/>
+        </w:rPr>
+        <w:t xml:space="preserve"> </w:t>
+      </w:r>
+      <w:r>
+        <w:rPr>
+          <w:color w:val="000000"/>
+        </w:rPr>
+        <w:t xml:space="preserve">for </w:t>
+      </w:r>
+      <w:r>
+        <w:rPr>
+          <w:color w:val="000000"/>
+        </w:rPr>
+        <w:t xml:space="preserve">highly sensitive Geiger Mode Avalanche Photo-Diode sensors. </w:t>
       </w:r>
     </w:p>
     <w:p>
@@ -1335,39 +1398,25 @@
         </w:numPr>
         <w:spacing w:before="0" w:beforeAutospacing="0" w:after="0" w:afterAutospacing="0"/>
         <w:rPr>
-          <w:rFonts w:ascii="Verdana" w:hAnsi="Verdana"/>
-          <w:color w:val="000000"/>
-          <w:sz w:val="18"/>
-          <w:szCs w:val="18"/>
-        </w:rPr>
-      </w:pPr>
-      <w:r>
-        <w:rPr>
-          <w:rFonts w:ascii="Verdana" w:hAnsi="Verdana"/>
-          <w:color w:val="000000"/>
-          <w:sz w:val="18"/>
-          <w:szCs w:val="18"/>
-        </w:rPr>
-        <w:t xml:space="preserve">Designed UX/UI GUIs in C# to interface with test hardware associated with Hardware in the Loop (HWIL) </w:t>
-      </w:r>
-      <w:r>
-        <w:rPr>
-          <w:rFonts w:ascii="Verdana" w:hAnsi="Verdana"/>
-          <w:color w:val="000000"/>
-          <w:sz w:val="18"/>
-          <w:szCs w:val="18"/>
-        </w:rPr>
-        <w:t xml:space="preserve">configurations </w:t>
-      </w:r>
-      <w:r>
-        <w:rPr>
-          <w:rFonts w:ascii="Verdana" w:hAnsi="Verdana"/>
-          <w:color w:val="000000"/>
-          <w:sz w:val="18"/>
-          <w:szCs w:val="18"/>
-        </w:rPr>
-        <w:t>and Standardized Test Equipment (STEs).</w:t>
-      </w:r>
+          <w:color w:val="000000"/>
+        </w:rPr>
+      </w:pPr>
+      <w:r>
+        <w:rPr>
+          <w:color w:val="000000"/>
+        </w:rPr>
+        <w:t>Developed intuitive C# UX/UI interfaces to control and monitor National Instruments test hardware for Hardware-in-the-Loop (HIL) systems and Standardized Test Equipment (STE) by leveraging dynamic link libraries to interface and communicate with the equipment through custom graphical user interfaces.</w:t>
+      </w:r>
+    </w:p>
+    <w:p>
+      <w:pPr>
+        <w:pStyle w:val="NormalWeb"/>
+        <w:spacing w:before="0" w:beforeAutospacing="0" w:after="0" w:afterAutospacing="0"/>
+        <w:ind w:left="720"/>
+        <w:rPr>
+          <w:color w:val="000000"/>
+        </w:rPr>
+      </w:pPr>
     </w:p>
     <w:p>
       <w:pPr>
@@ -1378,21 +1427,48 @@
         </w:numPr>
         <w:spacing w:before="0" w:beforeAutospacing="0" w:after="0" w:afterAutospacing="0"/>
         <w:rPr>
-          <w:rFonts w:ascii="Verdana" w:hAnsi="Verdana"/>
-          <w:color w:val="000000"/>
-          <w:sz w:val="18"/>
-          <w:szCs w:val="18"/>
-        </w:rPr>
-      </w:pPr>
-      <w:r>
-        <w:rPr>
-          <w:rFonts w:ascii="Verdana" w:hAnsi="Verdana"/>
-          <w:color w:val="000000"/>
-          <w:sz w:val="18"/>
-          <w:szCs w:val="18"/>
-        </w:rPr>
-        <w:t>Wrote C# code to utilize dynamic link libraries to interface National Instruments test equipment to be controlled and monitored via custom graphical user interfaces.</w:t>
-      </w:r>
+          <w:color w:val="000000"/>
+        </w:rPr>
+      </w:pPr>
+      <w:r>
+        <w:rPr>
+          <w:color w:val="000000"/>
+        </w:rPr>
+        <w:t xml:space="preserve">Developed </w:t>
+      </w:r>
+      <w:r>
+        <w:rPr>
+          <w:color w:val="000000"/>
+        </w:rPr>
+        <w:t>test environments</w:t>
+      </w:r>
+      <w:r>
+        <w:rPr>
+          <w:color w:val="000000"/>
+        </w:rPr>
+        <w:t xml:space="preserve"> that logged and tracked large amounts of data from test equipment for both .csv, and .xlsx files with expected runtime of several</w:t>
+      </w:r>
+      <w:r>
+        <w:rPr>
+          <w:color w:val="000000"/>
+        </w:rPr>
+        <w:t xml:space="preserve"> hours</w:t>
+      </w:r>
+      <w:r>
+        <w:rPr>
+          <w:color w:val="000000"/>
+        </w:rPr>
+        <w:t>.</w:t>
+      </w:r>
+    </w:p>
+    <w:p>
+      <w:pPr>
+        <w:pStyle w:val="NormalWeb"/>
+        <w:spacing w:before="0" w:beforeAutospacing="0" w:after="0" w:afterAutospacing="0"/>
+        <w:rPr>
+          <w:color w:val="000000"/>
+        </w:rPr>
+      </w:pPr>
     </w:p>
     <w:p>
       <w:pPr>
@@ -1403,54 +1479,48 @@
         </w:numPr>
         <w:spacing w:before="0" w:beforeAutospacing="0" w:after="0" w:afterAutospacing="0"/>
         <w:rPr>
-          <w:rFonts w:ascii="Verdana" w:hAnsi="Verdana"/>
-          <w:color w:val="000000"/>
-          <w:sz w:val="18"/>
-          <w:szCs w:val="18"/>
-        </w:rPr>
-      </w:pPr>
-      <w:r>
-        <w:rPr>
-          <w:rFonts w:ascii="Verdana" w:hAnsi="Verdana"/>
-          <w:color w:val="000000"/>
-          <w:sz w:val="18"/>
-          <w:szCs w:val="18"/>
+          <w:color w:val="000000"/>
+        </w:rPr>
+      </w:pPr>
+      <w:r>
+        <w:rPr>
+          <w:color w:val="000000"/>
         </w:rPr>
         <w:t xml:space="preserve">Developed </w:t>
       </w:r>
       <w:r>
         <w:rPr>
-          <w:rFonts w:ascii="Verdana" w:hAnsi="Verdana"/>
-          <w:color w:val="000000"/>
-          <w:sz w:val="18"/>
-          <w:szCs w:val="18"/>
-        </w:rPr>
-        <w:t>test environments</w:t>
-      </w:r>
-      <w:r>
-        <w:rPr>
-          <w:rFonts w:ascii="Verdana" w:hAnsi="Verdana"/>
-          <w:color w:val="000000"/>
-          <w:sz w:val="18"/>
-          <w:szCs w:val="18"/>
-        </w:rPr>
-        <w:t xml:space="preserve"> that logged and tracked large amounts of data from test equipment for both .csv, and .xlsx files with expected runtime of several</w:t>
-      </w:r>
-      <w:r>
-        <w:rPr>
-          <w:rFonts w:ascii="Verdana" w:hAnsi="Verdana"/>
-          <w:color w:val="000000"/>
-          <w:sz w:val="18"/>
-          <w:szCs w:val="18"/>
-        </w:rPr>
-        <w:t xml:space="preserve"> hours</w:t>
-      </w:r>
-      <w:r>
-        <w:rPr>
-          <w:rFonts w:ascii="Verdana" w:hAnsi="Verdana"/>
-          <w:color w:val="000000"/>
-          <w:sz w:val="18"/>
-          <w:szCs w:val="18"/>
+          <w:color w:val="000000"/>
+        </w:rPr>
+        <w:t>v</w:t>
+      </w:r>
+      <w:r>
+        <w:rPr>
+          <w:color w:val="000000"/>
+        </w:rPr>
+        <w:t xml:space="preserve">alidation and solutions targeted toward space rated RTL designs checking radiation bit flipping, fault tolerancing, and implementing primary and redundancy </w:t>
+      </w:r>
+      <w:r>
+        <w:rPr>
+          <w:color w:val="000000"/>
+        </w:rPr>
+        <w:t xml:space="preserve">IP </w:t>
+      </w:r>
+      <w:r>
+        <w:rPr>
+          <w:color w:val="000000"/>
+        </w:rPr>
+        <w:t>cores</w:t>
+      </w:r>
+      <w:r>
+        <w:rPr>
+          <w:color w:val="000000"/>
+        </w:rPr>
+        <w:t xml:space="preserve"> for space rated electronic boxes</w:t>
+      </w:r>
+      <w:r>
+        <w:rPr>
+          <w:color w:val="000000"/>
         </w:rPr>
         <w:t>.</w:t>
       </w:r>
@@ -1458,143 +1528,2669 @@
     <w:p>
       <w:pPr>
         <w:pStyle w:val="NormalWeb"/>
-        <w:numPr>
-          <w:ilvl w:val="0"/>
-          <w:numId w:val="4"/>
-        </w:numPr>
-        <w:spacing w:before="0" w:beforeAutospacing="0" w:after="0" w:afterAutospacing="0"/>
-        <w:rPr>
-          <w:rFonts w:ascii="Verdana" w:hAnsi="Verdana"/>
-          <w:color w:val="000000"/>
-          <w:sz w:val="18"/>
-          <w:szCs w:val="18"/>
-        </w:rPr>
-      </w:pPr>
-      <w:r>
-        <w:rPr>
-          <w:rFonts w:ascii="Verdana" w:hAnsi="Verdana"/>
-          <w:color w:val="000000"/>
-          <w:sz w:val="18"/>
-          <w:szCs w:val="18"/>
-        </w:rPr>
-        <w:t xml:space="preserve">Developed </w:t>
-      </w:r>
-      <w:r>
-        <w:rPr>
-          <w:rFonts w:ascii="Verdana" w:hAnsi="Verdana"/>
-          <w:color w:val="000000"/>
-          <w:sz w:val="18"/>
-          <w:szCs w:val="18"/>
-        </w:rPr>
-        <w:t>v</w:t>
-      </w:r>
-      <w:r>
-        <w:rPr>
-          <w:rFonts w:ascii="Verdana" w:hAnsi="Verdana"/>
-          <w:color w:val="000000"/>
-          <w:sz w:val="18"/>
-          <w:szCs w:val="18"/>
-        </w:rPr>
-        <w:t xml:space="preserve">alidation and solutions targeted toward space rated RTL designs checking radiation bit flipping, fault tolerancing, </w:t>
-      </w:r>
-      <w:r>
-        <w:rPr>
-          <w:rFonts w:ascii="Verdana" w:hAnsi="Verdana"/>
-          <w:color w:val="000000"/>
-          <w:sz w:val="18"/>
-          <w:szCs w:val="18"/>
-        </w:rPr>
-        <w:t xml:space="preserve">and implementing </w:t>
-      </w:r>
-      <w:r>
-        <w:rPr>
-          <w:rFonts w:ascii="Verdana" w:hAnsi="Verdana"/>
-          <w:color w:val="000000"/>
-          <w:sz w:val="18"/>
-          <w:szCs w:val="18"/>
-        </w:rPr>
-        <w:t xml:space="preserve">primary and redundancy </w:t>
-      </w:r>
-      <w:r>
-        <w:rPr>
-          <w:rFonts w:ascii="Verdana" w:hAnsi="Verdana"/>
-          <w:color w:val="000000"/>
-          <w:sz w:val="18"/>
-          <w:szCs w:val="18"/>
-        </w:rPr>
-        <w:t xml:space="preserve">IP </w:t>
-      </w:r>
-      <w:r>
-        <w:rPr>
-          <w:rFonts w:ascii="Verdana" w:hAnsi="Verdana"/>
-          <w:color w:val="000000"/>
-          <w:sz w:val="18"/>
-          <w:szCs w:val="18"/>
-        </w:rPr>
-        <w:t>cores.</w:t>
-      </w:r>
-    </w:p>
-    <w:p>
-      <w:pPr>
-        <w:pStyle w:val="NormalWeb"/>
-        <w:spacing w:before="0" w:beforeAutospacing="0" w:after="0" w:afterAutospacing="0"/>
-        <w:ind w:left="360"/>
-        <w:rPr>
-          <w:rFonts w:ascii="Verdana" w:hAnsi="Verdana"/>
-          <w:color w:val="000000"/>
-          <w:sz w:val="18"/>
-          <w:szCs w:val="18"/>
-        </w:rPr>
-      </w:pPr>
-    </w:p>
-    <w:p>
-      <w:pPr>
-        <w:pStyle w:val="NormalWeb"/>
-      </w:pPr>
-    </w:p>
-    <w:p>
-      <w:pPr>
-        <w:pStyle w:val="NormalWeb"/>
-      </w:pPr>
-    </w:p>
-    <w:p>
-      <w:pPr>
-        <w:pStyle w:val="NormalWeb"/>
-      </w:pPr>
-    </w:p>
-    <w:p>
-      <w:pPr>
-        <w:pStyle w:val="NormalWeb"/>
-      </w:pPr>
-    </w:p>
-    <w:p>
-      <w:pPr>
-        <w:pStyle w:val="NormalWeb"/>
-      </w:pPr>
-    </w:p>
-    <w:p>
-      <w:pPr>
-        <w:pStyle w:val="NormalWeb"/>
-      </w:pPr>
-    </w:p>
-    <w:p>
-      <w:pPr>
-        <w:pStyle w:val="NormalWeb"/>
-      </w:pPr>
-    </w:p>
-    <w:p>
-      <w:pPr>
-        <w:pStyle w:val="NormalWeb"/>
-      </w:pPr>
-    </w:p>
-    <w:p>
-      <w:pPr>
-        <w:pStyle w:val="NormalWeb"/>
-      </w:pPr>
-    </w:p>
-    <w:p>
-      <w:pPr>
-        <w:pStyle w:val="NormalWeb"/>
+        <w:spacing w:before="0" w:beforeAutospacing="0" w:after="0" w:afterAutospacing="0"/>
+        <w:rPr>
+          <w:rFonts w:ascii="Verdana" w:hAnsi="Verdana"/>
+          <w:color w:val="000000"/>
+          <w:sz w:val="18"/>
+          <w:szCs w:val="18"/>
+        </w:rPr>
+      </w:pPr>
+    </w:p>
+    <w:p>
+      <w:pPr>
+        <w:pStyle w:val="NormalWeb"/>
+        <w:spacing w:before="0" w:beforeAutospacing="0" w:after="0" w:afterAutospacing="0"/>
+        <w:rPr>
+          <w:rFonts w:ascii="Verdana" w:hAnsi="Verdana"/>
+          <w:color w:val="000000"/>
+          <w:sz w:val="18"/>
+          <w:szCs w:val="18"/>
+        </w:rPr>
+      </w:pPr>
+    </w:p>
+    <w:p>
+      <w:pPr>
+        <w:pStyle w:val="NormalWeb"/>
+        <w:spacing w:before="0" w:beforeAutospacing="0" w:after="0" w:afterAutospacing="0"/>
+        <w:rPr>
+          <w:rFonts w:ascii="Verdana" w:hAnsi="Verdana"/>
+          <w:color w:val="000000"/>
+          <w:sz w:val="18"/>
+          <w:szCs w:val="18"/>
+        </w:rPr>
+      </w:pPr>
+    </w:p>
+    <w:p>
+      <w:pPr>
+        <w:pStyle w:val="NormalWeb"/>
+        <w:spacing w:before="0" w:beforeAutospacing="0" w:after="0" w:afterAutospacing="0"/>
+        <w:rPr>
+          <w:rFonts w:ascii="Verdana" w:hAnsi="Verdana"/>
+          <w:color w:val="000000"/>
+          <w:sz w:val="18"/>
+          <w:szCs w:val="18"/>
+        </w:rPr>
+      </w:pPr>
+    </w:p>
+    <w:p>
+      <w:pPr>
+        <w:pStyle w:val="NormalWeb"/>
+        <w:spacing w:before="0" w:beforeAutospacing="0" w:after="0" w:afterAutospacing="0"/>
+        <w:rPr>
+          <w:rFonts w:ascii="Verdana" w:hAnsi="Verdana"/>
+          <w:color w:val="000000"/>
+          <w:sz w:val="18"/>
+          <w:szCs w:val="18"/>
+        </w:rPr>
+      </w:pPr>
+    </w:p>
+    <w:p>
+      <w:pPr>
+        <w:pStyle w:val="NormalWeb"/>
+        <w:spacing w:before="0" w:beforeAutospacing="0" w:after="0" w:afterAutospacing="0"/>
+        <w:rPr>
+          <w:rFonts w:ascii="Verdana" w:hAnsi="Verdana"/>
+          <w:color w:val="000000"/>
+          <w:sz w:val="18"/>
+          <w:szCs w:val="18"/>
+        </w:rPr>
+      </w:pPr>
+    </w:p>
+    <w:p>
+      <w:pPr>
+        <w:pStyle w:val="NormalWeb"/>
+        <w:spacing w:before="0" w:beforeAutospacing="0" w:after="0" w:afterAutospacing="0"/>
+        <w:rPr>
+          <w:rFonts w:ascii="Verdana" w:hAnsi="Verdana"/>
+          <w:color w:val="000000"/>
+          <w:sz w:val="18"/>
+          <w:szCs w:val="18"/>
+        </w:rPr>
+      </w:pPr>
+    </w:p>
+    <w:p>
+      <w:pPr>
+        <w:pStyle w:val="NormalWeb"/>
+        <w:spacing w:before="0" w:beforeAutospacing="0" w:after="0" w:afterAutospacing="0"/>
+        <w:jc w:val="center"/>
+        <w:rPr>
+          <w:rFonts w:ascii="Verdana" w:hAnsi="Verdana"/>
+          <w:color w:val="000000"/>
+          <w:sz w:val="18"/>
+          <w:szCs w:val="18"/>
+        </w:rPr>
+      </w:pPr>
+    </w:p>
+    <w:p>
+      <w:pPr>
+        <w:pStyle w:val="NormalWeb"/>
+        <w:spacing w:before="0" w:beforeAutospacing="0" w:after="0" w:afterAutospacing="0"/>
+        <w:jc w:val="center"/>
+        <w:rPr>
+          <w:rFonts w:ascii="Verdana" w:hAnsi="Verdana"/>
+          <w:color w:val="000000"/>
+          <w:sz w:val="18"/>
+          <w:szCs w:val="18"/>
+        </w:rPr>
+      </w:pPr>
+    </w:p>
+    <w:p>
+      <w:pPr>
+        <w:pStyle w:val="NormalWeb"/>
+        <w:spacing w:before="0" w:beforeAutospacing="0" w:after="0" w:afterAutospacing="0"/>
+        <w:jc w:val="center"/>
+        <w:rPr>
+          <w:rFonts w:ascii="Verdana" w:hAnsi="Verdana"/>
+          <w:color w:val="000000"/>
+          <w:sz w:val="18"/>
+          <w:szCs w:val="18"/>
+        </w:rPr>
+      </w:pPr>
+      <w:r>
+        <w:rPr>
+          <w:rFonts w:ascii="Verdana" w:hAnsi="Verdana"/>
+          <w:color w:val="000000"/>
+          <w:sz w:val="18"/>
+          <w:szCs w:val="18"/>
+        </w:rPr>
+        <w:t>Projects</w:t>
+      </w:r>
+    </w:p>
+    <w:p>
+      <w:pPr>
+        <w:pStyle w:val="NormalWeb"/>
+        <w:spacing w:before="0" w:beforeAutospacing="0" w:after="0" w:afterAutospacing="0"/>
+        <w:rPr>
+          <w:rFonts w:ascii="Verdana" w:hAnsi="Verdana"/>
+          <w:color w:val="000000"/>
+          <w:sz w:val="18"/>
+          <w:szCs w:val="18"/>
+        </w:rPr>
+      </w:pPr>
+    </w:p>
+    <w:p>
+      <w:pPr>
+        <w:pStyle w:val="NormalWeb"/>
+        <w:spacing w:before="0" w:beforeAutospacing="0" w:after="0" w:afterAutospacing="0"/>
+        <w:rPr>
+          <w:rFonts w:ascii="Verdana" w:hAnsi="Verdana"/>
+          <w:color w:val="000000"/>
+          <w:sz w:val="18"/>
+          <w:szCs w:val="18"/>
+        </w:rPr>
+      </w:pPr>
+      <w:r>
+        <w:rPr>
+          <w:rFonts w:ascii="Verdana" w:hAnsi="Verdana"/>
+          <w:color w:val="000000"/>
+          <w:sz w:val="18"/>
+          <w:szCs w:val="18"/>
+        </w:rPr>
+        <w:t>Undergraduate:</w:t>
+      </w:r>
+    </w:p>
+    <w:p>
+      <w:pPr>
+        <w:pStyle w:val="NormalWeb"/>
+        <w:spacing w:before="0" w:beforeAutospacing="0" w:after="0" w:afterAutospacing="0"/>
+        <w:rPr>
+          <w:rFonts w:ascii="Verdana" w:hAnsi="Verdana"/>
+          <w:color w:val="000000"/>
+          <w:sz w:val="18"/>
+          <w:szCs w:val="18"/>
+        </w:rPr>
+      </w:pPr>
+    </w:p>
+    <w:p>
+      <w:pPr>
+        <w:pStyle w:val="NormalWeb"/>
+        <w:spacing w:before="0" w:beforeAutospacing="0" w:after="0" w:afterAutospacing="0"/>
+        <w:rPr>
+          <w:rFonts w:ascii="Verdana" w:hAnsi="Verdana"/>
+          <w:b/>
+          <w:bCs/>
+          <w:color w:val="000000"/>
+          <w:sz w:val="18"/>
+          <w:szCs w:val="18"/>
+        </w:rPr>
+      </w:pPr>
+      <w:r>
+        <w:rPr>
+          <w:rFonts w:ascii="Verdana" w:hAnsi="Verdana"/>
+          <w:b/>
+          <w:bCs/>
+          <w:color w:val="000000"/>
+          <w:sz w:val="18"/>
+          <w:szCs w:val="18"/>
+        </w:rPr>
+        <w:t xml:space="preserve">PYNQ </w:t>
+      </w:r>
+      <w:r>
+        <w:rPr>
+          <w:rFonts w:ascii="Verdana" w:hAnsi="Verdana"/>
+          <w:b/>
+          <w:bCs/>
+          <w:color w:val="000000"/>
+          <w:sz w:val="18"/>
+          <w:szCs w:val="18"/>
+        </w:rPr>
+        <w:t>FPGA based Search and Rescue Drone</w:t>
+      </w:r>
+    </w:p>
+    <w:p>
+      <w:pPr>
+        <w:pStyle w:val="NormalWeb"/>
+        <w:spacing w:before="0" w:beforeAutospacing="0" w:after="0" w:afterAutospacing="0"/>
+        <w:rPr>
+          <w:rFonts w:ascii="Verdana" w:hAnsi="Verdana"/>
+          <w:color w:val="000000"/>
+          <w:sz w:val="18"/>
+          <w:szCs w:val="18"/>
+        </w:rPr>
+      </w:pPr>
+    </w:p>
+    <w:p>
+      <w:pPr>
+        <w:pStyle w:val="NormalWeb"/>
+        <w:spacing w:before="0" w:beforeAutospacing="0" w:after="0" w:afterAutospacing="0"/>
+        <w:rPr>
+          <w:rFonts w:ascii="Verdana" w:hAnsi="Verdana"/>
+          <w:color w:val="000000"/>
+          <w:sz w:val="18"/>
+          <w:szCs w:val="18"/>
+        </w:rPr>
+      </w:pPr>
+      <w:r>
+        <w:rPr>
+          <w:rFonts w:ascii="Verdana" w:hAnsi="Verdana"/>
+          <w:color w:val="000000"/>
+          <w:sz w:val="18"/>
+          <w:szCs w:val="18"/>
+        </w:rPr>
+        <w:t xml:space="preserve">This project was a four-member undergraduate senior design effort to develop a six-propeller search and rescue drone using a PYNQ FPGA-based </w:t>
+      </w:r>
+      <w:r>
+        <w:rPr>
+          <w:rFonts w:ascii="Verdana" w:hAnsi="Verdana"/>
+          <w:color w:val="000000"/>
+          <w:sz w:val="18"/>
+          <w:szCs w:val="18"/>
+        </w:rPr>
+        <w:t xml:space="preserve">flight </w:t>
+      </w:r>
+      <w:r>
+        <w:rPr>
+          <w:rFonts w:ascii="Verdana" w:hAnsi="Verdana"/>
+          <w:color w:val="000000"/>
+          <w:sz w:val="18"/>
+          <w:szCs w:val="18"/>
+        </w:rPr>
+        <w:t>control</w:t>
+      </w:r>
+      <w:r>
+        <w:rPr>
+          <w:rFonts w:ascii="Verdana" w:hAnsi="Verdana"/>
+          <w:color w:val="000000"/>
+          <w:sz w:val="18"/>
+          <w:szCs w:val="18"/>
+        </w:rPr>
+        <w:t>ler</w:t>
+      </w:r>
+      <w:r>
+        <w:rPr>
+          <w:rFonts w:ascii="Verdana" w:hAnsi="Verdana"/>
+          <w:color w:val="000000"/>
+          <w:sz w:val="18"/>
+          <w:szCs w:val="18"/>
+        </w:rPr>
+        <w:t xml:space="preserve">. The flight controller was designed using AMD’s Vitis High-Level Synthesis (HLS) tool targeting the programmable logic and software architecture of the PYNQ Z1 FPGA platform. The HLS design processed wireless </w:t>
+      </w:r>
+      <w:r>
+        <w:rPr>
+          <w:rFonts w:ascii="Verdana" w:hAnsi="Verdana"/>
+          <w:color w:val="000000"/>
+          <w:sz w:val="18"/>
+          <w:szCs w:val="18"/>
+        </w:rPr>
+        <w:t>remote-control</w:t>
+      </w:r>
+      <w:r>
+        <w:rPr>
+          <w:rFonts w:ascii="Verdana" w:hAnsi="Verdana"/>
+          <w:color w:val="000000"/>
+          <w:sz w:val="18"/>
+          <w:szCs w:val="18"/>
+        </w:rPr>
+        <w:t xml:space="preserve"> inputs using a transceiver integrated with the Zynq-7000 processor, generated PWM motor control signals, and interfaced with an onboard accelerometer for flight stability and control.</w:t>
+      </w:r>
+    </w:p>
+    <w:p>
+      <w:pPr>
+        <w:pStyle w:val="NormalWeb"/>
+        <w:spacing w:before="0" w:beforeAutospacing="0" w:after="0" w:afterAutospacing="0"/>
+        <w:rPr>
+          <w:rFonts w:ascii="Verdana" w:hAnsi="Verdana"/>
+          <w:color w:val="000000"/>
+          <w:sz w:val="18"/>
+          <w:szCs w:val="18"/>
+        </w:rPr>
+      </w:pPr>
+    </w:p>
+    <w:p>
+      <w:pPr>
+        <w:pStyle w:val="NormalWeb"/>
+        <w:spacing w:before="0" w:beforeAutospacing="0" w:after="0" w:afterAutospacing="0"/>
+        <w:rPr>
+          <w:rFonts w:ascii="Verdana" w:hAnsi="Verdana"/>
+          <w:color w:val="000000"/>
+          <w:sz w:val="18"/>
+          <w:szCs w:val="18"/>
+        </w:rPr>
+      </w:pPr>
+      <w:r>
+        <w:rPr>
+          <w:rFonts w:ascii="Verdana" w:hAnsi="Verdana"/>
+          <w:color w:val="000000"/>
+          <w:sz w:val="18"/>
+          <w:szCs w:val="18"/>
+        </w:rPr>
+        <w:t>My primary role on the project was developing Python software using the PYNQ framework to read remote control inputs and drive PWM signals to the brushless motors.</w:t>
+      </w:r>
+      <w:r>
+        <w:rPr>
+          <w:rFonts w:ascii="Verdana" w:hAnsi="Verdana"/>
+          <w:color w:val="000000"/>
+          <w:sz w:val="18"/>
+          <w:szCs w:val="18"/>
+        </w:rPr>
+        <w:t xml:space="preserve"> This software directly communicated with the hardware </w:t>
+      </w:r>
+      <w:r>
+        <w:rPr>
+          <w:rFonts w:ascii="Verdana" w:hAnsi="Verdana"/>
+          <w:color w:val="000000"/>
+          <w:sz w:val="18"/>
+          <w:szCs w:val="18"/>
+        </w:rPr>
+        <w:t>synthesized</w:t>
+      </w:r>
+      <w:r>
+        <w:rPr>
+          <w:rFonts w:ascii="Verdana" w:hAnsi="Verdana"/>
+          <w:color w:val="000000"/>
+          <w:sz w:val="18"/>
+          <w:szCs w:val="18"/>
+        </w:rPr>
+        <w:t xml:space="preserve"> PWM controllers through the Zynq 7000 SoC.</w:t>
+      </w:r>
+      <w:r>
+        <w:rPr>
+          <w:rFonts w:ascii="Verdana" w:hAnsi="Verdana"/>
+          <w:color w:val="000000"/>
+          <w:sz w:val="18"/>
+          <w:szCs w:val="18"/>
+        </w:rPr>
+        <w:t xml:space="preserve"> I also designed and assembled a small power distribution board to supply power to the onboard camera and search lights, while calculating voltage and current requirements to estimate total drone flight time</w:t>
+      </w:r>
+      <w:r>
+        <w:rPr>
+          <w:rFonts w:ascii="Verdana" w:hAnsi="Verdana"/>
+          <w:color w:val="000000"/>
+          <w:sz w:val="18"/>
+          <w:szCs w:val="18"/>
+        </w:rPr>
+        <w:t xml:space="preserve"> given a Lithium Polymer battery constraints</w:t>
+      </w:r>
+      <w:r>
+        <w:rPr>
+          <w:rFonts w:ascii="Verdana" w:hAnsi="Verdana"/>
+          <w:color w:val="000000"/>
+          <w:sz w:val="18"/>
+          <w:szCs w:val="18"/>
+        </w:rPr>
+        <w:t>.</w:t>
+      </w:r>
+    </w:p>
+    <w:p>
+      <w:pPr>
+        <w:pStyle w:val="NormalWeb"/>
+        <w:spacing w:before="0" w:beforeAutospacing="0" w:after="0" w:afterAutospacing="0"/>
+        <w:rPr>
+          <w:rFonts w:ascii="Verdana" w:hAnsi="Verdana"/>
+          <w:color w:val="000000"/>
+          <w:sz w:val="18"/>
+          <w:szCs w:val="18"/>
+        </w:rPr>
+      </w:pPr>
+    </w:p>
+    <w:p>
+      <w:pPr>
+        <w:pStyle w:val="NormalWeb"/>
+        <w:spacing w:before="0" w:beforeAutospacing="0" w:after="0" w:afterAutospacing="0"/>
+        <w:rPr>
+          <w:rFonts w:ascii="Verdana" w:hAnsi="Verdana"/>
+          <w:color w:val="000000"/>
+          <w:sz w:val="18"/>
+          <w:szCs w:val="18"/>
+        </w:rPr>
+      </w:pPr>
+      <w:r>
+        <w:rPr>
+          <w:rFonts w:ascii="Verdana" w:hAnsi="Verdana"/>
+          <w:color w:val="000000"/>
+          <w:sz w:val="18"/>
+          <w:szCs w:val="18"/>
+        </w:rPr>
+        <w:t xml:space="preserve">[Insert Picture] </w:t>
+      </w:r>
+    </w:p>
+    <w:p>
+      <w:pPr>
+        <w:pStyle w:val="NormalWeb"/>
+        <w:spacing w:before="0" w:beforeAutospacing="0" w:after="0" w:afterAutospacing="0"/>
+        <w:rPr>
+          <w:rFonts w:ascii="Verdana" w:hAnsi="Verdana"/>
+          <w:color w:val="000000"/>
+          <w:sz w:val="18"/>
+          <w:szCs w:val="18"/>
+        </w:rPr>
+      </w:pPr>
+    </w:p>
+    <w:p>
+      <w:pPr>
+        <w:pStyle w:val="NormalWeb"/>
+        <w:spacing w:before="0" w:beforeAutospacing="0" w:after="0" w:afterAutospacing="0"/>
+        <w:rPr>
+          <w:rFonts w:ascii="Verdana" w:hAnsi="Verdana"/>
+          <w:b/>
+          <w:bCs/>
+          <w:color w:val="000000"/>
+          <w:sz w:val="18"/>
+          <w:szCs w:val="18"/>
+        </w:rPr>
+      </w:pPr>
+      <w:r>
+        <w:rPr>
+          <w:rFonts w:ascii="Verdana" w:hAnsi="Verdana"/>
+          <w:b/>
+          <w:bCs/>
+          <w:color w:val="000000"/>
+          <w:sz w:val="18"/>
+          <w:szCs w:val="18"/>
+        </w:rPr>
+        <w:t xml:space="preserve">Graduate School: </w:t>
+      </w:r>
+    </w:p>
+    <w:p>
+      <w:pPr>
+        <w:pStyle w:val="NormalWeb"/>
+        <w:spacing w:before="0" w:beforeAutospacing="0" w:after="0" w:afterAutospacing="0"/>
+        <w:rPr>
+          <w:rFonts w:ascii="Verdana" w:hAnsi="Verdana"/>
+          <w:color w:val="000000"/>
+          <w:sz w:val="18"/>
+          <w:szCs w:val="18"/>
+        </w:rPr>
+      </w:pPr>
+    </w:p>
+    <w:p>
+      <w:pPr>
+        <w:pStyle w:val="NormalWeb"/>
+        <w:spacing w:before="0" w:beforeAutospacing="0" w:after="0" w:afterAutospacing="0"/>
+        <w:rPr>
+          <w:rFonts w:ascii="Verdana" w:hAnsi="Verdana"/>
+          <w:color w:val="000000"/>
+          <w:sz w:val="18"/>
+          <w:szCs w:val="18"/>
+        </w:rPr>
+      </w:pPr>
+      <w:r>
+        <w:rPr>
+          <w:rFonts w:ascii="Verdana" w:hAnsi="Verdana"/>
+          <w:color w:val="000000"/>
+          <w:sz w:val="18"/>
+          <w:szCs w:val="18"/>
+        </w:rPr>
+        <w:t xml:space="preserve">RapidLaneFPGA: </w:t>
+      </w:r>
+      <w:r>
+        <w:rPr>
+          <w:rFonts w:ascii="Verdana" w:hAnsi="Verdana"/>
+          <w:color w:val="000000"/>
+          <w:sz w:val="18"/>
+          <w:szCs w:val="18"/>
+        </w:rPr>
+        <w:t xml:space="preserve">FPGA </w:t>
+      </w:r>
+      <w:r>
+        <w:rPr>
+          <w:rFonts w:ascii="Verdana" w:hAnsi="Verdana"/>
+          <w:color w:val="000000"/>
+          <w:sz w:val="18"/>
+          <w:szCs w:val="18"/>
+        </w:rPr>
+        <w:t>DPU Based High Lane Segmentation</w:t>
+      </w:r>
+      <w:r>
+        <w:rPr>
+          <w:rFonts w:ascii="Verdana" w:hAnsi="Verdana"/>
+          <w:color w:val="000000"/>
+          <w:sz w:val="18"/>
+          <w:szCs w:val="18"/>
+        </w:rPr>
+        <w:t xml:space="preserve"> System</w:t>
+      </w:r>
+    </w:p>
+    <w:p>
+      <w:pPr>
+        <w:pStyle w:val="NormalWeb"/>
+        <w:spacing w:before="0" w:beforeAutospacing="0" w:after="0" w:afterAutospacing="0"/>
+        <w:rPr>
+          <w:color w:val="000000"/>
+          <w:sz w:val="22"/>
+          <w:szCs w:val="22"/>
+        </w:rPr>
+      </w:pPr>
+    </w:p>
+    <w:p>
+      <w:pPr>
+        <w:pStyle w:val="NormalWeb"/>
+        <w:spacing w:before="0" w:beforeAutospacing="0" w:after="0" w:afterAutospacing="0"/>
+        <w:rPr>
+          <w:color w:val="000000"/>
+          <w:sz w:val="22"/>
+          <w:szCs w:val="22"/>
+        </w:rPr>
+      </w:pPr>
+      <w:r>
+        <w:rPr>
+          <w:color w:val="000000"/>
+          <w:sz w:val="22"/>
+          <w:szCs w:val="22"/>
+        </w:rPr>
+        <w:t xml:space="preserve">RapidLaneFPGA completes a rapid implementation of a software – hardware co-design solution deploying a highway lane segmentation system running inference on Ultrascale+ FPGA Deep Processing Unit (DPU). The goal of the project is to develop a lane segmentation deep neural network model using a pretrained MobileNetV2 encoder and a custom segmentation head </w:t>
+      </w:r>
+      <w:r>
+        <w:rPr>
+          <w:color w:val="000000"/>
+          <w:sz w:val="22"/>
+          <w:szCs w:val="22"/>
+        </w:rPr>
+        <w:t xml:space="preserve">that delivers a binary map of where the highway lane is </w:t>
+      </w:r>
+      <w:r>
+        <w:rPr>
+          <w:color w:val="000000"/>
+          <w:sz w:val="22"/>
+          <w:szCs w:val="22"/>
+        </w:rPr>
+        <w:t>located with</w:t>
+      </w:r>
+      <w:r>
+        <w:rPr>
+          <w:color w:val="000000"/>
+          <w:sz w:val="22"/>
+          <w:szCs w:val="22"/>
+        </w:rPr>
+        <w:t>in a</w:t>
+      </w:r>
+      <w:r>
+        <w:rPr>
+          <w:color w:val="000000"/>
+          <w:sz w:val="22"/>
+          <w:szCs w:val="22"/>
+        </w:rPr>
+        <w:t xml:space="preserve">n </w:t>
+      </w:r>
+      <w:r>
+        <w:rPr>
+          <w:color w:val="000000"/>
+          <w:sz w:val="22"/>
+          <w:szCs w:val="22"/>
+        </w:rPr>
+        <w:t>224x224 image.</w:t>
+      </w:r>
+    </w:p>
+    <w:p>
+      <w:pPr>
+        <w:pStyle w:val="NormalWeb"/>
+        <w:spacing w:before="0" w:beforeAutospacing="0" w:after="0" w:afterAutospacing="0"/>
+        <w:rPr>
+          <w:color w:val="000000"/>
+          <w:sz w:val="22"/>
+          <w:szCs w:val="22"/>
+        </w:rPr>
+      </w:pPr>
+    </w:p>
+    <w:p>
+      <w:pPr>
+        <w:pStyle w:val="NormalWeb"/>
+        <w:spacing w:before="0" w:beforeAutospacing="0" w:after="0" w:afterAutospacing="0"/>
+        <w:rPr>
+          <w:color w:val="000000"/>
+          <w:sz w:val="22"/>
+          <w:szCs w:val="22"/>
+        </w:rPr>
+      </w:pPr>
+      <w:r>
+        <w:rPr>
+          <w:color w:val="000000"/>
+          <w:sz w:val="22"/>
+          <w:szCs w:val="22"/>
+        </w:rPr>
+        <w:t>After the software model is developed</w:t>
+      </w:r>
+      <w:r>
+        <w:rPr>
+          <w:color w:val="000000"/>
+          <w:sz w:val="22"/>
+          <w:szCs w:val="22"/>
+        </w:rPr>
+        <w:t xml:space="preserve">, </w:t>
+      </w:r>
+      <w:r>
+        <w:rPr>
+          <w:color w:val="000000"/>
+          <w:sz w:val="22"/>
+          <w:szCs w:val="22"/>
+        </w:rPr>
+        <w:t xml:space="preserve">the weights and biases from the PyTorch model </w:t>
+      </w:r>
+      <w:r>
+        <w:rPr>
+          <w:color w:val="000000"/>
+          <w:sz w:val="22"/>
+          <w:szCs w:val="22"/>
+        </w:rPr>
+        <w:t xml:space="preserve">are exported for </w:t>
+      </w:r>
+      <w:r>
+        <w:rPr>
+          <w:color w:val="000000"/>
+          <w:sz w:val="22"/>
+          <w:szCs w:val="22"/>
+        </w:rPr>
+        <w:t xml:space="preserve">the hardware implementation. The project used AMD’s Vitis AI workflow to quantize the weights and biases into an .xmodel to run on a Deep Processing Unit, a soft co-processor that is synthesized on an FPGA. The DPU is the key ingredient within this project to run real time inference of the lane segmentation neural network as it provides the compute capability </w:t>
+      </w:r>
+      <w:r>
+        <w:rPr>
+          <w:color w:val="000000"/>
+          <w:sz w:val="22"/>
+          <w:szCs w:val="22"/>
+        </w:rPr>
+        <w:t>using</w:t>
+      </w:r>
+      <w:r>
+        <w:rPr>
+          <w:color w:val="000000"/>
+          <w:sz w:val="22"/>
+          <w:szCs w:val="22"/>
+        </w:rPr>
+        <w:t xml:space="preserve"> INT8 representation</w:t>
+      </w:r>
+      <w:r>
+        <w:rPr>
+          <w:color w:val="000000"/>
+          <w:sz w:val="22"/>
+          <w:szCs w:val="22"/>
+        </w:rPr>
+        <w:t>.</w:t>
+      </w:r>
+    </w:p>
+    <w:p>
+      <w:pPr>
+        <w:pStyle w:val="NormalWeb"/>
+        <w:spacing w:before="0" w:beforeAutospacing="0" w:after="0" w:afterAutospacing="0"/>
+        <w:rPr>
+          <w:color w:val="000000"/>
+          <w:sz w:val="22"/>
+          <w:szCs w:val="22"/>
+        </w:rPr>
+      </w:pPr>
+    </w:p>
+    <w:p>
+      <w:pPr>
+        <w:pStyle w:val="NormalWeb"/>
+        <w:spacing w:before="0" w:beforeAutospacing="0" w:after="0" w:afterAutospacing="0"/>
+        <w:rPr>
+          <w:color w:val="000000"/>
+          <w:sz w:val="22"/>
+          <w:szCs w:val="22"/>
+        </w:rPr>
+      </w:pPr>
+      <w:r>
+        <w:rPr>
+          <w:color w:val="000000"/>
+          <w:sz w:val="22"/>
+          <w:szCs w:val="22"/>
+        </w:rPr>
+        <w:t xml:space="preserve">After the base design is synthesized, the project leveraged </w:t>
+      </w:r>
+      <w:r>
+        <w:rPr>
+          <w:color w:val="000000"/>
+          <w:sz w:val="22"/>
+          <w:szCs w:val="22"/>
+        </w:rPr>
+        <w:t>AMDS’s PYNQ SoC framework to interface with the ARM Cortex A59 processor via python programming to command and control the DPU hardware co-processor. During inference testing, the software boasts DICE accuracy score of 77.8% and a ZCU104 FPGA hardware boasts a DICE accuracy score of 77.10% on unseen test images. The hardware boasts an average of 10 frames per second with each frame taking an average of 100ms to process.</w:t>
+      </w:r>
+    </w:p>
+    <w:p>
+      <w:pPr>
+        <w:pStyle w:val="NormalWeb"/>
+        <w:spacing w:before="0" w:beforeAutospacing="0" w:after="0" w:afterAutospacing="0"/>
+        <w:rPr>
+          <w:color w:val="000000"/>
+          <w:sz w:val="22"/>
+          <w:szCs w:val="22"/>
+        </w:rPr>
+      </w:pPr>
+    </w:p>
+    <w:p>
+      <w:pPr>
+        <w:pStyle w:val="NormalWeb"/>
+        <w:rPr>
+          <w:b/>
+          <w:bCs/>
+        </w:rPr>
+      </w:pPr>
+      <w:r>
+        <w:rPr>
+          <w:color w:val="000000"/>
+          <w:sz w:val="22"/>
+          <w:szCs w:val="22"/>
+        </w:rPr>
+        <w:t xml:space="preserve">The significance of this work is the rapid turnaround from software development to hardware execution operating in near real-time, maintaining near software DICE accuracy scores. Following this same pipeline enables engineers to rapidly develop and test models on hardware for Autonomous Driver Assistance Systems (ADAS). The accuracy scores and FPS numbers provide rapid implementation and a </w:t>
+      </w:r>
+      <w:r>
+        <w:rPr>
+          <w:color w:val="000000"/>
+          <w:sz w:val="22"/>
+          <w:szCs w:val="22"/>
+        </w:rPr>
+        <w:lastRenderedPageBreak/>
+        <w:t>successful proof of concept for the entirety of this project.</w:t>
+      </w:r>
+      <w:r>
+        <w:rPr>
+          <w:color w:val="000000"/>
+          <w:sz w:val="22"/>
+          <w:szCs w:val="22"/>
+        </w:rPr>
+        <w:t xml:space="preserve"> Hardware Inference results can be viewed here: </w:t>
+      </w:r>
+      <w:r>
+        <w:rPr>
+          <w:b/>
+          <w:bCs/>
+        </w:rPr>
+        <w:t>https://youtu.be/UElMAv6r1II</w:t>
+      </w:r>
+    </w:p>
+    <w:p>
+      <w:pPr>
+        <w:pStyle w:val="NormalWeb"/>
+        <w:spacing w:before="0" w:beforeAutospacing="0" w:after="0" w:afterAutospacing="0"/>
+        <w:rPr>
+          <w:rFonts w:ascii="Verdana" w:hAnsi="Verdana"/>
+          <w:color w:val="000000"/>
+          <w:sz w:val="18"/>
+          <w:szCs w:val="18"/>
+        </w:rPr>
+      </w:pPr>
+    </w:p>
+    <w:p>
+      <w:pPr>
+        <w:pStyle w:val="NormalWeb"/>
+        <w:spacing w:before="0" w:beforeAutospacing="0" w:after="0" w:afterAutospacing="0"/>
+        <w:rPr>
+          <w:rFonts w:ascii="Verdana" w:hAnsi="Verdana"/>
+          <w:color w:val="000000"/>
+          <w:sz w:val="18"/>
+          <w:szCs w:val="18"/>
+        </w:rPr>
+      </w:pPr>
+    </w:p>
+    <w:p>
+      <w:pPr>
+        <w:pStyle w:val="NormalWeb"/>
+        <w:spacing w:before="0" w:beforeAutospacing="0" w:after="0" w:afterAutospacing="0"/>
+        <w:rPr>
+          <w:rFonts w:ascii="Verdana" w:hAnsi="Verdana"/>
+          <w:color w:val="000000"/>
+          <w:sz w:val="18"/>
+          <w:szCs w:val="18"/>
+        </w:rPr>
+      </w:pPr>
+      <w:r>
+        <w:rPr>
+          <w:rFonts w:ascii="Verdana" w:hAnsi="Verdana"/>
+          <w:color w:val="000000"/>
+          <w:sz w:val="18"/>
+          <w:szCs w:val="18"/>
+        </w:rPr>
+        <w:t xml:space="preserve">[Insert brag sheet] </w:t>
+      </w:r>
+    </w:p>
+    <w:p>
+      <w:pPr>
+        <w:pStyle w:val="NormalWeb"/>
+        <w:spacing w:before="0" w:beforeAutospacing="0" w:after="0" w:afterAutospacing="0"/>
+        <w:rPr>
+          <w:rFonts w:ascii="Verdana" w:hAnsi="Verdana"/>
+          <w:color w:val="000000"/>
+          <w:sz w:val="18"/>
+          <w:szCs w:val="18"/>
+        </w:rPr>
+      </w:pPr>
+    </w:p>
+    <w:p>
+      <w:pPr>
+        <w:pStyle w:val="NormalWeb"/>
+        <w:spacing w:before="0" w:beforeAutospacing="0" w:after="0" w:afterAutospacing="0"/>
+        <w:rPr>
+          <w:rFonts w:ascii="Verdana" w:hAnsi="Verdana"/>
+          <w:color w:val="000000"/>
+          <w:sz w:val="18"/>
+          <w:szCs w:val="18"/>
+        </w:rPr>
+      </w:pPr>
+      <w:r>
+        <w:rPr>
+          <w:rFonts w:ascii="Verdana" w:hAnsi="Verdana"/>
+          <w:color w:val="000000"/>
+          <w:sz w:val="18"/>
+          <w:szCs w:val="18"/>
+        </w:rPr>
+        <w:t>[insert video] ??</w:t>
+      </w:r>
+    </w:p>
+    <w:p>
+      <w:pPr>
+        <w:pStyle w:val="NormalWeb"/>
+        <w:spacing w:before="0" w:beforeAutospacing="0" w:after="0" w:afterAutospacing="0"/>
+        <w:rPr>
+          <w:rFonts w:ascii="Verdana" w:hAnsi="Verdana"/>
+          <w:color w:val="000000"/>
+          <w:sz w:val="18"/>
+          <w:szCs w:val="18"/>
+        </w:rPr>
+      </w:pPr>
+    </w:p>
+    <w:p>
+      <w:pPr>
+        <w:pStyle w:val="NormalWeb"/>
+        <w:spacing w:before="0" w:beforeAutospacing="0" w:after="0" w:afterAutospacing="0"/>
+        <w:rPr>
+          <w:rFonts w:ascii="Verdana" w:hAnsi="Verdana"/>
+          <w:color w:val="000000"/>
+          <w:sz w:val="18"/>
+          <w:szCs w:val="18"/>
+        </w:rPr>
+      </w:pPr>
+    </w:p>
+    <w:p>
+      <w:pPr>
+        <w:pStyle w:val="NormalWeb"/>
+        <w:spacing w:before="0" w:beforeAutospacing="0" w:after="0" w:afterAutospacing="0"/>
+        <w:rPr>
+          <w:rFonts w:ascii="Verdana" w:hAnsi="Verdana"/>
+          <w:color w:val="000000"/>
+          <w:sz w:val="18"/>
+          <w:szCs w:val="18"/>
+        </w:rPr>
+      </w:pPr>
+    </w:p>
+    <w:p>
+      <w:pPr>
+        <w:pStyle w:val="NormalWeb"/>
+        <w:spacing w:before="0" w:beforeAutospacing="0" w:after="0" w:afterAutospacing="0"/>
+        <w:rPr>
+          <w:rFonts w:ascii="Verdana" w:hAnsi="Verdana"/>
+          <w:color w:val="EE0000"/>
+          <w:sz w:val="18"/>
+          <w:szCs w:val="18"/>
+        </w:rPr>
+      </w:pPr>
+      <w:r>
+        <w:rPr>
+          <w:rFonts w:ascii="Verdana" w:hAnsi="Verdana"/>
+          <w:color w:val="EE0000"/>
+          <w:sz w:val="18"/>
+          <w:szCs w:val="18"/>
+        </w:rPr>
+        <w:t xml:space="preserve">EE 278: Digital Design for AI/ML </w:t>
+      </w:r>
+    </w:p>
+    <w:p>
+      <w:pPr>
+        <w:pStyle w:val="NormalWeb"/>
+        <w:spacing w:before="0" w:beforeAutospacing="0" w:after="0" w:afterAutospacing="0"/>
+        <w:rPr>
+          <w:rFonts w:ascii="Verdana" w:hAnsi="Verdana"/>
+          <w:color w:val="000000"/>
+          <w:sz w:val="18"/>
+          <w:szCs w:val="18"/>
+        </w:rPr>
+      </w:pPr>
+    </w:p>
+    <w:p>
+      <w:pPr>
+        <w:pStyle w:val="NormalWeb"/>
+        <w:spacing w:before="0" w:beforeAutospacing="0" w:after="0" w:afterAutospacing="0"/>
+        <w:rPr>
+          <w:rFonts w:ascii="Verdana" w:hAnsi="Verdana"/>
+          <w:b/>
+          <w:bCs/>
+          <w:color w:val="000000"/>
+          <w:sz w:val="18"/>
+          <w:szCs w:val="18"/>
+        </w:rPr>
+      </w:pPr>
+      <w:r>
+        <w:rPr>
+          <w:rFonts w:ascii="Verdana" w:hAnsi="Verdana"/>
+          <w:b/>
+          <w:bCs/>
+          <w:color w:val="000000"/>
+          <w:sz w:val="18"/>
+          <w:szCs w:val="18"/>
+        </w:rPr>
+        <w:t>FPGA Based LENET Neural Network for Digit Recognition</w:t>
+      </w:r>
+    </w:p>
+    <w:p>
+      <w:pPr>
+        <w:pStyle w:val="NormalWeb"/>
+        <w:spacing w:before="0" w:beforeAutospacing="0" w:after="0" w:afterAutospacing="0"/>
+        <w:rPr>
+          <w:rFonts w:ascii="Verdana" w:hAnsi="Verdana"/>
+          <w:b/>
+          <w:bCs/>
+          <w:color w:val="000000"/>
+          <w:sz w:val="18"/>
+          <w:szCs w:val="18"/>
+        </w:rPr>
+      </w:pPr>
+    </w:p>
+    <w:p>
+      <w:pPr>
+        <w:pStyle w:val="NormalWeb"/>
+        <w:spacing w:before="0" w:beforeAutospacing="0" w:after="0" w:afterAutospacing="0"/>
+        <w:rPr>
+          <w:rFonts w:ascii="Verdana" w:hAnsi="Verdana"/>
+          <w:color w:val="000000"/>
+          <w:sz w:val="18"/>
+          <w:szCs w:val="18"/>
+        </w:rPr>
+      </w:pPr>
+      <w:r>
+        <w:rPr>
+          <w:rFonts w:ascii="Verdana" w:hAnsi="Verdana"/>
+          <w:color w:val="000000"/>
+          <w:sz w:val="18"/>
+          <w:szCs w:val="18"/>
+        </w:rPr>
+        <w:t>This project demonstrates hardware-software co-design by training a LeNet-based neural network in Python using the MNIST dataset and implementing FPGA-based inference using High-Level Synthesis (HLS). The workflow involved training the neural network, extracting model weights and biases, and exporting them as header files for use in the HLS hardware implementation.</w:t>
+      </w:r>
+      <w:r>
+        <w:rPr>
+          <w:rFonts w:ascii="Verdana" w:hAnsi="Verdana"/>
+          <w:color w:val="000000"/>
+          <w:sz w:val="18"/>
+          <w:szCs w:val="18"/>
+        </w:rPr>
+        <w:t xml:space="preserve"> </w:t>
+      </w:r>
+      <w:r>
+        <w:rPr>
+          <w:rFonts w:ascii="Verdana" w:hAnsi="Verdana"/>
+          <w:color w:val="000000"/>
+          <w:sz w:val="18"/>
+          <w:szCs w:val="18"/>
+        </w:rPr>
+        <w:t>The arithmetic outputs from each neural network layer were saved as reference data to verify convolutional layer results within the HLS simulation environment. C++ code written within the HLS tool replicated the convolutional layers from the Python implementation and used the reference data to validate each layer’s output.</w:t>
+      </w:r>
+    </w:p>
+    <w:p>
+      <w:pPr>
+        <w:pStyle w:val="NormalWeb"/>
+        <w:spacing w:before="0" w:beforeAutospacing="0" w:after="0" w:afterAutospacing="0"/>
+        <w:rPr>
+          <w:rFonts w:ascii="Verdana" w:hAnsi="Verdana"/>
+          <w:color w:val="000000"/>
+          <w:sz w:val="18"/>
+          <w:szCs w:val="18"/>
+        </w:rPr>
+      </w:pPr>
+    </w:p>
+    <w:p>
+      <w:pPr>
+        <w:pStyle w:val="NormalWeb"/>
+        <w:spacing w:before="0" w:beforeAutospacing="0" w:after="0" w:afterAutospacing="0"/>
+        <w:rPr>
+          <w:rFonts w:ascii="Verdana" w:hAnsi="Verdana"/>
+          <w:color w:val="000000"/>
+          <w:sz w:val="18"/>
+          <w:szCs w:val="18"/>
+        </w:rPr>
+      </w:pPr>
+      <w:r>
+        <w:rPr>
+          <w:rFonts w:ascii="Verdana" w:hAnsi="Verdana"/>
+          <w:color w:val="000000"/>
+          <w:sz w:val="18"/>
+          <w:szCs w:val="18"/>
+        </w:rPr>
+        <w:t>Once the module was simulated and validated for each digit, the hardware was synthesized and exported as an IP to be instantiated within AMD’s Vivado. The IP was instantiated within a block design tool to work in tandem with a  ZYNQ 7000 processor communicated via AXI bus architecture. The pragmas within the HLS tool allowed the synthesizer tool to map to the peripherals within the PYNQ Z1 FPGA development board to external peripherals on the board for command control and storing of the inference output. Using the PYNQ S</w:t>
+      </w:r>
+      <w:r>
+        <w:rPr>
+          <w:rFonts w:ascii="Verdana" w:hAnsi="Verdana"/>
+          <w:color w:val="000000"/>
+          <w:sz w:val="18"/>
+          <w:szCs w:val="18"/>
+        </w:rPr>
+        <w:t>o</w:t>
+      </w:r>
+      <w:r>
+        <w:rPr>
+          <w:rFonts w:ascii="Verdana" w:hAnsi="Verdana"/>
+          <w:color w:val="000000"/>
+          <w:sz w:val="18"/>
+          <w:szCs w:val="18"/>
+        </w:rPr>
+        <w:t>C framework, a successful test of commanding the S</w:t>
+      </w:r>
+      <w:r>
+        <w:rPr>
+          <w:rFonts w:ascii="Verdana" w:hAnsi="Verdana"/>
+          <w:color w:val="000000"/>
+          <w:sz w:val="18"/>
+          <w:szCs w:val="18"/>
+        </w:rPr>
+        <w:t>o</w:t>
+      </w:r>
+      <w:r>
+        <w:rPr>
+          <w:rFonts w:ascii="Verdana" w:hAnsi="Verdana"/>
+          <w:color w:val="000000"/>
+          <w:sz w:val="18"/>
+          <w:szCs w:val="18"/>
+        </w:rPr>
+        <w:t>C to run inference of the custom RTL and successfully predicted all numbers zero through nine within the FPGA fabric. This project was tested on both AMD ZYNQ 7000 and Ultrascale+ devices.</w:t>
+      </w:r>
+    </w:p>
+    <w:p>
+      <w:pPr>
+        <w:pStyle w:val="NormalWeb"/>
+        <w:spacing w:before="0" w:beforeAutospacing="0" w:after="0" w:afterAutospacing="0"/>
+        <w:rPr>
+          <w:rFonts w:ascii="Verdana" w:hAnsi="Verdana"/>
+          <w:color w:val="000000"/>
+          <w:sz w:val="18"/>
+          <w:szCs w:val="18"/>
+        </w:rPr>
+      </w:pPr>
+    </w:p>
+    <w:p>
+      <w:pPr>
+        <w:pStyle w:val="NormalWeb"/>
+        <w:spacing w:before="0" w:beforeAutospacing="0" w:after="0" w:afterAutospacing="0"/>
+        <w:rPr>
+          <w:rFonts w:ascii="Verdana" w:hAnsi="Verdana"/>
+          <w:color w:val="000000"/>
+          <w:sz w:val="18"/>
+          <w:szCs w:val="18"/>
+        </w:rPr>
+      </w:pPr>
+      <w:r>
+        <w:rPr>
+          <w:rFonts w:ascii="Verdana" w:hAnsi="Verdana"/>
+          <w:color w:val="000000"/>
+          <w:sz w:val="18"/>
+          <w:szCs w:val="18"/>
+        </w:rPr>
+        <w:t>[insert picture here]</w:t>
+      </w:r>
+    </w:p>
+    <w:p>
+      <w:pPr>
+        <w:pStyle w:val="NormalWeb"/>
+        <w:spacing w:before="0" w:beforeAutospacing="0" w:after="0" w:afterAutospacing="0"/>
+        <w:rPr>
+          <w:rFonts w:ascii="Verdana" w:hAnsi="Verdana"/>
+          <w:b/>
+          <w:bCs/>
+          <w:color w:val="000000"/>
+          <w:sz w:val="18"/>
+          <w:szCs w:val="18"/>
+        </w:rPr>
+      </w:pPr>
+    </w:p>
+    <w:p>
+      <w:pPr>
+        <w:pStyle w:val="NormalWeb"/>
+        <w:spacing w:before="0" w:beforeAutospacing="0" w:after="0" w:afterAutospacing="0"/>
+        <w:rPr>
+          <w:rFonts w:ascii="Verdana" w:hAnsi="Verdana"/>
+          <w:b/>
+          <w:bCs/>
+          <w:color w:val="000000"/>
+          <w:sz w:val="18"/>
+          <w:szCs w:val="18"/>
+        </w:rPr>
+      </w:pPr>
+    </w:p>
+    <w:p>
+      <w:pPr>
+        <w:pStyle w:val="NormalWeb"/>
+        <w:spacing w:before="0" w:beforeAutospacing="0" w:after="0" w:afterAutospacing="0"/>
+        <w:rPr>
+          <w:rFonts w:ascii="Verdana" w:hAnsi="Verdana"/>
+          <w:b/>
+          <w:bCs/>
+          <w:color w:val="000000"/>
+          <w:sz w:val="18"/>
+          <w:szCs w:val="18"/>
+        </w:rPr>
+      </w:pPr>
+    </w:p>
+    <w:p>
+      <w:pPr>
+        <w:pStyle w:val="NormalWeb"/>
+        <w:spacing w:before="0" w:beforeAutospacing="0" w:after="0" w:afterAutospacing="0"/>
+        <w:rPr>
+          <w:rFonts w:ascii="Verdana" w:hAnsi="Verdana"/>
+          <w:b/>
+          <w:bCs/>
+          <w:color w:val="000000"/>
+          <w:sz w:val="18"/>
+          <w:szCs w:val="18"/>
+        </w:rPr>
+      </w:pPr>
+    </w:p>
+    <w:p>
+      <w:pPr>
+        <w:pStyle w:val="NormalWeb"/>
+        <w:spacing w:before="0" w:beforeAutospacing="0" w:after="0" w:afterAutospacing="0"/>
+        <w:rPr>
+          <w:rFonts w:ascii="Verdana" w:hAnsi="Verdana"/>
+          <w:color w:val="000000"/>
+          <w:sz w:val="18"/>
+          <w:szCs w:val="18"/>
+        </w:rPr>
+      </w:pPr>
+    </w:p>
+    <w:p>
+      <w:pPr>
+        <w:pStyle w:val="NormalWeb"/>
+        <w:spacing w:before="0" w:beforeAutospacing="0" w:after="0" w:afterAutospacing="0"/>
+        <w:rPr>
+          <w:rFonts w:ascii="Verdana" w:hAnsi="Verdana"/>
+          <w:color w:val="000000"/>
+          <w:sz w:val="18"/>
+          <w:szCs w:val="18"/>
+        </w:rPr>
+      </w:pPr>
+    </w:p>
+    <w:p>
+      <w:pPr>
+        <w:pStyle w:val="NormalWeb"/>
+        <w:spacing w:before="0" w:beforeAutospacing="0" w:after="0" w:afterAutospacing="0"/>
+        <w:rPr>
+          <w:rFonts w:ascii="Verdana" w:hAnsi="Verdana"/>
+          <w:color w:val="EE0000"/>
+          <w:sz w:val="18"/>
+          <w:szCs w:val="18"/>
+        </w:rPr>
+      </w:pPr>
+      <w:r>
+        <w:rPr>
+          <w:rFonts w:ascii="Verdana" w:hAnsi="Verdana"/>
+          <w:color w:val="EE0000"/>
+          <w:sz w:val="18"/>
+          <w:szCs w:val="18"/>
+        </w:rPr>
+        <w:t xml:space="preserve">EE 277 Embedded SOC Design </w:t>
+      </w:r>
+    </w:p>
+    <w:p>
+      <w:pPr>
+        <w:pStyle w:val="NormalWeb"/>
+        <w:spacing w:before="0" w:beforeAutospacing="0" w:after="0" w:afterAutospacing="0"/>
+        <w:rPr>
+          <w:rFonts w:ascii="Verdana" w:hAnsi="Verdana"/>
+          <w:color w:val="000000"/>
+          <w:sz w:val="18"/>
+          <w:szCs w:val="18"/>
+        </w:rPr>
+      </w:pPr>
+    </w:p>
+    <w:p>
+      <w:pPr>
+        <w:pStyle w:val="NormalWeb"/>
+        <w:spacing w:before="0" w:beforeAutospacing="0" w:after="0" w:afterAutospacing="0"/>
+        <w:rPr>
+          <w:rFonts w:ascii="Verdana" w:hAnsi="Verdana"/>
+          <w:b/>
+          <w:bCs/>
+          <w:color w:val="000000"/>
+          <w:sz w:val="18"/>
+          <w:szCs w:val="18"/>
+        </w:rPr>
+      </w:pPr>
+      <w:r>
+        <w:rPr>
+          <w:rFonts w:ascii="Verdana" w:hAnsi="Verdana"/>
+          <w:b/>
+          <w:bCs/>
+          <w:color w:val="000000"/>
+          <w:sz w:val="18"/>
+          <w:szCs w:val="18"/>
+        </w:rPr>
+        <w:t xml:space="preserve">FPGA </w:t>
+      </w:r>
+      <w:r>
+        <w:rPr>
+          <w:rFonts w:ascii="Verdana" w:hAnsi="Verdana"/>
+          <w:b/>
+          <w:bCs/>
+          <w:color w:val="000000"/>
+          <w:sz w:val="18"/>
+          <w:szCs w:val="18"/>
+        </w:rPr>
+        <w:t>Based</w:t>
+      </w:r>
+      <w:r>
+        <w:rPr>
+          <w:rFonts w:ascii="Verdana" w:hAnsi="Verdana"/>
+          <w:b/>
+          <w:bCs/>
+          <w:color w:val="000000"/>
+          <w:sz w:val="18"/>
+          <w:szCs w:val="18"/>
+        </w:rPr>
+        <w:t xml:space="preserve"> Smart Home Security Systems</w:t>
+      </w:r>
+    </w:p>
+    <w:p>
+      <w:pPr>
+        <w:pStyle w:val="NormalWeb"/>
+        <w:spacing w:before="0" w:beforeAutospacing="0" w:after="0" w:afterAutospacing="0"/>
+        <w:rPr>
+          <w:rFonts w:ascii="Verdana" w:hAnsi="Verdana"/>
+          <w:color w:val="000000"/>
+          <w:sz w:val="18"/>
+          <w:szCs w:val="18"/>
+        </w:rPr>
+      </w:pPr>
+    </w:p>
+    <w:p>
+      <w:pPr>
+        <w:pStyle w:val="NormalWeb"/>
+        <w:spacing w:before="0" w:beforeAutospacing="0" w:after="0" w:afterAutospacing="0"/>
+        <w:rPr>
+          <w:rFonts w:ascii="Verdana" w:hAnsi="Verdana"/>
+          <w:color w:val="000000"/>
+          <w:sz w:val="18"/>
+          <w:szCs w:val="18"/>
+        </w:rPr>
+      </w:pPr>
+      <w:r>
+        <w:rPr>
+          <w:rFonts w:ascii="Verdana" w:hAnsi="Verdana"/>
+          <w:color w:val="000000"/>
+          <w:sz w:val="18"/>
+          <w:szCs w:val="18"/>
+        </w:rPr>
+        <w:t xml:space="preserve">This project </w:t>
+      </w:r>
+      <w:r>
+        <w:rPr>
+          <w:rFonts w:ascii="Verdana" w:hAnsi="Verdana"/>
+          <w:color w:val="000000"/>
+          <w:sz w:val="18"/>
+          <w:szCs w:val="18"/>
+        </w:rPr>
+        <w:t xml:space="preserve">highlights the paring of custom RTL written in Verilog that interfaces a MIPI CSI protocol camera module, numeric keypad, ZYNQ 7000 processor </w:t>
+      </w:r>
+      <w:r>
+        <w:rPr>
+          <w:rFonts w:ascii="Verdana" w:hAnsi="Verdana"/>
+          <w:color w:val="000000"/>
+          <w:sz w:val="18"/>
+          <w:szCs w:val="18"/>
+        </w:rPr>
+        <w:t xml:space="preserve">and HDMI </w:t>
+      </w:r>
+      <w:r>
+        <w:rPr>
+          <w:rFonts w:ascii="Verdana" w:hAnsi="Verdana"/>
+          <w:color w:val="000000"/>
+          <w:sz w:val="18"/>
+          <w:szCs w:val="18"/>
+        </w:rPr>
+        <w:t>interface</w:t>
+      </w:r>
+      <w:r>
+        <w:rPr>
+          <w:rFonts w:ascii="Verdana" w:hAnsi="Verdana"/>
+          <w:color w:val="000000"/>
+          <w:sz w:val="18"/>
+          <w:szCs w:val="18"/>
+        </w:rPr>
+        <w:t xml:space="preserve"> output all within a ZYBO Z7 FPGA development board. </w:t>
+      </w:r>
+    </w:p>
+    <w:p>
+      <w:pPr>
+        <w:pStyle w:val="NormalWeb"/>
+        <w:spacing w:before="0" w:beforeAutospacing="0" w:after="0" w:afterAutospacing="0"/>
+        <w:rPr>
+          <w:rFonts w:ascii="Verdana" w:hAnsi="Verdana"/>
+          <w:color w:val="000000"/>
+          <w:sz w:val="18"/>
+          <w:szCs w:val="18"/>
+        </w:rPr>
+      </w:pPr>
+    </w:p>
+    <w:p>
+      <w:pPr>
+        <w:pStyle w:val="NormalWeb"/>
+        <w:spacing w:before="0" w:beforeAutospacing="0" w:after="0" w:afterAutospacing="0"/>
+        <w:rPr>
+          <w:rFonts w:ascii="Verdana" w:hAnsi="Verdana"/>
+          <w:color w:val="000000"/>
+          <w:sz w:val="18"/>
+          <w:szCs w:val="18"/>
+        </w:rPr>
+      </w:pPr>
+      <w:r>
+        <w:rPr>
+          <w:rFonts w:ascii="Verdana" w:hAnsi="Verdana"/>
+          <w:color w:val="000000"/>
+          <w:sz w:val="18"/>
+          <w:szCs w:val="18"/>
+        </w:rPr>
+        <w:t xml:space="preserve">The scope of the project included creating a smart home security system that logs camera footage of those who </w:t>
+      </w:r>
+      <w:r>
+        <w:rPr>
+          <w:rFonts w:ascii="Verdana" w:hAnsi="Verdana"/>
+          <w:color w:val="000000"/>
+          <w:sz w:val="18"/>
+          <w:szCs w:val="18"/>
+        </w:rPr>
+        <w:t xml:space="preserve">need to </w:t>
+      </w:r>
+      <w:r>
+        <w:rPr>
+          <w:rFonts w:ascii="Verdana" w:hAnsi="Verdana"/>
+          <w:color w:val="000000"/>
+          <w:sz w:val="18"/>
+          <w:szCs w:val="18"/>
+        </w:rPr>
+        <w:t xml:space="preserve">access an entry </w:t>
+      </w:r>
+      <w:r>
+        <w:rPr>
+          <w:rFonts w:ascii="Verdana" w:hAnsi="Verdana"/>
+          <w:color w:val="000000"/>
+          <w:sz w:val="18"/>
+          <w:szCs w:val="18"/>
+        </w:rPr>
+        <w:t>point</w:t>
+      </w:r>
+      <w:r>
+        <w:rPr>
+          <w:rFonts w:ascii="Verdana" w:hAnsi="Verdana"/>
+          <w:color w:val="000000"/>
+          <w:sz w:val="18"/>
+          <w:szCs w:val="18"/>
+        </w:rPr>
+        <w:t xml:space="preserve"> via a keypad and captures camera footage of both successful and non</w:t>
+      </w:r>
+      <w:r>
+        <w:rPr>
+          <w:rFonts w:ascii="Verdana" w:hAnsi="Verdana"/>
+          <w:color w:val="000000"/>
+          <w:sz w:val="18"/>
+          <w:szCs w:val="18"/>
+        </w:rPr>
+        <w:t>-</w:t>
+      </w:r>
+      <w:r>
+        <w:rPr>
+          <w:rFonts w:ascii="Verdana" w:hAnsi="Verdana"/>
+          <w:color w:val="000000"/>
+          <w:sz w:val="18"/>
+          <w:szCs w:val="18"/>
+        </w:rPr>
+        <w:t>successful entries.</w:t>
+      </w:r>
+      <w:r>
+        <w:rPr>
+          <w:rFonts w:ascii="Verdana" w:hAnsi="Verdana"/>
+          <w:color w:val="000000"/>
+          <w:sz w:val="18"/>
+          <w:szCs w:val="18"/>
+        </w:rPr>
+        <w:t xml:space="preserve"> </w:t>
+      </w:r>
+      <w:r>
+        <w:rPr>
+          <w:rFonts w:ascii="Verdana" w:hAnsi="Verdana"/>
+          <w:color w:val="000000"/>
+          <w:sz w:val="18"/>
+          <w:szCs w:val="18"/>
+        </w:rPr>
+        <w:t>The system</w:t>
+      </w:r>
+      <w:r>
+        <w:rPr>
+          <w:rFonts w:ascii="Verdana" w:hAnsi="Verdana"/>
+          <w:color w:val="000000"/>
+          <w:sz w:val="18"/>
+          <w:szCs w:val="18"/>
+        </w:rPr>
+        <w:t xml:space="preserve"> </w:t>
+      </w:r>
+      <w:r>
+        <w:rPr>
+          <w:rFonts w:ascii="Verdana" w:hAnsi="Verdana"/>
+          <w:color w:val="000000"/>
+          <w:sz w:val="18"/>
+          <w:szCs w:val="18"/>
+        </w:rPr>
+        <w:t xml:space="preserve">prompts </w:t>
+      </w:r>
+      <w:r>
+        <w:rPr>
+          <w:rFonts w:ascii="Verdana" w:hAnsi="Verdana"/>
+          <w:color w:val="000000"/>
+          <w:sz w:val="18"/>
+          <w:szCs w:val="18"/>
+        </w:rPr>
+        <w:t xml:space="preserve">the user to enter </w:t>
+      </w:r>
+      <w:r>
+        <w:rPr>
+          <w:rFonts w:ascii="Verdana" w:hAnsi="Verdana"/>
+          <w:color w:val="000000"/>
+          <w:sz w:val="18"/>
+          <w:szCs w:val="18"/>
+        </w:rPr>
+        <w:t xml:space="preserve">a </w:t>
+      </w:r>
+      <w:r>
+        <w:rPr>
+          <w:rFonts w:ascii="Verdana" w:hAnsi="Verdana"/>
+          <w:color w:val="000000"/>
+          <w:sz w:val="18"/>
+          <w:szCs w:val="18"/>
+        </w:rPr>
+        <w:t xml:space="preserve">correct code </w:t>
+      </w:r>
+      <w:r>
+        <w:rPr>
+          <w:rFonts w:ascii="Verdana" w:hAnsi="Verdana"/>
+          <w:color w:val="000000"/>
+          <w:sz w:val="18"/>
+          <w:szCs w:val="18"/>
+        </w:rPr>
+        <w:t xml:space="preserve">via a terminal </w:t>
+      </w:r>
+      <w:r>
+        <w:rPr>
+          <w:rFonts w:ascii="Verdana" w:hAnsi="Verdana"/>
+          <w:color w:val="000000"/>
+          <w:sz w:val="18"/>
+          <w:szCs w:val="18"/>
+        </w:rPr>
+        <w:t xml:space="preserve">for access. If the user </w:t>
+      </w:r>
+      <w:r>
+        <w:rPr>
+          <w:rFonts w:ascii="Verdana" w:hAnsi="Verdana"/>
+          <w:color w:val="000000"/>
+          <w:sz w:val="18"/>
+          <w:szCs w:val="18"/>
+        </w:rPr>
+        <w:t>enters</w:t>
+      </w:r>
+      <w:r>
+        <w:rPr>
+          <w:rFonts w:ascii="Verdana" w:hAnsi="Verdana"/>
+          <w:color w:val="000000"/>
+          <w:sz w:val="18"/>
+          <w:szCs w:val="18"/>
+        </w:rPr>
+        <w:t xml:space="preserve"> the correct code, a capture of the </w:t>
+      </w:r>
+      <w:r>
+        <w:rPr>
+          <w:rFonts w:ascii="Verdana" w:hAnsi="Verdana"/>
+          <w:color w:val="000000"/>
+          <w:sz w:val="18"/>
+          <w:szCs w:val="18"/>
+        </w:rPr>
+        <w:t xml:space="preserve">current camera feed </w:t>
+      </w:r>
+      <w:r>
+        <w:rPr>
+          <w:rFonts w:ascii="Verdana" w:hAnsi="Verdana"/>
+          <w:color w:val="000000"/>
+          <w:sz w:val="18"/>
+          <w:szCs w:val="18"/>
+        </w:rPr>
+        <w:t xml:space="preserve">is </w:t>
+      </w:r>
+      <w:r>
+        <w:rPr>
+          <w:rFonts w:ascii="Verdana" w:hAnsi="Verdana"/>
+          <w:color w:val="000000"/>
+          <w:sz w:val="18"/>
+          <w:szCs w:val="18"/>
+        </w:rPr>
+        <w:t xml:space="preserve">stored in </w:t>
+      </w:r>
+      <w:proofErr w:type="gramStart"/>
+      <w:r>
+        <w:rPr>
+          <w:rFonts w:ascii="Verdana" w:hAnsi="Verdana"/>
+          <w:color w:val="000000"/>
+          <w:sz w:val="18"/>
+          <w:szCs w:val="18"/>
+        </w:rPr>
+        <w:t>DDR</w:t>
+      </w:r>
+      <w:proofErr w:type="gramEnd"/>
+      <w:r>
+        <w:rPr>
+          <w:rFonts w:ascii="Verdana" w:hAnsi="Verdana"/>
+          <w:color w:val="000000"/>
+          <w:sz w:val="18"/>
+          <w:szCs w:val="18"/>
+        </w:rPr>
+        <w:t xml:space="preserve"> and a green hue is applied</w:t>
+      </w:r>
+      <w:r>
+        <w:rPr>
+          <w:rFonts w:ascii="Verdana" w:hAnsi="Verdana"/>
+          <w:color w:val="000000"/>
+          <w:sz w:val="18"/>
+          <w:szCs w:val="18"/>
+        </w:rPr>
+        <w:t xml:space="preserve"> to the image</w:t>
+      </w:r>
+      <w:r>
+        <w:rPr>
+          <w:rFonts w:ascii="Verdana" w:hAnsi="Verdana"/>
+          <w:color w:val="000000"/>
+          <w:sz w:val="18"/>
+          <w:szCs w:val="18"/>
+        </w:rPr>
+        <w:t xml:space="preserve">. Alternatively, if the user enters an incorrect code, the system will </w:t>
+      </w:r>
+      <w:r>
+        <w:rPr>
+          <w:rFonts w:ascii="Verdana" w:hAnsi="Verdana"/>
+          <w:color w:val="000000"/>
+          <w:sz w:val="18"/>
+          <w:szCs w:val="18"/>
+        </w:rPr>
+        <w:t>capture the current camera feed</w:t>
+      </w:r>
+      <w:r>
+        <w:rPr>
+          <w:rFonts w:ascii="Verdana" w:hAnsi="Verdana"/>
+          <w:color w:val="000000"/>
+          <w:sz w:val="18"/>
+          <w:szCs w:val="18"/>
+        </w:rPr>
+        <w:t>, log the incorrect code attempt, and overlay a red hue over the image. The entries of both types of attempts are ultimately stored in DDR and can be monitored by an end</w:t>
+      </w:r>
+      <w:r>
+        <w:rPr>
+          <w:rFonts w:ascii="Verdana" w:hAnsi="Verdana"/>
+          <w:color w:val="000000"/>
+          <w:sz w:val="18"/>
+          <w:szCs w:val="18"/>
+        </w:rPr>
+        <w:t>-</w:t>
+      </w:r>
+      <w:r>
+        <w:rPr>
+          <w:rFonts w:ascii="Verdana" w:hAnsi="Verdana"/>
+          <w:color w:val="000000"/>
+          <w:sz w:val="18"/>
+          <w:szCs w:val="18"/>
+        </w:rPr>
+        <w:t xml:space="preserve">system user. </w:t>
+      </w:r>
+    </w:p>
+    <w:p>
+      <w:pPr>
+        <w:pStyle w:val="NormalWeb"/>
+        <w:spacing w:before="0" w:beforeAutospacing="0" w:after="0" w:afterAutospacing="0"/>
+        <w:rPr>
+          <w:rFonts w:ascii="Verdana" w:hAnsi="Verdana"/>
+          <w:color w:val="000000"/>
+          <w:sz w:val="18"/>
+          <w:szCs w:val="18"/>
+        </w:rPr>
+      </w:pPr>
+    </w:p>
+    <w:p>
+      <w:pPr>
+        <w:pStyle w:val="NormalWeb"/>
+        <w:spacing w:before="0" w:beforeAutospacing="0" w:after="0" w:afterAutospacing="0"/>
+        <w:rPr>
+          <w:rFonts w:ascii="Verdana" w:hAnsi="Verdana"/>
+          <w:color w:val="000000"/>
+          <w:sz w:val="18"/>
+          <w:szCs w:val="18"/>
+        </w:rPr>
+      </w:pPr>
+      <w:r>
+        <w:rPr>
+          <w:rFonts w:ascii="Verdana" w:hAnsi="Verdana"/>
+          <w:color w:val="000000"/>
+          <w:sz w:val="18"/>
+          <w:szCs w:val="18"/>
+        </w:rPr>
+        <w:lastRenderedPageBreak/>
+        <w:t>The team implemented this scope on the Zybo Z7 development board, which features a Xilinx Zynq-7000 SoC combining a dual-core ARM Cortex-A9 processor with FPGA programmable logic. Using AMD’s Vivado IP cores, we synthesized a block design incorporating the ARM processor, AXI interconnects, VDMA, HDMI interfaces, and custom RTL modules.</w:t>
+      </w:r>
+      <w:r>
+        <w:rPr>
+          <w:rFonts w:ascii="Verdana" w:hAnsi="Verdana"/>
+          <w:color w:val="000000"/>
+          <w:sz w:val="18"/>
+          <w:szCs w:val="18"/>
+        </w:rPr>
+        <w:t xml:space="preserve"> </w:t>
+      </w:r>
+      <w:r>
+        <w:rPr>
+          <w:rFonts w:ascii="Verdana" w:hAnsi="Verdana"/>
+          <w:color w:val="000000"/>
+          <w:sz w:val="18"/>
+          <w:szCs w:val="18"/>
+        </w:rPr>
+        <w:t>The team implemented a</w:t>
+      </w:r>
+      <w:r>
+        <w:rPr>
+          <w:rFonts w:ascii="Verdana" w:hAnsi="Verdana"/>
+          <w:color w:val="000000"/>
+          <w:sz w:val="18"/>
+          <w:szCs w:val="18"/>
+        </w:rPr>
+        <w:t xml:space="preserve"> custom</w:t>
+      </w:r>
+      <w:r>
+        <w:rPr>
+          <w:rFonts w:ascii="Verdana" w:hAnsi="Verdana"/>
+          <w:color w:val="000000"/>
+          <w:sz w:val="18"/>
+          <w:szCs w:val="18"/>
+        </w:rPr>
+        <w:t xml:space="preserve"> image sharpening ke</w:t>
+      </w:r>
+      <w:r>
+        <w:rPr>
+          <w:rFonts w:ascii="Verdana" w:hAnsi="Verdana"/>
+          <w:color w:val="000000"/>
+          <w:sz w:val="18"/>
+          <w:szCs w:val="18"/>
+        </w:rPr>
+        <w:t>rnel written in Verilog RTL to enhance</w:t>
+      </w:r>
+      <w:r>
+        <w:rPr>
+          <w:rFonts w:ascii="Verdana" w:hAnsi="Verdana"/>
+          <w:color w:val="000000"/>
+          <w:sz w:val="18"/>
+          <w:szCs w:val="18"/>
+        </w:rPr>
+        <w:t xml:space="preserve"> </w:t>
+      </w:r>
+      <w:r>
+        <w:rPr>
+          <w:rFonts w:ascii="Verdana" w:hAnsi="Verdana"/>
+          <w:color w:val="000000"/>
+          <w:sz w:val="18"/>
+          <w:szCs w:val="18"/>
+        </w:rPr>
+        <w:t>the live camera feed</w:t>
+      </w:r>
+      <w:r>
+        <w:rPr>
+          <w:rFonts w:ascii="Verdana" w:hAnsi="Verdana"/>
+          <w:color w:val="000000"/>
+          <w:sz w:val="18"/>
+          <w:szCs w:val="18"/>
+        </w:rPr>
+        <w:t xml:space="preserve">. </w:t>
+      </w:r>
+      <w:r>
+        <w:rPr>
+          <w:rFonts w:ascii="Verdana" w:hAnsi="Verdana"/>
+          <w:color w:val="000000"/>
+          <w:sz w:val="18"/>
+          <w:szCs w:val="18"/>
+        </w:rPr>
+        <w:t xml:space="preserve">My main role involved architecting </w:t>
+      </w:r>
+      <w:r>
+        <w:rPr>
+          <w:rFonts w:ascii="Verdana" w:hAnsi="Verdana"/>
+          <w:color w:val="000000"/>
+          <w:sz w:val="18"/>
+          <w:szCs w:val="18"/>
+        </w:rPr>
+        <w:t>the necessary hardware blocks and instantiating the custom RTL into the main design</w:t>
+      </w:r>
+      <w:r>
+        <w:rPr>
+          <w:rFonts w:ascii="Verdana" w:hAnsi="Verdana"/>
+          <w:color w:val="000000"/>
+          <w:sz w:val="18"/>
+          <w:szCs w:val="18"/>
+        </w:rPr>
+        <w:t>.</w:t>
+      </w:r>
+      <w:r>
+        <w:rPr>
+          <w:rFonts w:ascii="Verdana" w:hAnsi="Verdana"/>
+          <w:color w:val="000000"/>
+          <w:sz w:val="18"/>
+          <w:szCs w:val="18"/>
+        </w:rPr>
+        <w:t xml:space="preserve"> I delivered the bitstream and Xilinx Support </w:t>
+      </w:r>
+      <w:r>
+        <w:rPr>
+          <w:rFonts w:ascii="Verdana" w:hAnsi="Verdana"/>
+          <w:color w:val="000000"/>
+          <w:sz w:val="18"/>
+          <w:szCs w:val="18"/>
+        </w:rPr>
+        <w:t xml:space="preserve">Architecture (.XSA) </w:t>
+      </w:r>
+      <w:r>
+        <w:rPr>
+          <w:rFonts w:ascii="Verdana" w:hAnsi="Verdana"/>
+          <w:color w:val="000000"/>
+          <w:sz w:val="18"/>
+          <w:szCs w:val="18"/>
+        </w:rPr>
+        <w:t xml:space="preserve">files for the software team to program the logic of the smart security system. I also developed the software that captured the current frame feed from the camera once the code was entered and applied the </w:t>
+      </w:r>
+      <w:r>
+        <w:rPr>
+          <w:rFonts w:ascii="Verdana" w:hAnsi="Verdana"/>
+          <w:color w:val="000000"/>
+          <w:sz w:val="18"/>
+          <w:szCs w:val="18"/>
+        </w:rPr>
+        <w:t xml:space="preserve">colored </w:t>
+      </w:r>
+      <w:r>
+        <w:rPr>
+          <w:rFonts w:ascii="Verdana" w:hAnsi="Verdana"/>
+          <w:color w:val="000000"/>
+          <w:sz w:val="18"/>
+          <w:szCs w:val="18"/>
+        </w:rPr>
+        <w:t>hue</w:t>
+      </w:r>
+      <w:r>
+        <w:rPr>
+          <w:rFonts w:ascii="Verdana" w:hAnsi="Verdana"/>
+          <w:color w:val="000000"/>
+          <w:sz w:val="18"/>
+          <w:szCs w:val="18"/>
+        </w:rPr>
+        <w:t>s</w:t>
+      </w:r>
+      <w:r>
+        <w:rPr>
+          <w:rFonts w:ascii="Verdana" w:hAnsi="Verdana"/>
+          <w:color w:val="000000"/>
+          <w:sz w:val="18"/>
+          <w:szCs w:val="18"/>
+        </w:rPr>
+        <w:t xml:space="preserve"> using ARM’s SIMD instruction </w:t>
+      </w:r>
+      <w:r>
+        <w:rPr>
+          <w:rFonts w:ascii="Verdana" w:hAnsi="Verdana"/>
+          <w:color w:val="000000"/>
+          <w:sz w:val="18"/>
+          <w:szCs w:val="18"/>
+        </w:rPr>
+        <w:t xml:space="preserve">set </w:t>
+      </w:r>
+      <w:r>
+        <w:rPr>
+          <w:rFonts w:ascii="Verdana" w:hAnsi="Verdana"/>
+          <w:color w:val="000000"/>
+          <w:sz w:val="18"/>
+          <w:szCs w:val="18"/>
+        </w:rPr>
+        <w:t xml:space="preserve">for ultra-fast image processing and store into DDR. </w:t>
+      </w:r>
+    </w:p>
+    <w:p>
+      <w:pPr>
+        <w:pStyle w:val="NormalWeb"/>
+        <w:spacing w:before="0" w:beforeAutospacing="0" w:after="0" w:afterAutospacing="0"/>
+        <w:rPr>
+          <w:rFonts w:ascii="Verdana" w:hAnsi="Verdana"/>
+          <w:color w:val="000000"/>
+          <w:sz w:val="18"/>
+          <w:szCs w:val="18"/>
+        </w:rPr>
+      </w:pPr>
+    </w:p>
+    <w:p>
+      <w:pPr>
+        <w:pStyle w:val="NormalWeb"/>
+        <w:spacing w:before="0" w:beforeAutospacing="0" w:after="0" w:afterAutospacing="0"/>
+        <w:rPr>
+          <w:rFonts w:ascii="Verdana" w:hAnsi="Verdana"/>
+          <w:color w:val="000000"/>
+          <w:sz w:val="18"/>
+          <w:szCs w:val="18"/>
+        </w:rPr>
+      </w:pPr>
+    </w:p>
+    <w:p>
+      <w:pPr>
+        <w:pStyle w:val="NormalWeb"/>
+        <w:spacing w:before="0" w:beforeAutospacing="0" w:after="0" w:afterAutospacing="0"/>
+        <w:rPr>
+          <w:rFonts w:ascii="Verdana" w:hAnsi="Verdana"/>
+          <w:color w:val="EE0000"/>
+          <w:sz w:val="18"/>
+          <w:szCs w:val="18"/>
+        </w:rPr>
+      </w:pPr>
+      <w:r>
+        <w:rPr>
+          <w:rFonts w:ascii="Verdana" w:hAnsi="Verdana"/>
+          <w:color w:val="EE0000"/>
+          <w:sz w:val="18"/>
+          <w:szCs w:val="18"/>
+        </w:rPr>
+        <w:t>EE 267: Computer Vision for AI/ML Applications</w:t>
+      </w:r>
+    </w:p>
+    <w:p>
+      <w:pPr>
+        <w:pStyle w:val="NormalWeb"/>
+        <w:spacing w:before="0" w:beforeAutospacing="0" w:after="0" w:afterAutospacing="0"/>
+        <w:rPr>
+          <w:rFonts w:ascii="Verdana" w:hAnsi="Verdana"/>
+          <w:b/>
+          <w:bCs/>
+          <w:color w:val="000000"/>
+          <w:sz w:val="18"/>
+          <w:szCs w:val="18"/>
+        </w:rPr>
+      </w:pPr>
+    </w:p>
+    <w:p>
+      <w:pPr>
+        <w:pStyle w:val="NormalWeb"/>
+        <w:spacing w:before="0" w:beforeAutospacing="0" w:after="0" w:afterAutospacing="0"/>
+        <w:rPr>
+          <w:rFonts w:ascii="Verdana" w:hAnsi="Verdana"/>
+          <w:b/>
+          <w:bCs/>
+          <w:color w:val="000000"/>
+          <w:sz w:val="18"/>
+          <w:szCs w:val="18"/>
+        </w:rPr>
+      </w:pPr>
+      <w:r>
+        <w:rPr>
+          <w:rFonts w:ascii="Verdana" w:hAnsi="Verdana"/>
+          <w:b/>
+          <w:bCs/>
+          <w:color w:val="000000"/>
+          <w:sz w:val="18"/>
+          <w:szCs w:val="18"/>
+        </w:rPr>
+        <w:t xml:space="preserve">Swimmers Pose Estimation </w:t>
+      </w:r>
+      <w:r>
+        <w:rPr>
+          <w:rFonts w:ascii="Verdana" w:hAnsi="Verdana"/>
+          <w:b/>
+          <w:bCs/>
+          <w:color w:val="000000"/>
+          <w:sz w:val="18"/>
+          <w:szCs w:val="18"/>
+        </w:rPr>
+        <w:t>U</w:t>
+      </w:r>
+      <w:r>
+        <w:rPr>
+          <w:rFonts w:ascii="Verdana" w:hAnsi="Verdana"/>
+          <w:b/>
+          <w:bCs/>
+          <w:color w:val="000000"/>
+          <w:sz w:val="18"/>
+          <w:szCs w:val="18"/>
+        </w:rPr>
+        <w:t xml:space="preserve">sing </w:t>
+      </w:r>
+      <w:r>
+        <w:rPr>
+          <w:rFonts w:ascii="Verdana" w:hAnsi="Verdana"/>
+          <w:b/>
+          <w:bCs/>
+          <w:color w:val="000000"/>
+          <w:sz w:val="18"/>
+          <w:szCs w:val="18"/>
+        </w:rPr>
+        <w:t>C</w:t>
+      </w:r>
+      <w:r>
+        <w:rPr>
+          <w:rFonts w:ascii="Verdana" w:hAnsi="Verdana"/>
+          <w:b/>
+          <w:bCs/>
+          <w:color w:val="000000"/>
+          <w:sz w:val="18"/>
+          <w:szCs w:val="18"/>
+        </w:rPr>
+        <w:t xml:space="preserve">omputer </w:t>
+      </w:r>
+      <w:r>
+        <w:rPr>
+          <w:rFonts w:ascii="Verdana" w:hAnsi="Verdana"/>
+          <w:b/>
+          <w:bCs/>
+          <w:color w:val="000000"/>
+          <w:sz w:val="18"/>
+          <w:szCs w:val="18"/>
+        </w:rPr>
+        <w:t>V</w:t>
+      </w:r>
+      <w:r>
+        <w:rPr>
+          <w:rFonts w:ascii="Verdana" w:hAnsi="Verdana"/>
+          <w:b/>
+          <w:bCs/>
+          <w:color w:val="000000"/>
+          <w:sz w:val="18"/>
+          <w:szCs w:val="18"/>
+        </w:rPr>
+        <w:t xml:space="preserve">ision and </w:t>
+      </w:r>
+      <w:r>
+        <w:rPr>
+          <w:rFonts w:ascii="Verdana" w:hAnsi="Verdana"/>
+          <w:b/>
+          <w:bCs/>
+          <w:color w:val="000000"/>
+          <w:sz w:val="18"/>
+          <w:szCs w:val="18"/>
+        </w:rPr>
+        <w:t>AI/ML</w:t>
+      </w:r>
+    </w:p>
+    <w:p>
+      <w:pPr>
+        <w:pStyle w:val="NormalWeb"/>
+        <w:spacing w:before="0" w:beforeAutospacing="0" w:after="0" w:afterAutospacing="0"/>
+        <w:rPr>
+          <w:rFonts w:ascii="Verdana" w:hAnsi="Verdana"/>
+          <w:color w:val="000000"/>
+          <w:sz w:val="18"/>
+          <w:szCs w:val="18"/>
+        </w:rPr>
+      </w:pPr>
+    </w:p>
+    <w:p>
+      <w:pPr>
+        <w:pStyle w:val="NormalWeb"/>
+        <w:spacing w:before="0" w:beforeAutospacing="0" w:after="0" w:afterAutospacing="0"/>
+        <w:rPr>
+          <w:rFonts w:ascii="Verdana" w:hAnsi="Verdana"/>
+          <w:color w:val="000000"/>
+          <w:sz w:val="18"/>
+          <w:szCs w:val="18"/>
+        </w:rPr>
+      </w:pPr>
+      <w:r>
+        <w:rPr>
+          <w:rFonts w:ascii="Verdana" w:hAnsi="Verdana"/>
+          <w:color w:val="000000"/>
+          <w:sz w:val="18"/>
+          <w:szCs w:val="18"/>
+        </w:rPr>
+        <w:t>This project highlights the use of computer vision methodologies paired with neural networks to estimate the pose</w:t>
+      </w:r>
+      <w:r>
+        <w:rPr>
+          <w:rFonts w:ascii="Verdana" w:hAnsi="Verdana"/>
+          <w:color w:val="000000"/>
+          <w:sz w:val="18"/>
+          <w:szCs w:val="18"/>
+        </w:rPr>
+        <w:t xml:space="preserve"> coordinates</w:t>
+      </w:r>
+      <w:r>
+        <w:rPr>
+          <w:rFonts w:ascii="Verdana" w:hAnsi="Verdana"/>
+          <w:color w:val="000000"/>
+          <w:sz w:val="18"/>
+          <w:szCs w:val="18"/>
+        </w:rPr>
+        <w:t xml:space="preserve"> of a given swimmer for </w:t>
+      </w:r>
+      <w:r>
+        <w:rPr>
+          <w:rFonts w:ascii="Verdana" w:hAnsi="Verdana"/>
+          <w:color w:val="000000"/>
+          <w:sz w:val="18"/>
+          <w:szCs w:val="18"/>
+        </w:rPr>
+        <w:t xml:space="preserve">three different swim styles of freestyle, backstroke, and breaststroke. </w:t>
+      </w:r>
+    </w:p>
+    <w:p>
+      <w:pPr>
+        <w:pStyle w:val="NormalWeb"/>
+        <w:spacing w:before="0" w:beforeAutospacing="0" w:after="0" w:afterAutospacing="0"/>
+        <w:rPr>
+          <w:rFonts w:ascii="Verdana" w:hAnsi="Verdana"/>
+          <w:color w:val="000000"/>
+          <w:sz w:val="18"/>
+          <w:szCs w:val="18"/>
+        </w:rPr>
+      </w:pPr>
+    </w:p>
+    <w:p>
+      <w:pPr>
+        <w:pStyle w:val="NormalWeb"/>
+        <w:spacing w:before="0" w:beforeAutospacing="0" w:after="0" w:afterAutospacing="0"/>
+        <w:rPr>
+          <w:rFonts w:ascii="Verdana" w:hAnsi="Verdana"/>
+          <w:color w:val="000000"/>
+          <w:sz w:val="18"/>
+          <w:szCs w:val="18"/>
+        </w:rPr>
+      </w:pPr>
+      <w:r>
+        <w:rPr>
+          <w:rFonts w:ascii="Verdana" w:hAnsi="Verdana"/>
+          <w:color w:val="000000"/>
+          <w:sz w:val="18"/>
+          <w:szCs w:val="18"/>
+        </w:rPr>
+        <w:t xml:space="preserve">The scope of the project is to isolate the swimmer from a given frame, segment the swimmers pose, run the isolated image through YOLOv7 neural network for training, and output coordinates of the parts of the swimmer in that swimming style. </w:t>
+      </w:r>
+    </w:p>
+    <w:p>
+      <w:pPr>
+        <w:pStyle w:val="NormalWeb"/>
+        <w:spacing w:before="0" w:beforeAutospacing="0" w:after="0" w:afterAutospacing="0"/>
+        <w:rPr>
+          <w:rFonts w:ascii="Verdana" w:hAnsi="Verdana"/>
+          <w:color w:val="000000"/>
+          <w:sz w:val="18"/>
+          <w:szCs w:val="18"/>
+        </w:rPr>
+      </w:pPr>
+    </w:p>
+    <w:p>
+      <w:pPr>
+        <w:pStyle w:val="NormalWeb"/>
+        <w:spacing w:before="0" w:beforeAutospacing="0" w:after="0" w:afterAutospacing="0"/>
+      </w:pPr>
+      <w:r>
+        <w:rPr>
+          <w:rFonts w:ascii="Verdana" w:hAnsi="Verdana"/>
+          <w:color w:val="000000"/>
+          <w:sz w:val="18"/>
+          <w:szCs w:val="18"/>
+        </w:rPr>
+        <w:t xml:space="preserve">The project accomplished this by first preprocessing the image using gamma correction and sharpness correction. Secondly, it leverages a pretrained </w:t>
+      </w:r>
+      <w:proofErr w:type="spellStart"/>
+      <w:r>
+        <w:rPr>
+          <w:rFonts w:ascii="Verdana" w:hAnsi="Verdana"/>
+          <w:color w:val="000000"/>
+          <w:sz w:val="18"/>
+          <w:szCs w:val="18"/>
+        </w:rPr>
+        <w:t>MediaPipe</w:t>
+      </w:r>
+      <w:proofErr w:type="spellEnd"/>
+      <w:r>
+        <w:rPr>
+          <w:rFonts w:ascii="Verdana" w:hAnsi="Verdana"/>
+          <w:color w:val="000000"/>
+          <w:sz w:val="18"/>
+          <w:szCs w:val="18"/>
+        </w:rPr>
+        <w:t xml:space="preserve"> object detection module to locate where in the frame the swimmer is to deliver coordinates to </w:t>
+      </w:r>
+      <w:r>
+        <w:rPr>
+          <w:rFonts w:ascii="Verdana" w:hAnsi="Verdana"/>
+          <w:color w:val="000000"/>
+          <w:sz w:val="18"/>
+          <w:szCs w:val="18"/>
+        </w:rPr>
+        <w:t xml:space="preserve">Meta’s </w:t>
+      </w:r>
+      <w:r>
+        <w:rPr>
+          <w:rFonts w:ascii="Verdana" w:hAnsi="Verdana"/>
+          <w:color w:val="000000"/>
+          <w:sz w:val="18"/>
+          <w:szCs w:val="18"/>
+        </w:rPr>
+        <w:t>Segment</w:t>
+      </w:r>
+      <w:r>
+        <w:rPr>
+          <w:rFonts w:ascii="Verdana" w:hAnsi="Verdana"/>
+          <w:color w:val="000000"/>
+          <w:sz w:val="18"/>
+          <w:szCs w:val="18"/>
+        </w:rPr>
+        <w:t xml:space="preserve"> </w:t>
+      </w:r>
+      <w:r>
+        <w:rPr>
+          <w:rFonts w:ascii="Verdana" w:hAnsi="Verdana"/>
+          <w:color w:val="000000"/>
+          <w:sz w:val="18"/>
+          <w:szCs w:val="18"/>
+        </w:rPr>
+        <w:t xml:space="preserve">Anything </w:t>
+      </w:r>
+      <w:r>
+        <w:rPr>
+          <w:rFonts w:ascii="Verdana" w:hAnsi="Verdana"/>
+          <w:color w:val="000000"/>
+          <w:sz w:val="18"/>
+          <w:szCs w:val="18"/>
+        </w:rPr>
+        <w:t>Model (SAM)</w:t>
+      </w:r>
+      <w:r>
+        <w:rPr>
+          <w:rFonts w:ascii="Verdana" w:hAnsi="Verdana"/>
+          <w:color w:val="000000"/>
+          <w:sz w:val="18"/>
+          <w:szCs w:val="18"/>
+        </w:rPr>
+        <w:t xml:space="preserve">. </w:t>
+      </w:r>
+      <w:r>
+        <w:rPr>
+          <w:rFonts w:ascii="Verdana" w:hAnsi="Verdana"/>
+          <w:color w:val="000000"/>
+          <w:sz w:val="18"/>
+          <w:szCs w:val="18"/>
+        </w:rPr>
+        <w:t xml:space="preserve">SAM </w:t>
+      </w:r>
+      <w:r>
+        <w:rPr>
+          <w:rFonts w:ascii="Verdana" w:hAnsi="Verdana"/>
+          <w:color w:val="000000"/>
+          <w:sz w:val="18"/>
+          <w:szCs w:val="18"/>
+        </w:rPr>
+        <w:t xml:space="preserve">segments the swimmer of interest in the frame to deliver to the YOLOv7 module </w:t>
+      </w:r>
+      <w:r>
+        <w:rPr>
+          <w:rFonts w:ascii="Verdana" w:hAnsi="Verdana"/>
+          <w:color w:val="000000"/>
+          <w:sz w:val="18"/>
+          <w:szCs w:val="18"/>
+        </w:rPr>
+        <w:t>to calculate pose estimation coordinates to later be trained on a custom neural network.</w:t>
+      </w:r>
+    </w:p>
+    <w:p>
+      <w:pPr>
+        <w:pStyle w:val="NormalWeb"/>
+        <w:spacing w:before="0" w:beforeAutospacing="0" w:after="0" w:afterAutospacing="0"/>
+        <w:rPr>
+          <w:rFonts w:ascii="Verdana" w:hAnsi="Verdana"/>
+          <w:color w:val="000000"/>
+          <w:sz w:val="22"/>
+          <w:szCs w:val="22"/>
+        </w:rPr>
+      </w:pPr>
+    </w:p>
+    <w:p>
+      <w:pPr>
+        <w:pStyle w:val="NormalWeb"/>
+        <w:spacing w:before="0" w:beforeAutospacing="0" w:after="0" w:afterAutospacing="0"/>
+        <w:rPr>
+          <w:rFonts w:ascii="Verdana" w:hAnsi="Verdana"/>
+          <w:color w:val="000000"/>
+          <w:sz w:val="22"/>
+          <w:szCs w:val="22"/>
+        </w:rPr>
+      </w:pPr>
+      <w:r>
+        <w:rPr>
+          <w:rFonts w:ascii="Verdana" w:hAnsi="Verdana"/>
+          <w:color w:val="000000"/>
+          <w:sz w:val="22"/>
+          <w:szCs w:val="22"/>
+        </w:rPr>
+        <w:t>[Insert Picture Here]</w:t>
+      </w:r>
+    </w:p>
+    <w:p>
+      <w:pPr>
+        <w:pStyle w:val="NormalWeb"/>
+        <w:spacing w:before="0" w:beforeAutospacing="0" w:after="0" w:afterAutospacing="0"/>
+        <w:rPr>
+          <w:rFonts w:ascii="Verdana" w:hAnsi="Verdana"/>
+          <w:color w:val="000000"/>
+          <w:sz w:val="22"/>
+          <w:szCs w:val="22"/>
+        </w:rPr>
+      </w:pPr>
+    </w:p>
+    <w:p>
+      <w:pPr>
+        <w:pStyle w:val="NormalWeb"/>
+        <w:spacing w:before="0" w:beforeAutospacing="0" w:after="0" w:afterAutospacing="0"/>
+        <w:rPr>
+          <w:rFonts w:ascii="Verdana" w:hAnsi="Verdana"/>
+          <w:color w:val="000000"/>
+          <w:sz w:val="22"/>
+          <w:szCs w:val="22"/>
+        </w:rPr>
+      </w:pPr>
+      <w:r>
+        <w:rPr>
+          <w:rFonts w:ascii="Verdana" w:hAnsi="Verdana"/>
+          <w:color w:val="000000"/>
+          <w:sz w:val="22"/>
+          <w:szCs w:val="22"/>
+        </w:rPr>
+        <w:t>Linked</w:t>
+      </w:r>
+      <w:r>
+        <w:rPr>
+          <w:rFonts w:ascii="Verdana" w:hAnsi="Verdana"/>
+          <w:color w:val="000000"/>
+          <w:sz w:val="22"/>
+          <w:szCs w:val="22"/>
+        </w:rPr>
+        <w:t>I</w:t>
+      </w:r>
+      <w:r>
+        <w:rPr>
+          <w:rFonts w:ascii="Verdana" w:hAnsi="Verdana"/>
+          <w:color w:val="000000"/>
+          <w:sz w:val="22"/>
+          <w:szCs w:val="22"/>
+        </w:rPr>
+        <w:t>n Post:</w:t>
+      </w:r>
+    </w:p>
+    <w:p>
+      <w:pPr>
+        <w:pStyle w:val="NormalWeb"/>
+        <w:spacing w:before="0" w:beforeAutospacing="0" w:after="0" w:afterAutospacing="0"/>
+        <w:rPr>
+          <w:rFonts w:ascii="Verdana" w:hAnsi="Verdana"/>
+          <w:color w:val="000000"/>
+          <w:sz w:val="22"/>
+          <w:szCs w:val="22"/>
+        </w:rPr>
+      </w:pPr>
+      <w:r>
+        <w:rPr>
+          <w:rFonts w:ascii="Verdana" w:hAnsi="Verdana"/>
+          <w:color w:val="000000"/>
+          <w:sz w:val="22"/>
+          <w:szCs w:val="22"/>
+        </w:rPr>
+        <w:t>Graduation Post:</w:t>
+      </w:r>
+    </w:p>
+    <w:p>
+      <w:pPr>
+        <w:pStyle w:val="NormalWeb"/>
+      </w:pPr>
+      <w:r>
+        <w:t xml:space="preserve">I’m </w:t>
+      </w:r>
+      <w:r>
+        <w:t xml:space="preserve">super </w:t>
+      </w:r>
+      <w:r>
+        <w:t>excited to share a major milestone</w:t>
+      </w:r>
+      <w:r>
+        <w:t xml:space="preserve">, </w:t>
+      </w:r>
+      <w:r>
+        <w:t xml:space="preserve"> I’ve officially completed my </w:t>
+      </w:r>
+      <w:r>
+        <w:rPr>
+          <w:rFonts w:eastAsiaTheme="majorEastAsia"/>
+        </w:rPr>
+        <w:t>Master of Science in Electrical Engineering</w:t>
+      </w:r>
+      <w:r>
+        <w:t xml:space="preserve"> from </w:t>
+      </w:r>
+      <w:r>
+        <w:rPr>
+          <w:rFonts w:eastAsiaTheme="majorEastAsia"/>
+        </w:rPr>
+        <w:t>San José State University</w:t>
+      </w:r>
+      <w:r>
+        <w:t>!</w:t>
+      </w:r>
+    </w:p>
+    <w:p>
+      <w:pPr>
+        <w:pStyle w:val="NormalWeb"/>
+      </w:pPr>
+      <w:r>
+        <w:t xml:space="preserve">Over the past two and a half years, I pursued this degree </w:t>
+      </w:r>
+      <w:r>
+        <w:rPr>
+          <w:rFonts w:eastAsiaTheme="majorEastAsia"/>
+        </w:rPr>
+        <w:t>while working full-time in industry</w:t>
+      </w:r>
+      <w:r>
+        <w:t>, balancing graduate research and coursework alongside my professional work in digital system design</w:t>
+      </w:r>
+      <w:r>
+        <w:t xml:space="preserve"> for FPGAs</w:t>
+      </w:r>
+      <w:r>
+        <w:t xml:space="preserve"> and ASIC</w:t>
+      </w:r>
+      <w:r>
+        <w:t>s</w:t>
+      </w:r>
+      <w:r>
+        <w:t>.</w:t>
+      </w:r>
+    </w:p>
+    <w:p>
+      <w:pPr>
+        <w:pStyle w:val="NormalWeb"/>
+      </w:pPr>
+      <w:r>
+        <w:t xml:space="preserve">My studies focused on building upon my industry experience with </w:t>
+      </w:r>
+      <w:r>
+        <w:rPr>
+          <w:rFonts w:eastAsiaTheme="majorEastAsia"/>
+        </w:rPr>
+        <w:t>Field Programmable Gate Arrays (FPGAs)</w:t>
+      </w:r>
+      <w:r>
+        <w:t xml:space="preserve"> while pairing it with graduate-level coursework in </w:t>
+      </w:r>
+      <w:r>
+        <w:rPr>
+          <w:rFonts w:eastAsiaTheme="majorEastAsia"/>
+        </w:rPr>
+        <w:t>Artificial Intelligence and Machine Learning</w:t>
+      </w:r>
+      <w:r>
+        <w:t xml:space="preserve">. I worked extensively on implementing algorithms and inference models for </w:t>
+      </w:r>
+      <w:r>
+        <w:rPr>
+          <w:rFonts w:eastAsiaTheme="majorEastAsia"/>
+        </w:rPr>
+        <w:t>image classification, segmentation, object detection, and digital image processing</w:t>
+      </w:r>
+      <w:r>
+        <w:t xml:space="preserve"> through </w:t>
+      </w:r>
+      <w:r>
+        <w:rPr>
+          <w:rFonts w:eastAsiaTheme="majorEastAsia"/>
+        </w:rPr>
+        <w:t>software–hardware co-design across CPU and FPGA architectures</w:t>
+      </w:r>
+      <w:r>
+        <w:t>.</w:t>
+      </w:r>
+    </w:p>
+    <w:p>
+      <w:pPr>
+        <w:pStyle w:val="NormalWeb"/>
+      </w:pPr>
+      <w:r>
+        <w:t xml:space="preserve">This journey was both </w:t>
+      </w:r>
+      <w:r>
+        <w:rPr>
+          <w:rFonts w:eastAsiaTheme="majorEastAsia"/>
+        </w:rPr>
+        <w:t>challenging and incredibly rewarding</w:t>
+      </w:r>
+      <w:r>
+        <w:t>, and it allowed me to deepen my understanding of how advanced algorithms can be efficiently deployed on specialized hardware.</w:t>
+      </w:r>
+    </w:p>
+    <w:p>
+      <w:pPr>
+        <w:pStyle w:val="NormalWeb"/>
+      </w:pPr>
+      <w:r>
+        <w:t xml:space="preserve">I’d like to thank the incredible </w:t>
+      </w:r>
+      <w:r>
+        <w:rPr>
+          <w:rFonts w:eastAsiaTheme="majorEastAsia"/>
+        </w:rPr>
+        <w:t>faculty and staff at San José State University</w:t>
+      </w:r>
+      <w:r>
+        <w:t>, as well as my friends, family, and colleagues for their guidance and support throughout this journey.</w:t>
+      </w:r>
+      <w:r>
+        <w:t xml:space="preserve"> I am </w:t>
+      </w:r>
+      <w:proofErr w:type="gramStart"/>
+      <w:r>
+        <w:lastRenderedPageBreak/>
+        <w:t>p</w:t>
+      </w:r>
+      <w:r>
+        <w:t>roud</w:t>
+      </w:r>
+      <w:proofErr w:type="gramEnd"/>
+      <w:r>
+        <w:t xml:space="preserve"> to </w:t>
+      </w:r>
+      <w:r>
+        <w:t>achieve</w:t>
+      </w:r>
+      <w:r>
+        <w:t xml:space="preserve"> this milestone and excited for what’s next at the intersection of </w:t>
+      </w:r>
+      <w:r>
+        <w:rPr>
+          <w:rFonts w:eastAsiaTheme="majorEastAsia"/>
+        </w:rPr>
+        <w:t>AI, digital design, and hardware acceleration.</w:t>
+      </w:r>
+    </w:p>
+    <w:p>
+      <w:pPr>
+        <w:pStyle w:val="NormalWeb"/>
+      </w:pPr>
+      <w:r>
+        <w:t xml:space="preserve">Below are a few snapshots from graduation and the </w:t>
+      </w:r>
+      <w:r>
+        <w:rPr>
+          <w:rFonts w:eastAsiaTheme="majorEastAsia"/>
+        </w:rPr>
+        <w:t>Senior Project Symposium</w:t>
+      </w:r>
+      <w:r>
+        <w:t>!</w:t>
+      </w:r>
+    </w:p>
+    <w:p>
+      <w:pPr>
+        <w:pStyle w:val="NormalWeb"/>
+      </w:pPr>
+      <w:r>
+        <w:t>#SanJoseStateUniversity #ElectricalEngineering #FPGA #DigitalDesign #MachineLearning #AIHardware</w:t>
+      </w:r>
+    </w:p>
+    <w:p>
+      <w:pPr>
+        <w:pStyle w:val="NormalWeb"/>
+      </w:pPr>
+    </w:p>
+    <w:p>
+      <w:pPr>
+        <w:pStyle w:val="NormalWeb"/>
+      </w:pPr>
+      <w:r>
+        <w:t xml:space="preserve">In addition to my graduation post, I wanted to highlight my graduate </w:t>
+      </w:r>
+      <w:r>
+        <w:t xml:space="preserve">senior design </w:t>
+      </w:r>
+      <w:r>
+        <w:t xml:space="preserve">project. </w:t>
+      </w:r>
+      <w:r>
+        <w:t xml:space="preserve">This project </w:t>
+      </w:r>
+      <w:r>
+        <w:t>focused on deploying deep neural networks to FPGA hardware for autonomous driving perception systems.</w:t>
+      </w:r>
+    </w:p>
+    <w:p>
+      <w:pPr>
+        <w:pStyle w:val="NormalWeb"/>
+      </w:pPr>
+      <w:r>
+        <w:t>The project explored a full software–hardware co-design pipeline for lane segmentation, a key perception task in Advanced Driver Assistance Systems (ADAS). I designed and trained a custom deep neural network using PyTorch, leveraging a MobileNetV2 encoder with a custom segmentation decoder to detect highway lane markings from camera images. The model was trained on the TuSimple lane detection dataset, using data augmentation and optimized loss functions to improve segmentation performance.</w:t>
+      </w:r>
+    </w:p>
+    <w:p>
+      <w:pPr>
+        <w:pStyle w:val="NormalWeb"/>
+      </w:pPr>
+      <w:r>
+        <w:t>Once validated in software, the trained model was deployed to hardware using the AMD Vitis AI workflow. This involved quantizing the trained model from FP32 to INT8, compiling it into a hardware-executable .xmodel, and deploying it to an AMD ZCU104 Ultrascale+ FPGA running a Deep Processing Unit (DPU) accelerator.</w:t>
+      </w:r>
+    </w:p>
+    <w:p>
+      <w:pPr>
+        <w:pStyle w:val="NormalWeb"/>
+      </w:pPr>
+      <w:r>
+        <w:t>Using the PYNQ framework, the FPGA’s ARM processor interfaced with the DPU to execute hardware inference and post-process the segmentation output.</w:t>
+      </w:r>
+    </w:p>
+    <w:p>
+      <w:pPr>
+        <w:pStyle w:val="NormalWeb"/>
+      </w:pPr>
+      <w:r>
+        <w:t>Results:</w:t>
+      </w:r>
+      <w:r>
+        <w:br/>
+        <w:t>• 77.8% DICE segmentation accuracy in software</w:t>
+      </w:r>
+      <w:r>
+        <w:br/>
+        <w:t>• 77.1% accuracy on FPGA after INT8 quantization</w:t>
+      </w:r>
+      <w:r>
+        <w:br/>
+        <w:t xml:space="preserve">• ~10 FPS real-time hardware inference (~100 </w:t>
+      </w:r>
+      <w:proofErr w:type="spellStart"/>
+      <w:r>
+        <w:t>ms</w:t>
+      </w:r>
+      <w:proofErr w:type="spellEnd"/>
+      <w:r>
+        <w:t xml:space="preserve"> per frame)</w:t>
+      </w:r>
+      <w:r>
+        <w:br/>
+        <w:t>• Successful stress testing across ~6000 images without hardware failure</w:t>
+      </w:r>
+    </w:p>
+    <w:p>
+      <w:pPr>
+        <w:pStyle w:val="NormalWeb"/>
+      </w:pPr>
+      <w:r>
+        <w:t>This project demonstrated the feasibility of rapidly transitioning machine learning models from software environments to real-time hardware inference, highlighting the role of FPGAs as flexible acceleration platforms for edge AI and autonomous systems.</w:t>
+      </w:r>
+      <w:r>
+        <w:t xml:space="preserve"> </w:t>
+      </w:r>
+      <w:proofErr w:type="gramStart"/>
+      <w:r>
+        <w:t>Excited</w:t>
+      </w:r>
+      <w:proofErr w:type="gramEnd"/>
+      <w:r>
+        <w:t xml:space="preserve"> to continue exploring the intersection of AI/ML, digital hardware design, and high-performance computing.</w:t>
+      </w:r>
+    </w:p>
+    <w:p>
+      <w:pPr>
+        <w:pStyle w:val="NormalWeb"/>
+      </w:pPr>
+      <w:r>
+        <w:t xml:space="preserve">Check out this link to see the hardware inference results! </w:t>
+      </w:r>
+      <w:r>
+        <w:t>https://youtu.be/UElMAv6r1II</w:t>
+      </w:r>
+    </w:p>
+    <w:p>
+      <w:pPr>
+        <w:pStyle w:val="NormalWeb"/>
+      </w:pPr>
+    </w:p>
+    <w:p>
+      <w:pPr>
+        <w:pStyle w:val="NormalWeb"/>
+        <w:spacing w:before="0" w:beforeAutospacing="0" w:after="0" w:afterAutospacing="0"/>
+        <w:rPr>
+          <w:rFonts w:ascii="Verdana" w:hAnsi="Verdana"/>
+          <w:color w:val="000000"/>
+          <w:sz w:val="18"/>
+          <w:szCs w:val="18"/>
+        </w:rPr>
+      </w:pPr>
+    </w:p>
+    <w:p>
+      <w:pPr>
+        <w:pStyle w:val="NormalWeb"/>
+        <w:spacing w:before="0" w:beforeAutospacing="0" w:after="0" w:afterAutospacing="0"/>
+        <w:rPr>
+          <w:rFonts w:ascii="Verdana" w:hAnsi="Verdana"/>
+          <w:color w:val="000000"/>
+          <w:sz w:val="18"/>
+          <w:szCs w:val="18"/>
+        </w:rPr>
+      </w:pPr>
+    </w:p>
+    <w:p>
+      <w:pPr>
+        <w:pStyle w:val="NormalWeb"/>
+        <w:spacing w:before="0" w:beforeAutospacing="0" w:after="0" w:afterAutospacing="0"/>
+        <w:rPr>
+          <w:rFonts w:ascii="Verdana" w:hAnsi="Verdana"/>
+          <w:color w:val="000000"/>
+          <w:sz w:val="18"/>
+          <w:szCs w:val="18"/>
+        </w:rPr>
+      </w:pPr>
+    </w:p>
+    <w:p>
+      <w:pPr>
+        <w:pStyle w:val="NormalWeb"/>
+        <w:spacing w:before="0" w:beforeAutospacing="0" w:after="0" w:afterAutospacing="0"/>
+        <w:rPr>
+          <w:rFonts w:ascii="Verdana" w:hAnsi="Verdana"/>
+          <w:color w:val="000000"/>
+          <w:sz w:val="18"/>
+          <w:szCs w:val="18"/>
+        </w:rPr>
       </w:pPr>
     </w:p>
     <w:p>
@@ -1688,7 +4284,15 @@
         <w:t>London, UK</w:t>
       </w:r>
       <w:r>
-        <w:t>, including applications in autonomous systems, real-time compute platforms, and performance-critical architectures.</w:t>
+        <w:t xml:space="preserve">, including applications in autonomous systems, real-time </w:t>
+      </w:r>
+      <w:proofErr w:type="spellStart"/>
+      <w:r>
+        <w:t>compute</w:t>
+      </w:r>
+      <w:proofErr w:type="spellEnd"/>
+      <w:r>
+        <w:t xml:space="preserve"> platforms, and performance-critical architectures.</w:t>
       </w:r>
     </w:p>
     <w:p>
@@ -1725,7 +4329,6 @@
         <w:pStyle w:val="NormalWeb"/>
       </w:pPr>
       <w:r>
-        <w:lastRenderedPageBreak/>
         <w:t xml:space="preserve">I recently completed a </w:t>
       </w:r>
       <w:r>
@@ -1743,47 +4346,53 @@
           <w:b/>
           <w:bCs/>
         </w:rPr>
-        <w:t>FPGA-based digital design, embedded software on FPGA-hosted processors, edge compute hardware, and AI/ML models targeted for hardware implementation</w:t>
-      </w:r>
-      <w:r>
-        <w:t>. This work strengthened my ability to reason about digital systems across RTL, embedded software, and algorithmic workloads.</w:t>
-      </w:r>
-    </w:p>
-    <w:p>
-      <w:pPr>
-        <w:pStyle w:val="NormalWeb"/>
-      </w:pPr>
-      <w:r>
-        <w:t>In my current role at Lockheed Martin, I work across the FPGA development lifecycle—RTL design, algorithm integration, simulation, and verification—supporting high-speed interfaces, FPGA–SoC communication, and fault-tolerant architectures for safety-critical applications.</w:t>
-      </w:r>
-    </w:p>
-    <w:p>
-      <w:pPr>
-        <w:pStyle w:val="NormalWeb"/>
-      </w:pPr>
-      <w:r>
-        <w:t xml:space="preserve">I am targeting FPGA, ASIC, or advanced digital design roles in </w:t>
-      </w:r>
+        <w:t xml:space="preserve">FPGA-based digital design, embedded software on FPGA-hosted processors, edge </w:t>
+      </w:r>
+      <w:proofErr w:type="spellStart"/>
       <w:r>
         <w:rPr>
           <w:b/>
           <w:bCs/>
         </w:rPr>
+        <w:t>compute</w:t>
+      </w:r>
+      <w:proofErr w:type="spellEnd"/>
+      <w:r>
+        <w:rPr>
+          <w:b/>
+          <w:bCs/>
+        </w:rPr>
+        <w:t xml:space="preserve"> hardware, and AI/ML models targeted for hardware implementation</w:t>
+      </w:r>
+      <w:r>
+        <w:t>. This work strengthened my ability to reason about digital systems across RTL, embedded software, and algorithmic workloads.</w:t>
+      </w:r>
+    </w:p>
+    <w:p>
+      <w:pPr>
+        <w:pStyle w:val="NormalWeb"/>
+      </w:pPr>
+      <w:r>
+        <w:t>In my current role at Lockheed Martin, I work across the FPGA development lifecycle—RTL design, algorithm integration, simulation, and verification—supporting high-speed interfaces, FPGA–SoC communication, and fault-tolerant architectures for safety-critical applications.</w:t>
+      </w:r>
+    </w:p>
+    <w:p>
+      <w:pPr>
+        <w:pStyle w:val="NormalWeb"/>
+      </w:pPr>
+      <w:r>
+        <w:t xml:space="preserve">I am targeting FPGA, ASIC, or advanced digital design roles in </w:t>
+      </w:r>
+      <w:r>
+        <w:rPr>
+          <w:b/>
+          <w:bCs/>
+        </w:rPr>
         <w:t>London</w:t>
       </w:r>
       <w:r>
         <w:t>, particularly teams working on custom silicon, low-latency systems, or performance-driven hardware platforms.</w:t>
       </w:r>
-    </w:p>
-    <w:p>
-      <w:pPr>
-        <w:pStyle w:val="NormalWeb"/>
-      </w:pPr>
-    </w:p>
-    <w:p>
-      <w:pPr>
-        <w:spacing w:after="0" w:line="240" w:lineRule="auto"/>
-      </w:pPr>
     </w:p>
     <w:p/>
     <w:sectPr>
@@ -1796,64 +4405,6 @@
 </w:document>
 </file>
 
-<file path=word/comments.xml><?xml version="1.0" encoding="utf-8"?>
-<w:comments xmlns:wpc="http://schemas.microsoft.com/office/word/2010/wordprocessingCanvas" xmlns:cx="http://schemas.microsoft.com/office/drawing/2014/chartex" xmlns:cx1="http://schemas.microsoft.com/office/drawing/2015/9/8/chartex" xmlns:cx2="http://schemas.microsoft.com/office/drawing/2015/10/21/chartex" xmlns:cx3="http://schemas.microsoft.com/office/drawing/2016/5/9/chartex" xmlns:cx4="http://schemas.microsoft.com/office/drawing/2016/5/10/chartex" xmlns:cx5="http://schemas.microsoft.com/office/drawing/2016/5/11/chartex" xmlns:cx6="http://schemas.microsoft.com/office/drawing/2016/5/12/chartex" xmlns:cx7="http://schemas.microsoft.com/office/drawing/2016/5/13/chartex" xmlns:cx8="http://schemas.microsoft.com/office/drawing/2016/5/14/chartex" xmlns:mc="http://schemas.openxmlformats.org/markup-compatibility/2006" xmlns:aink="http://schemas.microsoft.com/office/drawing/2016/ink" xmlns:am3d="http://schemas.microsoft.com/office/drawing/2017/model3d" xmlns:o="urn:schemas-microsoft-com:office:office" xmlns:oel="http://schemas.microsoft.com/office/2019/extlst" xmlns:r="http://schemas.openxmlformats.org/officeDocument/2006/relationships" xmlns:m="http://schemas.openxmlformats.org/officeDocument/2006/math" xmlns:v="urn:schemas-microsoft-com:vml" xmlns:wp14="http://schemas.microsoft.com/office/word/2010/wordprocessingDrawing" xmlns:wp="http://schemas.openxmlformats.org/drawingml/2006/wordprocessingDrawing" xmlns:w10="urn:schemas-microsoft-com:office:word" xmlns:w="http://schemas.openxmlformats.org/wordprocessingml/2006/main" xmlns:w14="http://schemas.microsoft.com/office/word/2010/wordml" xmlns:w15="http://schemas.microsoft.com/office/word/2012/wordml" xmlns:w16cex="http://schemas.microsoft.com/office/word/2018/wordml/cex" xmlns:w16cid="http://schemas.microsoft.com/office/word/2016/wordml/cid" xmlns:w16="http://schemas.microsoft.com/office/word/2018/wordml" xmlns:w16du="http://schemas.microsoft.com/office/word/2023/wordml/word16du" xmlns:w16sdtdh="http://schemas.microsoft.com/office/word/2020/wordml/sdtdatahash" xmlns:w16sdtfl="http://schemas.microsoft.com/office/word/2024/wordml/sdtformatlock" xmlns:w16se="http://schemas.microsoft.com/office/word/2015/wordml/symex" xmlns:wpg="http://schemas.microsoft.com/office/word/2010/wordprocessingGroup" xmlns:wpi="http://schemas.microsoft.com/office/word/2010/wordprocessingInk" xmlns:wne="http://schemas.microsoft.com/office/word/2006/wordml" xmlns:wps="http://schemas.microsoft.com/office/word/2010/wordprocessingShape" mc:Ignorable="w14 w15 w16se w16cid w16 w16cex w16sdtdh w16sdtfl w16du wp14">
-  <w:comment w:id="0" w:author="Baron Windsor Eiley" w:date="2026-02-07T16:02:00Z" w:initials="BE">
-    <w:p>
-      <w:pPr>
-        <w:pStyle w:val="CommentText"/>
-      </w:pPr>
-      <w:r>
-        <w:rPr>
-          <w:rStyle w:val="CommentReference"/>
-        </w:rPr>
-        <w:annotationRef/>
-      </w:r>
-      <w:r>
-        <w:t>And currently, seeking roles surrounding designing low latency and performance driven hardware applications on silicon.</w:t>
-      </w:r>
-    </w:p>
-  </w:comment>
-  <w:comment w:id="1" w:author="Baron Windsor Eiley" w:date="2026-02-07T16:25:00Z" w:initials="BE">
-    <w:p>
-      <w:pPr>
-        <w:pStyle w:val="CommentText"/>
-      </w:pPr>
-      <w:r>
-        <w:rPr>
-          <w:rStyle w:val="CommentReference"/>
-        </w:rPr>
-        <w:annotationRef/>
-      </w:r>
-      <w:r>
-        <w:t>Change this to tune to Autonomous Vehicles:</w:t>
-      </w:r>
-    </w:p>
-  </w:comment>
-</w:comments>
-</file>
-
-<file path=word/commentsExtended.xml><?xml version="1.0" encoding="utf-8"?>
-<w15:commentsEx xmlns:wpc="http://schemas.microsoft.com/office/word/2010/wordprocessingCanvas" xmlns:cx="http://schemas.microsoft.com/office/drawing/2014/chartex" xmlns:cx1="http://schemas.microsoft.com/office/drawing/2015/9/8/chartex" xmlns:cx2="http://schemas.microsoft.com/office/drawing/2015/10/21/chartex" xmlns:cx3="http://schemas.microsoft.com/office/drawing/2016/5/9/chartex" xmlns:cx4="http://schemas.microsoft.com/office/drawing/2016/5/10/chartex" xmlns:cx5="http://schemas.microsoft.com/office/drawing/2016/5/11/chartex" xmlns:cx6="http://schemas.microsoft.com/office/drawing/2016/5/12/chartex" xmlns:cx7="http://schemas.microsoft.com/office/drawing/2016/5/13/chartex" xmlns:cx8="http://schemas.microsoft.com/office/drawing/2016/5/14/chartex" xmlns:mc="http://schemas.openxmlformats.org/markup-compatibility/2006" xmlns:aink="http://schemas.microsoft.com/office/drawing/2016/ink" xmlns:am3d="http://schemas.microsoft.com/office/drawing/2017/model3d" xmlns:o="urn:schemas-microsoft-com:office:office" xmlns:oel="http://schemas.microsoft.com/office/2019/extlst" xmlns:r="http://schemas.openxmlformats.org/officeDocument/2006/relationships" xmlns:m="http://schemas.openxmlformats.org/officeDocument/2006/math" xmlns:v="urn:schemas-microsoft-com:vml" xmlns:wp14="http://schemas.microsoft.com/office/word/2010/wordprocessingDrawing" xmlns:wp="http://schemas.openxmlformats.org/drawingml/2006/wordprocessingDrawing" xmlns:w10="urn:schemas-microsoft-com:office:word" xmlns:w="http://schemas.openxmlformats.org/wordprocessingml/2006/main" xmlns:w14="http://schemas.microsoft.com/office/word/2010/wordml" xmlns:w15="http://schemas.microsoft.com/office/word/2012/wordml" xmlns:w16cex="http://schemas.microsoft.com/office/word/2018/wordml/cex" xmlns:w16cid="http://schemas.microsoft.com/office/word/2016/wordml/cid" xmlns:w16="http://schemas.microsoft.com/office/word/2018/wordml" xmlns:w16du="http://schemas.microsoft.com/office/word/2023/wordml/word16du" xmlns:w16sdtdh="http://schemas.microsoft.com/office/word/2020/wordml/sdtdatahash" xmlns:w16sdtfl="http://schemas.microsoft.com/office/word/2024/wordml/sdtformatlock" xmlns:w16se="http://schemas.microsoft.com/office/word/2015/wordml/symex" xmlns:wpg="http://schemas.microsoft.com/office/word/2010/wordprocessingGroup" xmlns:wpi="http://schemas.microsoft.com/office/word/2010/wordprocessingInk" xmlns:wne="http://schemas.microsoft.com/office/word/2006/wordml" xmlns:wps="http://schemas.microsoft.com/office/word/2010/wordprocessingShape" mc:Ignorable="w14 w15 w16se w16cid w16 w16cex w16sdtdh w16sdtfl w16du wp14">
-  <w15:commentEx w15:paraId="657C8A7A" w15:done="0"/>
-  <w15:commentEx w15:paraId="298F4FC3" w15:done="0"/>
-</w15:commentsEx>
-</file>
-
-<file path=word/commentsExtensible.xml><?xml version="1.0" encoding="utf-8"?>
-<w16cex:commentsExtensible xmlns:wpc="http://schemas.microsoft.com/office/word/2010/wordprocessingCanvas" xmlns:cx="http://schemas.microsoft.com/office/drawing/2014/chartex" xmlns:cx1="http://schemas.microsoft.com/office/drawing/2015/9/8/chartex" xmlns:cx2="http://schemas.microsoft.com/office/drawing/2015/10/21/chartex" xmlns:cx3="http://schemas.microsoft.com/office/drawing/2016/5/9/chartex" xmlns:cx4="http://schemas.microsoft.com/office/drawing/2016/5/10/chartex" xmlns:cx5="http://schemas.microsoft.com/office/drawing/2016/5/11/chartex" xmlns:cx6="http://schemas.microsoft.com/office/drawing/2016/5/12/chartex" xmlns:cx7="http://schemas.microsoft.com/office/drawing/2016/5/13/chartex" xmlns:cx8="http://schemas.microsoft.com/office/drawing/2016/5/14/chartex" xmlns:cr="http://schemas.microsoft.com/office/comments/2020/reactions" xmlns:mc="http://schemas.openxmlformats.org/markup-compatibility/2006" xmlns:aink="http://schemas.microsoft.com/office/drawing/2016/ink" xmlns:am3d="http://schemas.microsoft.com/office/drawing/2017/model3d" xmlns:o="urn:schemas-microsoft-com:office:office" xmlns:oel="http://schemas.microsoft.com/office/2019/extlst" xmlns:r="http://schemas.openxmlformats.org/officeDocument/2006/relationships" xmlns:m="http://schemas.openxmlformats.org/officeDocument/2006/math" xmlns:v="urn:schemas-microsoft-com:vml" xmlns:wp14="http://schemas.microsoft.com/office/word/2010/wordprocessingDrawing" xmlns:wp="http://schemas.openxmlformats.org/drawingml/2006/wordprocessingDrawing" xmlns:w10="urn:schemas-microsoft-com:office:word" xmlns:w="http://schemas.openxmlformats.org/wordprocessingml/2006/main" xmlns:w14="http://schemas.microsoft.com/office/word/2010/wordml" xmlns:w15="http://schemas.microsoft.com/office/word/2012/wordml" xmlns:w16cex="http://schemas.microsoft.com/office/word/2018/wordml/cex" xmlns:w16cid="http://schemas.microsoft.com/office/word/2016/wordml/cid" xmlns:w16="http://schemas.microsoft.com/office/word/2018/wordml" xmlns:w16du="http://schemas.microsoft.com/office/word/2023/wordml/word16du" xmlns:w16sdtdh="http://schemas.microsoft.com/office/word/2020/wordml/sdtdatahash" xmlns:w16sdtfl="http://schemas.microsoft.com/office/word/2024/wordml/sdtformatlock" xmlns:w16se="http://schemas.microsoft.com/office/word/2015/wordml/symex" xmlns:wpg="http://schemas.microsoft.com/office/word/2010/wordprocessingGroup" xmlns:wpi="http://schemas.microsoft.com/office/word/2010/wordprocessingInk" xmlns:wne="http://schemas.microsoft.com/office/word/2006/wordml" xmlns:wps="http://schemas.microsoft.com/office/word/2010/wordprocessingShape" mc:Ignorable="w14 w15 w16se w16cid w16 w16cex w16sdtdh w16sdtfl cr w16du wp14">
-  <w16cex:commentExtensible w16cex:durableId="74CA5936" w16cex:dateUtc="2026-02-08T00:02:00Z"/>
-  <w16cex:commentExtensible w16cex:durableId="07C87BEC" w16cex:dateUtc="2026-02-08T00:25:00Z"/>
-</w16cex:commentsExtensible>
-</file>
-
-<file path=word/commentsIds.xml><?xml version="1.0" encoding="utf-8"?>
-<w16cid:commentsIds xmlns:wpc="http://schemas.microsoft.com/office/word/2010/wordprocessingCanvas" xmlns:cx="http://schemas.microsoft.com/office/drawing/2014/chartex" xmlns:cx1="http://schemas.microsoft.com/office/drawing/2015/9/8/chartex" xmlns:cx2="http://schemas.microsoft.com/office/drawing/2015/10/21/chartex" xmlns:cx3="http://schemas.microsoft.com/office/drawing/2016/5/9/chartex" xmlns:cx4="http://schemas.microsoft.com/office/drawing/2016/5/10/chartex" xmlns:cx5="http://schemas.microsoft.com/office/drawing/2016/5/11/chartex" xmlns:cx6="http://schemas.microsoft.com/office/drawing/2016/5/12/chartex" xmlns:cx7="http://schemas.microsoft.com/office/drawing/2016/5/13/chartex" xmlns:cx8="http://schemas.microsoft.com/office/drawing/2016/5/14/chartex" xmlns:mc="http://schemas.openxmlformats.org/markup-compatibility/2006" xmlns:aink="http://schemas.microsoft.com/office/drawing/2016/ink" xmlns:am3d="http://schemas.microsoft.com/office/drawing/2017/model3d" xmlns:o="urn:schemas-microsoft-com:office:office" xmlns:oel="http://schemas.microsoft.com/office/2019/extlst" xmlns:r="http://schemas.openxmlformats.org/officeDocument/2006/relationships" xmlns:m="http://schemas.openxmlformats.org/officeDocument/2006/math" xmlns:v="urn:schemas-microsoft-com:vml" xmlns:wp14="http://schemas.microsoft.com/office/word/2010/wordprocessingDrawing" xmlns:wp="http://schemas.openxmlformats.org/drawingml/2006/wordprocessingDrawing" xmlns:w10="urn:schemas-microsoft-com:office:word" xmlns:w="http://schemas.openxmlformats.org/wordprocessingml/2006/main" xmlns:w14="http://schemas.microsoft.com/office/word/2010/wordml" xmlns:w15="http://schemas.microsoft.com/office/word/2012/wordml" xmlns:w16cex="http://schemas.microsoft.com/office/word/2018/wordml/cex" xmlns:w16cid="http://schemas.microsoft.com/office/word/2016/wordml/cid" xmlns:w16="http://schemas.microsoft.com/office/word/2018/wordml" xmlns:w16du="http://schemas.microsoft.com/office/word/2023/wordml/word16du" xmlns:w16sdtdh="http://schemas.microsoft.com/office/word/2020/wordml/sdtdatahash" xmlns:w16sdtfl="http://schemas.microsoft.com/office/word/2024/wordml/sdtformatlock" xmlns:w16se="http://schemas.microsoft.com/office/word/2015/wordml/symex" xmlns:wpg="http://schemas.microsoft.com/office/word/2010/wordprocessingGroup" xmlns:wpi="http://schemas.microsoft.com/office/word/2010/wordprocessingInk" xmlns:wne="http://schemas.microsoft.com/office/word/2006/wordml" xmlns:wps="http://schemas.microsoft.com/office/word/2010/wordprocessingShape" mc:Ignorable="w14 w15 w16se w16cid w16 w16cex w16sdtdh w16sdtfl w16du wp14">
-  <w16cid:commentId w16cid:paraId="657C8A7A" w16cid:durableId="74CA5936"/>
-  <w16cid:commentId w16cid:paraId="298F4FC3" w16cid:durableId="07C87BEC"/>
-</w16cid:commentsIds>
-</file>
-
 <file path=word/numbering.xml><?xml version="1.0" encoding="utf-8"?>
 <w:numbering xmlns:wpc="http://schemas.microsoft.com/office/word/2010/wordprocessingCanvas" xmlns:cx="http://schemas.microsoft.com/office/drawing/2014/chartex" xmlns:cx1="http://schemas.microsoft.com/office/drawing/2015/9/8/chartex" xmlns:cx2="http://schemas.microsoft.com/office/drawing/2015/10/21/chartex" xmlns:cx3="http://schemas.microsoft.com/office/drawing/2016/5/9/chartex" xmlns:cx4="http://schemas.microsoft.com/office/drawing/2016/5/10/chartex" xmlns:cx5="http://schemas.microsoft.com/office/drawing/2016/5/11/chartex" xmlns:cx6="http://schemas.microsoft.com/office/drawing/2016/5/12/chartex" xmlns:cx7="http://schemas.microsoft.com/office/drawing/2016/5/13/chartex" xmlns:cx8="http://schemas.microsoft.com/office/drawing/2016/5/14/chartex" xmlns:mc="http://schemas.openxmlformats.org/markup-compatibility/2006" xmlns:aink="http://schemas.microsoft.com/office/drawing/2016/ink" xmlns:am3d="http://schemas.microsoft.com/office/drawing/2017/model3d" xmlns:o="urn:schemas-microsoft-com:office:office" xmlns:oel="http://schemas.microsoft.com/office/2019/extlst" xmlns:r="http://schemas.openxmlformats.org/officeDocument/2006/relationships" xmlns:m="http://schemas.openxmlformats.org/officeDocument/2006/math" xmlns:v="urn:schemas-microsoft-com:vml" xmlns:wp14="http://schemas.microsoft.com/office/word/2010/wordprocessingDrawing" xmlns:wp="http://schemas.openxmlformats.org/drawingml/2006/wordprocessingDrawing" xmlns:w10="urn:schemas-microsoft-com:office:word" xmlns:w="http://schemas.openxmlformats.org/wordprocessingml/2006/main" xmlns:w14="http://schemas.microsoft.com/office/word/2010/wordml" xmlns:w15="http://schemas.microsoft.com/office/word/2012/wordml" xmlns:w16cex="http://schemas.microsoft.com/office/word/2018/wordml/cex" xmlns:w16cid="http://schemas.microsoft.com/office/word/2016/wordml/cid" xmlns:w16="http://schemas.microsoft.com/office/word/2018/wordml" xmlns:w16du="http://schemas.microsoft.com/office/word/2023/wordml/word16du" xmlns:w16sdtdh="http://schemas.microsoft.com/office/word/2020/wordml/sdtdatahash" xmlns:w16sdtfl="http://schemas.microsoft.com/office/word/2024/wordml/sdtformatlock" xmlns:w16se="http://schemas.microsoft.com/office/word/2015/wordml/symex" xmlns:wpg="http://schemas.microsoft.com/office/word/2010/wordprocessingGroup" xmlns:wpi="http://schemas.microsoft.com/office/word/2010/wordprocessingInk" xmlns:wne="http://schemas.microsoft.com/office/word/2006/wordml" xmlns:wps="http://schemas.microsoft.com/office/word/2010/wordprocessingShape" mc:Ignorable="w14 w15 w16se w16cid w16 w16cex w16sdtdh w16sdtfl w16du wp14">
   <w:abstractNum w:abstractNumId="0" w15:restartNumberingAfterBreak="0">
@@ -2171,6 +4722,119 @@
     </w:lvl>
   </w:abstractNum>
   <w:abstractNum w:abstractNumId="3" w15:restartNumberingAfterBreak="0">
+    <w:nsid w:val="32F52D93"/>
+    <w:multiLevelType w:val="hybridMultilevel"/>
+    <w:tmpl w:val="1F987A3A"/>
+    <w:lvl w:ilvl="0" w:tplc="04090001">
+      <w:start w:val="1"/>
+      <w:numFmt w:val="bullet"/>
+      <w:lvlText w:val=""/>
+      <w:lvlJc w:val="left"/>
+      <w:pPr>
+        <w:ind w:left="720" w:hanging="360"/>
+      </w:pPr>
+      <w:rPr>
+        <w:rFonts w:ascii="Symbol" w:hAnsi="Symbol" w:hint="default"/>
+      </w:rPr>
+    </w:lvl>
+    <w:lvl w:ilvl="1" w:tplc="04090003" w:tentative="1">
+      <w:start w:val="1"/>
+      <w:numFmt w:val="bullet"/>
+      <w:lvlText w:val="o"/>
+      <w:lvlJc w:val="left"/>
+      <w:pPr>
+        <w:ind w:left="1440" w:hanging="360"/>
+      </w:pPr>
+      <w:rPr>
+        <w:rFonts w:ascii="Courier New" w:hAnsi="Courier New" w:cs="Courier New" w:hint="default"/>
+      </w:rPr>
+    </w:lvl>
+    <w:lvl w:ilvl="2" w:tplc="04090005" w:tentative="1">
+      <w:start w:val="1"/>
+      <w:numFmt w:val="bullet"/>
+      <w:lvlText w:val=""/>
+      <w:lvlJc w:val="left"/>
+      <w:pPr>
+        <w:ind w:left="2160" w:hanging="360"/>
+      </w:pPr>
+      <w:rPr>
+        <w:rFonts w:ascii="Wingdings" w:hAnsi="Wingdings" w:hint="default"/>
+      </w:rPr>
+    </w:lvl>
+    <w:lvl w:ilvl="3" w:tplc="04090001" w:tentative="1">
+      <w:start w:val="1"/>
+      <w:numFmt w:val="bullet"/>
+      <w:lvlText w:val=""/>
+      <w:lvlJc w:val="left"/>
+      <w:pPr>
+        <w:ind w:left="2880" w:hanging="360"/>
+      </w:pPr>
+      <w:rPr>
+        <w:rFonts w:ascii="Symbol" w:hAnsi="Symbol" w:hint="default"/>
+      </w:rPr>
+    </w:lvl>
+    <w:lvl w:ilvl="4" w:tplc="04090003" w:tentative="1">
+      <w:start w:val="1"/>
+      <w:numFmt w:val="bullet"/>
+      <w:lvlText w:val="o"/>
+      <w:lvlJc w:val="left"/>
+      <w:pPr>
+        <w:ind w:left="3600" w:hanging="360"/>
+      </w:pPr>
+      <w:rPr>
+        <w:rFonts w:ascii="Courier New" w:hAnsi="Courier New" w:cs="Courier New" w:hint="default"/>
+      </w:rPr>
+    </w:lvl>
+    <w:lvl w:ilvl="5" w:tplc="04090005" w:tentative="1">
+      <w:start w:val="1"/>
+      <w:numFmt w:val="bullet"/>
+      <w:lvlText w:val=""/>
+      <w:lvlJc w:val="left"/>
+      <w:pPr>
+        <w:ind w:left="4320" w:hanging="360"/>
+      </w:pPr>
+      <w:rPr>
+        <w:rFonts w:ascii="Wingdings" w:hAnsi="Wingdings" w:hint="default"/>
+      </w:rPr>
+    </w:lvl>
+    <w:lvl w:ilvl="6" w:tplc="04090001" w:tentative="1">
+      <w:start w:val="1"/>
+      <w:numFmt w:val="bullet"/>
+      <w:lvlText w:val=""/>
+      <w:lvlJc w:val="left"/>
+      <w:pPr>
+        <w:ind w:left="5040" w:hanging="360"/>
+      </w:pPr>
+      <w:rPr>
+        <w:rFonts w:ascii="Symbol" w:hAnsi="Symbol" w:hint="default"/>
+      </w:rPr>
+    </w:lvl>
+    <w:lvl w:ilvl="7" w:tplc="04090003" w:tentative="1">
+      <w:start w:val="1"/>
+      <w:numFmt w:val="bullet"/>
+      <w:lvlText w:val="o"/>
+      <w:lvlJc w:val="left"/>
+      <w:pPr>
+        <w:ind w:left="5760" w:hanging="360"/>
+      </w:pPr>
+      <w:rPr>
+        <w:rFonts w:ascii="Courier New" w:hAnsi="Courier New" w:cs="Courier New" w:hint="default"/>
+      </w:rPr>
+    </w:lvl>
+    <w:lvl w:ilvl="8" w:tplc="04090005" w:tentative="1">
+      <w:start w:val="1"/>
+      <w:numFmt w:val="bullet"/>
+      <w:lvlText w:val=""/>
+      <w:lvlJc w:val="left"/>
+      <w:pPr>
+        <w:ind w:left="6480" w:hanging="360"/>
+      </w:pPr>
+      <w:rPr>
+        <w:rFonts w:ascii="Wingdings" w:hAnsi="Wingdings" w:hint="default"/>
+      </w:rPr>
+    </w:lvl>
+  </w:abstractNum>
+  <w:abstractNum w:abstractNumId="4" w15:restartNumberingAfterBreak="0">
     <w:nsid w:val="3A092DBB"/>
     <w:multiLevelType w:val="hybridMultilevel"/>
     <w:tmpl w:val="3418F44C"/>
@@ -2282,7 +4946,7 @@
       </w:rPr>
     </w:lvl>
   </w:abstractNum>
-  <w:abstractNum w:abstractNumId="4" w15:restartNumberingAfterBreak="0">
+  <w:abstractNum w:abstractNumId="5" w15:restartNumberingAfterBreak="0">
     <w:nsid w:val="50121284"/>
     <w:multiLevelType w:val="hybridMultilevel"/>
     <w:tmpl w:val="18500DBE"/>
@@ -2395,7 +5059,7 @@
       </w:rPr>
     </w:lvl>
   </w:abstractNum>
-  <w:abstractNum w:abstractNumId="5" w15:restartNumberingAfterBreak="0">
+  <w:abstractNum w:abstractNumId="6" w15:restartNumberingAfterBreak="0">
     <w:nsid w:val="59613907"/>
     <w:multiLevelType w:val="hybridMultilevel"/>
     <w:tmpl w:val="F41698B0"/>
@@ -2508,7 +5172,7 @@
       </w:rPr>
     </w:lvl>
   </w:abstractNum>
-  <w:abstractNum w:abstractNumId="6" w15:restartNumberingAfterBreak="0">
+  <w:abstractNum w:abstractNumId="7" w15:restartNumberingAfterBreak="0">
     <w:nsid w:val="5CC9488F"/>
     <w:multiLevelType w:val="hybridMultilevel"/>
     <w:tmpl w:val="D1B80F16"/>
@@ -2621,7 +5285,7 @@
       </w:rPr>
     </w:lvl>
   </w:abstractNum>
-  <w:abstractNum w:abstractNumId="7" w15:restartNumberingAfterBreak="0">
+  <w:abstractNum w:abstractNumId="8" w15:restartNumberingAfterBreak="0">
     <w:nsid w:val="5EF53471"/>
     <w:multiLevelType w:val="hybridMultilevel"/>
     <w:tmpl w:val="7EA05A90"/>
@@ -2710,7 +5374,7 @@
       </w:pPr>
     </w:lvl>
   </w:abstractNum>
-  <w:abstractNum w:abstractNumId="8" w15:restartNumberingAfterBreak="0">
+  <w:abstractNum w:abstractNumId="9" w15:restartNumberingAfterBreak="0">
     <w:nsid w:val="6B03189A"/>
     <w:multiLevelType w:val="hybridMultilevel"/>
     <w:tmpl w:val="24ECE01E"/>
@@ -2823,7 +5487,7 @@
       </w:rPr>
     </w:lvl>
   </w:abstractNum>
-  <w:abstractNum w:abstractNumId="9" w15:restartNumberingAfterBreak="0">
+  <w:abstractNum w:abstractNumId="10" w15:restartNumberingAfterBreak="0">
     <w:nsid w:val="71C01DAF"/>
     <w:multiLevelType w:val="multilevel"/>
     <w:tmpl w:val="E3467DF4"/>
@@ -2936,7 +5600,120 @@
       </w:pPr>
     </w:lvl>
   </w:abstractNum>
-  <w:abstractNum w:abstractNumId="10" w15:restartNumberingAfterBreak="0">
+  <w:abstractNum w:abstractNumId="11" w15:restartNumberingAfterBreak="0">
+    <w:nsid w:val="741A5957"/>
+    <w:multiLevelType w:val="hybridMultilevel"/>
+    <w:tmpl w:val="3AD69292"/>
+    <w:lvl w:ilvl="0" w:tplc="04090001">
+      <w:start w:val="1"/>
+      <w:numFmt w:val="bullet"/>
+      <w:lvlText w:val=""/>
+      <w:lvlJc w:val="left"/>
+      <w:pPr>
+        <w:ind w:left="720" w:hanging="360"/>
+      </w:pPr>
+      <w:rPr>
+        <w:rFonts w:ascii="Symbol" w:hAnsi="Symbol" w:hint="default"/>
+      </w:rPr>
+    </w:lvl>
+    <w:lvl w:ilvl="1" w:tplc="04090003" w:tentative="1">
+      <w:start w:val="1"/>
+      <w:numFmt w:val="bullet"/>
+      <w:lvlText w:val="o"/>
+      <w:lvlJc w:val="left"/>
+      <w:pPr>
+        <w:ind w:left="1440" w:hanging="360"/>
+      </w:pPr>
+      <w:rPr>
+        <w:rFonts w:ascii="Courier New" w:hAnsi="Courier New" w:cs="Courier New" w:hint="default"/>
+      </w:rPr>
+    </w:lvl>
+    <w:lvl w:ilvl="2" w:tplc="04090005" w:tentative="1">
+      <w:start w:val="1"/>
+      <w:numFmt w:val="bullet"/>
+      <w:lvlText w:val=""/>
+      <w:lvlJc w:val="left"/>
+      <w:pPr>
+        <w:ind w:left="2160" w:hanging="360"/>
+      </w:pPr>
+      <w:rPr>
+        <w:rFonts w:ascii="Wingdings" w:hAnsi="Wingdings" w:hint="default"/>
+      </w:rPr>
+    </w:lvl>
+    <w:lvl w:ilvl="3" w:tplc="04090001" w:tentative="1">
+      <w:start w:val="1"/>
+      <w:numFmt w:val="bullet"/>
+      <w:lvlText w:val=""/>
+      <w:lvlJc w:val="left"/>
+      <w:pPr>
+        <w:ind w:left="2880" w:hanging="360"/>
+      </w:pPr>
+      <w:rPr>
+        <w:rFonts w:ascii="Symbol" w:hAnsi="Symbol" w:hint="default"/>
+      </w:rPr>
+    </w:lvl>
+    <w:lvl w:ilvl="4" w:tplc="04090003" w:tentative="1">
+      <w:start w:val="1"/>
+      <w:numFmt w:val="bullet"/>
+      <w:lvlText w:val="o"/>
+      <w:lvlJc w:val="left"/>
+      <w:pPr>
+        <w:ind w:left="3600" w:hanging="360"/>
+      </w:pPr>
+      <w:rPr>
+        <w:rFonts w:ascii="Courier New" w:hAnsi="Courier New" w:cs="Courier New" w:hint="default"/>
+      </w:rPr>
+    </w:lvl>
+    <w:lvl w:ilvl="5" w:tplc="04090005" w:tentative="1">
+      <w:start w:val="1"/>
+      <w:numFmt w:val="bullet"/>
+      <w:lvlText w:val=""/>
+      <w:lvlJc w:val="left"/>
+      <w:pPr>
+        <w:ind w:left="4320" w:hanging="360"/>
+      </w:pPr>
+      <w:rPr>
+        <w:rFonts w:ascii="Wingdings" w:hAnsi="Wingdings" w:hint="default"/>
+      </w:rPr>
+    </w:lvl>
+    <w:lvl w:ilvl="6" w:tplc="04090001" w:tentative="1">
+      <w:start w:val="1"/>
+      <w:numFmt w:val="bullet"/>
+      <w:lvlText w:val=""/>
+      <w:lvlJc w:val="left"/>
+      <w:pPr>
+        <w:ind w:left="5040" w:hanging="360"/>
+      </w:pPr>
+      <w:rPr>
+        <w:rFonts w:ascii="Symbol" w:hAnsi="Symbol" w:hint="default"/>
+      </w:rPr>
+    </w:lvl>
+    <w:lvl w:ilvl="7" w:tplc="04090003" w:tentative="1">
+      <w:start w:val="1"/>
+      <w:numFmt w:val="bullet"/>
+      <w:lvlText w:val="o"/>
+      <w:lvlJc w:val="left"/>
+      <w:pPr>
+        <w:ind w:left="5760" w:hanging="360"/>
+      </w:pPr>
+      <w:rPr>
+        <w:rFonts w:ascii="Courier New" w:hAnsi="Courier New" w:cs="Courier New" w:hint="default"/>
+      </w:rPr>
+    </w:lvl>
+    <w:lvl w:ilvl="8" w:tplc="04090005" w:tentative="1">
+      <w:start w:val="1"/>
+      <w:numFmt w:val="bullet"/>
+      <w:lvlText w:val=""/>
+      <w:lvlJc w:val="left"/>
+      <w:pPr>
+        <w:ind w:left="6480" w:hanging="360"/>
+      </w:pPr>
+      <w:rPr>
+        <w:rFonts w:ascii="Wingdings" w:hAnsi="Wingdings" w:hint="default"/>
+      </w:rPr>
+    </w:lvl>
+  </w:abstractNum>
+  <w:abstractNum w:abstractNumId="12" w15:restartNumberingAfterBreak="0">
     <w:nsid w:val="7545172E"/>
     <w:multiLevelType w:val="hybridMultilevel"/>
     <w:tmpl w:val="0F44E992"/>
@@ -3050,47 +5827,45 @@
     </w:lvl>
   </w:abstractNum>
   <w:num w:numId="1" w16cid:durableId="1019698141">
-    <w:abstractNumId w:val="9"/>
+    <w:abstractNumId w:val="10"/>
   </w:num>
   <w:num w:numId="2" w16cid:durableId="276059377">
     <w:abstractNumId w:val="0"/>
   </w:num>
   <w:num w:numId="3" w16cid:durableId="127482134">
-    <w:abstractNumId w:val="7"/>
+    <w:abstractNumId w:val="8"/>
   </w:num>
   <w:num w:numId="4" w16cid:durableId="947274145">
-    <w:abstractNumId w:val="10"/>
+    <w:abstractNumId w:val="12"/>
   </w:num>
   <w:num w:numId="5" w16cid:durableId="2117477442">
     <w:abstractNumId w:val="1"/>
   </w:num>
   <w:num w:numId="6" w16cid:durableId="1982228192">
-    <w:abstractNumId w:val="6"/>
+    <w:abstractNumId w:val="7"/>
   </w:num>
   <w:num w:numId="7" w16cid:durableId="791438357">
     <w:abstractNumId w:val="2"/>
   </w:num>
   <w:num w:numId="8" w16cid:durableId="278337168">
+    <w:abstractNumId w:val="4"/>
+  </w:num>
+  <w:num w:numId="9" w16cid:durableId="1589538599">
+    <w:abstractNumId w:val="9"/>
+  </w:num>
+  <w:num w:numId="10" w16cid:durableId="1966306054">
+    <w:abstractNumId w:val="6"/>
+  </w:num>
+  <w:num w:numId="11" w16cid:durableId="665864628">
+    <w:abstractNumId w:val="5"/>
+  </w:num>
+  <w:num w:numId="12" w16cid:durableId="907883981">
     <w:abstractNumId w:val="3"/>
   </w:num>
-  <w:num w:numId="9" w16cid:durableId="1589538599">
-    <w:abstractNumId w:val="8"/>
-  </w:num>
-  <w:num w:numId="10" w16cid:durableId="1966306054">
-    <w:abstractNumId w:val="5"/>
-  </w:num>
-  <w:num w:numId="11" w16cid:durableId="665864628">
-    <w:abstractNumId w:val="4"/>
+  <w:num w:numId="13" w16cid:durableId="39525523">
+    <w:abstractNumId w:val="11"/>
   </w:num>
 </w:numbering>
-</file>
-
-<file path=word/people.xml><?xml version="1.0" encoding="utf-8"?>
-<w15:people xmlns:wpc="http://schemas.microsoft.com/office/word/2010/wordprocessingCanvas" xmlns:cx="http://schemas.microsoft.com/office/drawing/2014/chartex" xmlns:cx1="http://schemas.microsoft.com/office/drawing/2015/9/8/chartex" xmlns:cx2="http://schemas.microsoft.com/office/drawing/2015/10/21/chartex" xmlns:cx3="http://schemas.microsoft.com/office/drawing/2016/5/9/chartex" xmlns:cx4="http://schemas.microsoft.com/office/drawing/2016/5/10/chartex" xmlns:cx5="http://schemas.microsoft.com/office/drawing/2016/5/11/chartex" xmlns:cx6="http://schemas.microsoft.com/office/drawing/2016/5/12/chartex" xmlns:cx7="http://schemas.microsoft.com/office/drawing/2016/5/13/chartex" xmlns:cx8="http://schemas.microsoft.com/office/drawing/2016/5/14/chartex" xmlns:mc="http://schemas.openxmlformats.org/markup-compatibility/2006" xmlns:aink="http://schemas.microsoft.com/office/drawing/2016/ink" xmlns:am3d="http://schemas.microsoft.com/office/drawing/2017/model3d" xmlns:o="urn:schemas-microsoft-com:office:office" xmlns:oel="http://schemas.microsoft.com/office/2019/extlst" xmlns:r="http://schemas.openxmlformats.org/officeDocument/2006/relationships" xmlns:m="http://schemas.openxmlformats.org/officeDocument/2006/math" xmlns:v="urn:schemas-microsoft-com:vml" xmlns:wp14="http://schemas.microsoft.com/office/word/2010/wordprocessingDrawing" xmlns:wp="http://schemas.openxmlformats.org/drawingml/2006/wordprocessingDrawing" xmlns:w10="urn:schemas-microsoft-com:office:word" xmlns:w="http://schemas.openxmlformats.org/wordprocessingml/2006/main" xmlns:w14="http://schemas.microsoft.com/office/word/2010/wordml" xmlns:w15="http://schemas.microsoft.com/office/word/2012/wordml" xmlns:w16cex="http://schemas.microsoft.com/office/word/2018/wordml/cex" xmlns:w16cid="http://schemas.microsoft.com/office/word/2016/wordml/cid" xmlns:w16="http://schemas.microsoft.com/office/word/2018/wordml" xmlns:w16du="http://schemas.microsoft.com/office/word/2023/wordml/word16du" xmlns:w16sdtdh="http://schemas.microsoft.com/office/word/2020/wordml/sdtdatahash" xmlns:w16sdtfl="http://schemas.microsoft.com/office/word/2024/wordml/sdtformatlock" xmlns:w16se="http://schemas.microsoft.com/office/word/2015/wordml/symex" xmlns:wpg="http://schemas.microsoft.com/office/word/2010/wordprocessingGroup" xmlns:wpi="http://schemas.microsoft.com/office/word/2010/wordprocessingInk" xmlns:wne="http://schemas.microsoft.com/office/word/2006/wordml" xmlns:wps="http://schemas.microsoft.com/office/word/2010/wordprocessingShape" mc:Ignorable="w14 w15 w16se w16cid w16 w16cex w16sdtdh w16sdtfl w16du wp14">
-  <w15:person w15:author="Baron Windsor Eiley">
-    <w15:presenceInfo w15:providerId="AD" w15:userId="S::baron.eiley@sjsu.edu::3d77c0bf-a5d6-4dab-aab7-3dbc8d06087e"/>
-  </w15:person>
-</w15:people>
 </file>
 
 <file path=word/styles.xml><?xml version="1.0" encoding="utf-8"?>
@@ -3695,7 +6470,6 @@
   <w:style w:type="character" w:default="1" w:styleId="DefaultParagraphFont">
     <w:name w:val="Default Paragraph Font"/>
     <w:uiPriority w:val="1"/>
-    <w:semiHidden/>
     <w:unhideWhenUsed/>
   </w:style>
   <w:style w:type="table" w:default="1" w:styleId="TableNormal">
@@ -4100,6 +6874,29 @@
       <w:szCs w:val="20"/>
     </w:rPr>
   </w:style>
+  <w:style w:type="character" w:styleId="Hyperlink">
+    <w:name w:val="Hyperlink"/>
+    <w:basedOn w:val="DefaultParagraphFont"/>
+    <w:uiPriority w:val="99"/>
+    <w:unhideWhenUsed/>
+    <w:rsid w:val="00CE1D84"/>
+    <w:rPr>
+      <w:color w:val="467886" w:themeColor="hyperlink"/>
+      <w:u w:val="single"/>
+    </w:rPr>
+  </w:style>
+  <w:style w:type="character" w:styleId="UnresolvedMention">
+    <w:name w:val="Unresolved Mention"/>
+    <w:basedOn w:val="DefaultParagraphFont"/>
+    <w:uiPriority w:val="99"/>
+    <w:semiHidden/>
+    <w:unhideWhenUsed/>
+    <w:rsid w:val="00CE1D84"/>
+    <w:rPr>
+      <w:color w:val="605E5C"/>
+      <w:shd w:val="clear" w:color="auto" w:fill="E1DFDD"/>
+    </w:rPr>
+  </w:style>
 </w:styles>
 </file>
 

</xml_diff>